<commit_message>
Cite the two Kesher 46 articles (Kouts, Lang) in chapter 3 with page numbers
Co-Authored-By: Claude Fable 5.1 <noreply@anthropic.com>
Claude-Session: https://claude.ai/code/session_014Ur3fhHcvLKdVTb2L63jaV
</commit_message>
<xml_diff>
--- a/seminar/סמינריון - פרשת דרייפוס והרצל.docx
+++ b/seminar/סמינריון - פרשת דרייפוס והרצל.docx
@@ -1539,7 +1539,7 @@
           <w:szCs w:val="24"/>
           <w:rtl/>
         </w:rPr>
-        <w:t xml:space="preserve">הרצל סיקר את משפט דרייפוס בדצמבר 1894 ואת טקס הורדת הדרגות ב-5 בינואר 1895. דיווחיו הם המקור החשוב ביותר לבחינת מה ראה בזמן אמת, בניגוד למה שסיפר בדיעבד, ואת ניתוחם המדוקדק חבים אנו לקורנברג ולאבינרי. שני ממצאים עולים מהם. ראשית, הרצל לא פקפק באשמת דרייפוס. כמו רוב הצרפתים קיבל את פסק הדין, ובדיווחיו ניסה להסביר את הפסיכולוגיה של הבוגד; אפשרות החפות החלה להעסיקו רק בשנים 1896-1897. שנית, בדיווחו על הטקס תיאר את ההמון הצועק "מוות לבוגד" ואת דרייפוס הזועק שהוא חף מפשע, אך לא הזכיר קריאות "מוות ליהודים". התיאור המפורסם של ההמון הפריזאי הצועק "מוות ליהודים" מופיע לראשונה במאמרו משנת 1899 (אבינרי, 2007, עמ' 84-92; Kornberg, 1993, pp. 183-194).</w:t>
+        <w:t xml:space="preserve">הרצל סיקר את משפט דרייפוס בדצמבר 1894 ואת טקס הורדת הדרגות ב-5 בינואר 1895. דיווחיו הם המקור החשוב ביותר לבחינת מה ראה בזמן אמת, בניגוד למה שסיפר בדיעבד, ואת ניתוחם המדוקדק חבים אנו לקורנברג ולאבינרי. שני ממצאים עולים מהם. ראשית, הרצל לא פקפק באשמת דרייפוס. כמו רוב הצרפתים קיבל את פסק הדין, ובדיווחיו ניסה להסביר את הפסיכולוגיה של הבוגד; אפשרות החפות החלה להעסיקו רק בשנים 1896-1897. שנית, בדיווחו על הטקס תיאר את ההמון הצועק "מוות לבוגד" ואת דרייפוס הזועק שהוא חף מפשע, אך לא הזכיר קריאות "מוות ליהודים". התיאור המפורסם של ההמון הפריזאי הצועק "מוות ליהודים" מופיע לראשונה במאמרו משנת 1899. גדעון קוץ, שבחן את הדיווחים במסגרת מחקרו על סיקור הפרשה בעיתונות היהודית, הגיע לאותה מסקנה: דיווחי הרצל לא נקטו עמדה בשאלת חפותו של הנאשם, הזכירו את יהדותו פעם אחת בלבד ונמנעו מלתאר תגובות אנטישמיות, גם בטקס שלילת הדרגה (אבינרי, 2007, עמ' 84-92; קוץ, 2014, עמ' 8; Kornberg, 1993, pp. 183-194).</w:t>
       </w:r>
     </w:p>
     <w:p>
@@ -1606,23 +1606,23 @@
           <w:szCs w:val="24"/>
           <w:rtl/>
         </w:rPr>
-        <w:t xml:space="preserve">יחסו של הרצל לפרשה השתנה עם התלקחותה מחדש בשלהי 1897. הרצל עמד אז בראש תנועה, הקונגרס הציוני הראשון התכנס בבזל באוגוסט 1897, וערך את השבועון "די ולט". הוא עקב אחר גילויי אסטרהזי, אחר "אני מאשים" ואחר מהומות 1898, והפרשה נעשתה נושא קבוע במאמריו ובנאומיו. עתה החלה למלא בהגותו את התפקיד שייחסו לה הביוגרפים: הוכחה לכך שגם במולדת זכויות האדם, מאה שנה אחרי המהפכה, אין היהודי בטוח. באותה עת התקרב לתנועה ברנאר לאזאר, שנבחר לוועד הפועל הציוני בקונגרס השני (1898) ופרש כעבור פחות משנה בשל מחלוקת על סגנון המנהיגות של הרצל (Elon, 1975, pp. 253-260; Hyman, 1998, pp. 104-106).</w:t>
-      </w:r>
-    </w:p>
-    <w:p>
-      <w:pPr>
-        <w:bidi/>
-        <w:spacing w:after="120" w:line="360" w:lineRule="auto"/>
-        <w:jc w:val="right"/>
-      </w:pPr>
-      <w:r>
-        <w:rPr>
-          <w:rFonts w:ascii="David" w:cs="David" w:eastAsia="David" w:hAnsi="David"/>
-          <w:sz w:val="24"/>
-          <w:szCs w:val="24"/>
-          <w:rtl/>
-        </w:rPr>
-        <w:t xml:space="preserve">עד ינואר 1898 היה "מקרה דרייפוס" עניין צרפתי בעיקרו, שגם העיתונות היהודית באירופה הקדישה לו תשומת לב מהוססת, כפי שהראה גדעון קוץ במחקרו על ראשית הפרשה בעיתונות העברית והיהודית. רק עם משפט זולא והמהומות נעשתה הפרשה לנושא הראשון במעלה בעיתונות האירופית והאמריקנית, והתמונה של "צרפת האנטישמית" התקבעה. עובדה כרונולוגית זו חיונית: כשכתב הרצל את "מדינת היהודים" וכשכינס את הקונגרס הראשון, טרם הפכה הפרשה למה שאנו מכירים היום. היא הפכה לכזו רק כשהוא כבר עמד בראש תנועה שחיפשה הוכחות לצדקת דרכה (קוץ, 2014; Cahm, 1996, pp. 49-68).</w:t>
+        <w:t xml:space="preserve">יחסו של הרצל לפרשה השתנה עם התלקחותה מחדש בשלהי 1897. הרצל עמד אז בראש תנועה, הקונגרס הציוני הראשון התכנס בבזל באוגוסט 1897, וערך את השבועון "די ולט". הוא עקב אחר גילויי אסטרהזי, אחר "אני מאשים" ואחר מהומות 1898, והפרשה נעשתה נושא קבוע במאמריו ובנאומיו. עתה החלה למלא בהגותו את התפקיד שייחסו לה הביוגרפים: הוכחה לכך שגם במולדת זכויות האדם, מאה שנה אחרי המהפכה, אין היהודי בטוח. באותה עת התקרב לתנועה ברנאר לאזאר, שנבחר לוועד הפועל הציוני בקונגרס השני (1898) ופרש כעבור פחות משנה בשל מחלוקת על סגנון המנהיגות של הרצל. לנג ציין שבקרב יהודי צרפת, שהגיבו על הפרשה "בדיסקרטיות רבה", נתקבלו מאמריו של הרצל על הפרשה בהסתייגות כבלתי מתאימים, בעוד דבריהם של לאזאר ושל ההיסטוריון יוסף ריינך נחשבו ראויים (לנג, 2014, עמ' 21; Elon, 1975, pp. 253-260; Hyman, 1998, pp. 104-106).</w:t>
+      </w:r>
+    </w:p>
+    <w:p>
+      <w:pPr>
+        <w:bidi/>
+        <w:spacing w:after="120" w:line="360" w:lineRule="auto"/>
+        <w:jc w:val="right"/>
+      </w:pPr>
+      <w:r>
+        <w:rPr>
+          <w:rFonts w:ascii="David" w:cs="David" w:eastAsia="David" w:hAnsi="David"/>
+          <w:sz w:val="24"/>
+          <w:szCs w:val="24"/>
+          <w:rtl/>
+        </w:rPr>
+        <w:t xml:space="preserve">עד ינואר 1898 היה "מקרה דרייפוס" עניין צרפתי בעיקרו. קוץ הראה שהעיתונות היהודית בצרפת טיפלה בראשית הפרשה בזהירות, מתוך הנחה שהפרשה גרמה להתפרצות האנטישמית ולא שהאנטישמיות הביאה לעלילה, ושבעיתונות העברית באירופה נחלקו העמדות לפי קו אידאולוגי: העיתונים הציוניים, "המליץ" ו"המגיד", ראו בדרייפוס קורבן לעלילה אנטישמית, ואילו "הצפירה" של נחום סוקולוב, שהאמין בעתיד היהודים כאזרחים שווים, נטה לקבל את הרשעתו. גם בארץ ישראל, כפי שהראה יוסף לנג, פירשה עיתונותו של אליעזר בן־יהודה את הפרשה בכלים לאומיים, ואברהם לודוויפול כתב ב"הצבי" שהתקרבותם של לאזאר ונורדאו לרעיון הלאומי נבעה מ"מדינת היהודים" של הרצל (קוץ, 2014, עמ' 14-15; לנג, 2014, עמ' 18-19). רק עם משפט זולא והמהומות נעשתה הפרשה לנושא הראשון במעלה בעיתונות האירופית והאמריקנית, והתמונה של "צרפת האנטישמית" התקבעה. עובדה כרונולוגית זו חיונית: כשכתב הרצל את "מדינת היהודים" וכשכינס את הקונגרס הראשון, טרם הפכה הפרשה למה שאנו מכירים היום. היא הפכה לכזו רק כשהוא כבר עמד בראש תנועה שחיפשה הוכחות לצדקת דרכה (Cahm, 1996, pp. 49-68).</w:t>
       </w:r>
     </w:p>
     <w:p>
@@ -2267,7 +2267,7 @@
           <w:szCs w:val="24"/>
           <w:rtl/>
         </w:rPr>
-        <w:t xml:space="preserve">קוץ, ג' (2014). ראשיתה של פרשת דרייפוס בעיתונות העברית והיהודית באירופה. </w:t>
+        <w:t xml:space="preserve">לנג, י' (2014). תגובות העיתונות העברית בארץ ישראל על פרשת דרייפוס (1894-1906). </w:t>
       </w:r>
       <w:r>
         <w:rPr>
@@ -2289,7 +2289,46 @@
           <w:szCs w:val="24"/>
           <w:rtl/>
         </w:rPr>
-        <w:t xml:space="preserve">, 46.</w:t>
+        <w:t xml:space="preserve">, 46, 16-29.</w:t>
+      </w:r>
+    </w:p>
+    <w:p>
+      <w:pPr>
+        <w:bidi/>
+        <w:spacing w:after="240" w:line="240" w:lineRule="auto"/>
+        <w:ind w:left="720" w:hanging="720"/>
+        <w:jc w:val="right"/>
+      </w:pPr>
+      <w:r>
+        <w:rPr>
+          <w:rFonts w:ascii="David" w:cs="David" w:eastAsia="David" w:hAnsi="David"/>
+          <w:sz w:val="24"/>
+          <w:szCs w:val="24"/>
+          <w:rtl/>
+        </w:rPr>
+        <w:t xml:space="preserve">קוץ, ג' (2014). ראשיתה של פרשת דרייפוס בעיתונות העברית והיהודית באירופה: כוחן של אידאולוגיות. </w:t>
+      </w:r>
+      <w:r>
+        <w:rPr>
+          <w:rFonts w:ascii="David" w:cs="David" w:eastAsia="David" w:hAnsi="David"/>
+          <w:b/>
+          <w:bCs/>
+          <w:i w:val="false"/>
+          <w:iCs w:val="false"/>
+          <w:sz w:val="24"/>
+          <w:szCs w:val="24"/>
+          <w:rtl/>
+        </w:rPr>
+        <w:t xml:space="preserve">קשר</w:t>
+      </w:r>
+      <w:r>
+        <w:rPr>
+          <w:rFonts w:ascii="David" w:cs="David" w:eastAsia="David" w:hAnsi="David"/>
+          <w:sz w:val="24"/>
+          <w:szCs w:val="24"/>
+          <w:rtl/>
+        </w:rPr>
+        <w:t xml:space="preserve">, 46, 4-15.</w:t>
       </w:r>
     </w:p>
     <w:p>

</xml_diff>

<commit_message>
Complete the seminar: expand chapters 2-3 and the conclusion to full length (about 10,150 words with footnotes)
Co-Authored-By: Claude Fable 5.1 <noreply@anthropic.com>
Claude-Session: https://claude.ai/code/session_014Ur3fhHcvLKdVTb2L63jaV
</commit_message>
<xml_diff>
--- a/seminar/סמינריון - פרשת דרייפוס והרצל.docx
+++ b/seminar/סמינריון - פרשת דרייפוס והרצל.docx
@@ -1431,6 +1431,28 @@
     </w:p>
     <w:p>
       <w:pPr>
+        <w:bidi/>
+        <w:spacing w:after="120" w:line="360" w:lineRule="auto"/>
+        <w:jc w:val="right"/>
+      </w:pPr>
+      <w:r>
+        <w:rPr>
+          <w:rFonts w:ascii="David" w:cs="David" w:eastAsia="David" w:hAnsi="David"/>
+          <w:sz w:val="24"/>
+          <w:szCs w:val="24"/>
+          <w:rtl/>
+        </w:rPr>
+        <w:t xml:space="preserve">פרשת "אלביה" חשובה גם בשל מה שלא קרה בעקבותיה. הרצל לא הצטרף לאגודות הסטודנטים היהודיות־לאומיות שקמו בווינה באותן שנים, ובראשן "קדימה", ולא גילה עניין ברעיון הלאומי היהודי שכבר נדון בחוגים אלה. הוא המשיך לראות את עצמו כגרמני בן דת משה, והמסקנה שהסיק מן הסילוק הייתה אישית ולא קולקטיבית: היהודי חייב להוכיח את כבודו כיחיד. מוטיב הכבוד, שנולד בעולם הדו־קרב של אגודות הסטודנטים, ילווה את הרצל עד סוף ימיו, ויופיע גם ב"מדינת היהודים" בטענה שהמדינה תחזיר ליהודים את כבודם בעיני העמים .</w:t>
+      </w:r>
+      <w:r>
+        <w:rPr>
+          <w:rStyle w:val="FootnoteReference"/>
+        </w:rPr>
+        <w:footnoteReference w:id="44"/>
+      </w:r>
+    </w:p>
+    <w:p>
+      <w:pPr>
         <w:pStyle w:val="Heading2"/>
         <w:bidi/>
         <w:spacing w:after="160" w:before="240" w:line="360"/>
@@ -1467,7 +1489,7 @@
         <w:rPr>
           <w:rStyle w:val="FootnoteReference"/>
         </w:rPr>
-        <w:footnoteReference w:id="44"/>
+        <w:footnoteReference w:id="45"/>
       </w:r>
     </w:p>
     <w:p>
@@ -1489,7 +1511,7 @@
         <w:rPr>
           <w:rStyle w:val="FootnoteReference"/>
         </w:rPr>
-        <w:footnoteReference w:id="45"/>
+        <w:footnoteReference w:id="46"/>
       </w:r>
     </w:p>
     <w:p>
@@ -1505,13 +1527,35 @@
           <w:szCs w:val="24"/>
           <w:rtl/>
         </w:rPr>
+        <w:t xml:space="preserve">שני מאמרים משנת 1892 מלמדים על נקודת המוצא. במאמר "האנטישמיות הצרפתית", שנכתב בעקבות סערת "לה ליבר פארול" ודו־קרב שבו נהרג קצין יהודי, הסביר הרצל לקוראיו בווינה שהאנטישמיות בצרפת צומחת מן המצוקה הכלכלית ומן השנאה להון, ושהיהודים משמשים בה מטרה נוחה מפני שהם נראים לעין. הוא לא ראה בכך סכנה ליהודי צרפת אלא סימפטום של חברה במשבר. במאמר אחר מאותה שנה, על רצח פועלים איטלקים בידי המון צרפתי בעיירה אג־מורט, השווה את שנאת הזרים לשנאת היהודים והסיק שהמונים פוגעים בכל מי שנתפש כזר ומתחרה. שני המאמרים מנתחים את השנאה בכלים סוציולוגיים ואינם מציעים כל פתרון יהודי, וזה בדיוק מה שהופך אותם לנקודת ייחוס: הדרך מהם אל "מדינת היהודים" היא הדרך שהעבודה מבקשת לשחזר .</w:t>
+      </w:r>
+      <w:r>
+        <w:rPr>
+          <w:rStyle w:val="FootnoteReference"/>
+        </w:rPr>
+        <w:footnoteReference w:id="47"/>
+      </w:r>
+    </w:p>
+    <w:p>
+      <w:pPr>
+        <w:bidi/>
+        <w:spacing w:after="120" w:line="360" w:lineRule="auto"/>
+        <w:jc w:val="right"/>
+      </w:pPr>
+      <w:r>
+        <w:rPr>
+          <w:rFonts w:ascii="David" w:cs="David" w:eastAsia="David" w:hAnsi="David"/>
+          <w:sz w:val="24"/>
+          <w:szCs w:val="24"/>
+          <w:rtl/>
+        </w:rPr>
         <w:t xml:space="preserve">ברשימה ביומן מ-12 ביוני 1895 כתב הרצל משפט מפתיע: הרבה מחופש התפישה הנוכחי שלו הוא חב לדרימון, "משום שהוא אמן". קורנברג פירש זאת כך: דרימון לימד את הרצל לראות את השאלה היהודית לא כבעיה מוסרית של דעה קדומה שיש לחנך נגדה, אלא כעובדה חברתית־לאומית אובייקטיבית, היהודים כגוף זר בחברה, שיש להסיק ממנה מסקנה מעשית. דרימון הסיק את גירוש היהודים, והרצל את יציאתם מרצון. תפישה זו של האנטישמיות כעובדה שאין להתווכח עמה אלא לנצלה הביאה את הרצל לכתוב ב"מדינת היהודים" שהאנטישמים יהיו "ידידינו הנאמנים ביותר", ואף לרשום ביומנו בסיפוק את הביקורת האוהדת שפרסם "לה ליבר פארול" על חוברתו בינואר 1897 .</w:t>
       </w:r>
       <w:r>
         <w:rPr>
           <w:rStyle w:val="FootnoteReference"/>
         </w:rPr>
-        <w:footnoteReference w:id="46"/>
+        <w:footnoteReference w:id="48"/>
       </w:r>
     </w:p>
     <w:p>
@@ -1552,7 +1596,7 @@
         <w:rPr>
           <w:rStyle w:val="FootnoteReference"/>
         </w:rPr>
-        <w:footnoteReference w:id="47"/>
+        <w:footnoteReference w:id="49"/>
       </w:r>
     </w:p>
     <w:p>
@@ -1568,13 +1612,35 @@
           <w:szCs w:val="24"/>
           <w:rtl/>
         </w:rPr>
+        <w:t xml:space="preserve">שני מוקדי המשבר ראויים לפירוט. הראשון הוא המשפחה. הרצל נשא בשנת 1889 את יוליה נשאואר, בת שמונה עשרה ממשפחה עשירה, והנישואים היו כושלים כמעט מראשיתם: מריבות, פירודים חוזרים, איומי גירושים ומאבק על הילדים, שגדלו בפועל בבית הוריו. בשנות פריז חיה יוליה עם הילדים בווינה ובמקומות נופש, והרצל ראה בהם מעט. השני הוא התיאטרון. הרצל שאף להכרה כמחזאי, אך מחזותיו מראשית שנות התשעים נכשלו או נדחו, והוא הבין שהפיליטון, שבו הצטיין, לא יעניק לו את הגדולה שביקש. פנסלר הציע לראות במשבר הזה את המפתח לפסיכולוגיה של המהפך: הרצל חיפש משימה שתאחד את כישרונותיו כסופר, כעיתונאי וכאיש חברה, ותעניק לחייו משמעות שלא מצא לא במשפחה ולא בבמה .</w:t>
+      </w:r>
+      <w:r>
+        <w:rPr>
+          <w:rStyle w:val="FootnoteReference"/>
+        </w:rPr>
+        <w:footnoteReference w:id="50"/>
+      </w:r>
+    </w:p>
+    <w:p>
+      <w:pPr>
+        <w:bidi/>
+        <w:spacing w:after="120" w:line="360" w:lineRule="auto"/>
+        <w:jc w:val="right"/>
+      </w:pPr>
+      <w:r>
+        <w:rPr>
+          <w:rFonts w:ascii="David" w:cs="David" w:eastAsia="David" w:hAnsi="David"/>
+          <w:sz w:val="24"/>
+          <w:szCs w:val="24"/>
+          <w:rtl/>
+        </w:rPr>
         <w:t xml:space="preserve">מתוך משבר זה נכתב "הגטו החדש", בפריז, בין 21 באוקטובר ל-8 בנובמבר 1894, בשבועות שבהם נעצר דרייפוס ושבהם התפרסם דבר מעצרו, אך לפני משפטו. המחזה מספר על עורך הדין היהודי יעקב שמואל, אדם ישר ואציל־רוח, שמנסה לחיות כאזרח שווה בחברה הווינאית, נדחה על ידי ידידו הנוצרי, נסחט על ידי גיסו הספסר ומוצא את מותו בדו־קרב עם קצין אנטישמי. במילותיו האחרונות הוא קורא: החוצה מן הגטו! המסר כפול. מצד אחד, האמנציפציה המשפטית לא ביטלה את "הגטו החדש", החומות הבלתי נראות של הדעה הקדומה. מצד שני, המחזה אינו מציע פתרון לאומי, וגיבורו אינו מבקש לצאת מאירופה אלא להיות מקובל בה. יש בו האשמה כלפי היהודים, על התעסקותם בכסף ועל היעדר הכבוד, לא פחות מאשר כלפי הסביבה .</w:t>
       </w:r>
       <w:r>
         <w:rPr>
           <w:rStyle w:val="FootnoteReference"/>
         </w:rPr>
-        <w:footnoteReference w:id="48"/>
+        <w:footnoteReference w:id="51"/>
       </w:r>
     </w:p>
     <w:p>
@@ -1596,7 +1662,7 @@
         <w:rPr>
           <w:rStyle w:val="FootnoteReference"/>
         </w:rPr>
-        <w:footnoteReference w:id="49"/>
+        <w:footnoteReference w:id="52"/>
       </w:r>
     </w:p>
     <w:p>
@@ -1637,7 +1703,7 @@
         <w:rPr>
           <w:rStyle w:val="FootnoteReference"/>
         </w:rPr>
-        <w:footnoteReference w:id="50"/>
+        <w:footnoteReference w:id="53"/>
       </w:r>
     </w:p>
     <w:p>
@@ -1653,13 +1719,35 @@
           <w:szCs w:val="24"/>
           <w:rtl/>
         </w:rPr>
+        <w:t xml:space="preserve">השיחה עם שפיידל, בכיר מבקרי התיאטרון של "נויה פרייה פרסה", מובאת ביומן בפירוט יוצא דופן, והיא מלמדת כיצד ניתח הרצל את המצב בווינה. שני האנשים, היהודי והנוצרי, הסכימו שהאנטישמיות הווינאית נובעת מן האמנציפציה: היהודים, שהוכנסו לחברה כשווים, הביאו עמם את תכונות הגטו והצליחו בתחרות הכלכלית, והסביבה הגיבה בשנאה שאינה ניתנת לריכוך בטיעונים. הרצל רשם שהאנטישמיות "לא תזיק ליהודים", מפני שתחשל אותם, ושהיא "חינוך של קבוצה בידי ההמונים". במשפטים אלה, שנכתבו בפריז אך על וינה, כבר טמונה הטענה המרכזית של "מדינת היהודים": האנטישמיות היא תוצאה של האמנציפציה ולא של היעדרה, ולפיכך לא תיעלם עם התקדמות הנאורות. הרצל שב לווינה ביולי 1895 כעורך המדור הספרותי של עיתונו, ומאז חי במקום שבו לואגר היה הכוח הפוליטי העולה .</w:t>
+      </w:r>
+      <w:r>
+        <w:rPr>
+          <w:rStyle w:val="FootnoteReference"/>
+        </w:rPr>
+        <w:footnoteReference w:id="54"/>
+      </w:r>
+    </w:p>
+    <w:p>
+      <w:pPr>
+        <w:bidi/>
+        <w:spacing w:after="120" w:line="360" w:lineRule="auto"/>
+        <w:jc w:val="right"/>
+      </w:pPr>
+      <w:r>
+        <w:rPr>
+          <w:rFonts w:ascii="David" w:cs="David" w:eastAsia="David" w:hAnsi="David"/>
+          <w:sz w:val="24"/>
+          <w:szCs w:val="24"/>
+          <w:rtl/>
+        </w:rPr>
         <w:t xml:space="preserve">הפגישה עם הברון מוריס דה הירש ב-2 ביוני 1895 מלמדת על מצב הרעיון באותם ימים. הרצל הגיע אליה עם עשרים ושניים עמודים של רשימות, תקף את פעולת ההתיישבות של הירש בארגנטינה כפילנתרופיה המשחיתה את היהודים, וטען שיש להעמיד להם מטרה לאומית, דגל, שתעורר בהם כבוד. הירש קטע אותו, והפגישה הסתיימה בלא כלום. בימים שלאחריה כתב הרצל את "הנאום לרוטשילדים", טיוטה של כשישים עמודים שמעולם לא נישאה, ובה מופיעים כבר עיקרי "מדינת היהודים": האנטישמיות כתופעה בלתי הפיכה, ההגירה המאורגנת, "אגודת היהודים" ו"החברה היהודית". גם במסמכים אלה אין זכר לדרייפוס .</w:t>
       </w:r>
       <w:r>
         <w:rPr>
           <w:rStyle w:val="FootnoteReference"/>
         </w:rPr>
-        <w:footnoteReference w:id="51"/>
+        <w:footnoteReference w:id="55"/>
       </w:r>
     </w:p>
     <w:p>
@@ -1678,7 +1766,7 @@
           <w:szCs w:val="28"/>
           <w:rtl/>
         </w:rPr>
-        <w:t xml:space="preserve">6. הגורמים במחקר: קורנברג, אבינרי, שורסקה ובלר</w:t>
+        <w:t xml:space="preserve">6. מן הרעיון אל התנועה: נורדאו, לונדון ובזל (1895-1897)</w:t>
       </w:r>
     </w:p>
     <w:p>
@@ -1694,13 +1782,13 @@
           <w:szCs w:val="24"/>
           <w:rtl/>
         </w:rPr>
-        <w:t xml:space="preserve">הערעור השיטתי הראשון על התיאור המקובל בא במאמרו של קורנברג משנת 1980 ובספרו משנת 1993. קורנברג ביסס את טענתו על דיווחי הרצל מפריז, על שתיקת היומן בעניין דרייפוס ועל "הגטו החדש", וחיפש את הסבר המהפך בתחום הפסיכולוגי־תרבותי: הציונות של הרצל הייתה פתרון למשבר של זהות יהודית מתבוללת שהפנימה את בוז הסביבה, וניסיון להחזיר ליהודים את כבודם באמצעות הפיכתם לעם ריבוני .</w:t>
-      </w:r>
-      <w:r>
-        <w:rPr>
-          <w:rStyle w:val="FootnoteReference"/>
-        </w:rPr>
-        <w:footnoteReference w:id="52"/>
+        <w:t xml:space="preserve">הדרך מן היומן אל הקונגרס הציוני הראשון, שנמשכה כשנתיים, התרחשה כולה בשנים שבהן היה "מקרה דרייפוס" סגור ונשכח, ולכן היא שייכת לפרק זה. בנובמבר 1895 נפגש הרצל בפריז עם מקס נורדאו, הרופא והסופר יליד בודפשט שספרו "התנוונות" הפך אותו לאחד הפובליציסטים המפורסמים באירופה. נורדאו, שהיה יהודי מתבולל כהרצל, שמע את התוכנית ואמר לו, לפי היומן, "אם אתה משוגע, גם אני משוגע". תמיכתו של נורדאו העניקה לרעיון את הלגיטימציה הראשונה מפי אדם בעל שם, והוא שהפנה את הרצל אל הסופר האנגלי־יהודי ישראל זנגוויל ואל חוגי "חובבי ציון" בלונדון, שם נשא הרצל בנובמבר 1895 את הרצאתו הפומבית הראשונה על התוכנית, באגודת "המכבים" .</w:t>
+      </w:r>
+      <w:r>
+        <w:rPr>
+          <w:rStyle w:val="FootnoteReference"/>
+        </w:rPr>
+        <w:footnoteReference w:id="56"/>
       </w:r>
     </w:p>
     <w:p>
@@ -1716,65 +1804,13 @@
           <w:szCs w:val="24"/>
           <w:rtl/>
         </w:rPr>
-        <w:t xml:space="preserve">אבינרי העביר את מרכז הכובד מפריז לווינה, והוסיף טיעון היסטוריוגרפי: הרצל בנה בשנת 1899 את "מיתוס דרייפוס" משום שהיה זקוק לסיפור מוצא שידבר אל יהודי המערב ולא אל סכסוכים מקומיים באוסטריה, וההיסטוריונים הציונים אימצו את המיתוס משום שסיפק לתנועה ציווי מוסרי אוניברסלי .</w:t>
-      </w:r>
-      <w:r>
-        <w:rPr>
-          <w:rStyle w:val="FootnoteReference"/>
-        </w:rPr>
-        <w:footnoteReference w:id="53"/>
-      </w:r>
-      <w:r>
-        <w:rPr>
-          <w:rFonts w:ascii="David" w:cs="David" w:eastAsia="David" w:hAnsi="David"/>
-          <w:sz w:val="24"/>
-          <w:szCs w:val="24"/>
-          <w:rtl/>
-        </w:rPr>
-        <w:t xml:space="preserve"> שורסקה הציג את הרצל כחלק מ"השלישייה האוסטרית", לצד שנרר ולואגר, וטען שניתן להבין את הציונות שלו רק בהקשר הווינאי של שקיעת הליברליזם ועליית פוליטיקת ההמונים .</w:t>
-      </w:r>
-      <w:r>
-        <w:rPr>
-          <w:rStyle w:val="FootnoteReference"/>
-        </w:rPr>
-        <w:footnoteReference w:id="54"/>
-      </w:r>
-      <w:r>
-        <w:rPr>
-          <w:rFonts w:ascii="David" w:cs="David" w:eastAsia="David" w:hAnsi="David"/>
-          <w:sz w:val="24"/>
-          <w:szCs w:val="24"/>
-          <w:rtl/>
-        </w:rPr>
-        <w:t xml:space="preserve"> רוברט ויסטריך הדגיש אף הוא את המקור הווינאי ואת כישרונו של הרצל לבנות מיתוסים, ובכלל זה את מיתוס הולדתו שלו כציוני .</w:t>
-      </w:r>
-      <w:r>
-        <w:rPr>
-          <w:rStyle w:val="FootnoteReference"/>
-        </w:rPr>
-        <w:footnoteReference w:id="55"/>
-      </w:r>
-    </w:p>
-    <w:p>
-      <w:pPr>
-        <w:bidi/>
-        <w:spacing w:after="120" w:line="360" w:lineRule="auto"/>
-        <w:jc w:val="right"/>
-      </w:pPr>
-      <w:r>
-        <w:rPr>
-          <w:rFonts w:ascii="David" w:cs="David" w:eastAsia="David" w:hAnsi="David"/>
-          <w:sz w:val="24"/>
-          <w:szCs w:val="24"/>
-          <w:rtl/>
-        </w:rPr>
-        <w:t xml:space="preserve">עמדת ביניים הציע סטיבן בלר. הוא קיבל שהרקע הווינאי חשוב מן הפריזאי, אך הבחין בין הסיבה למהפך לבין המסגרת שלו: וינה סיפקה את הסיבה, משבר הליברליזם ועליית לואגר, ואילו פריז סיפקה את המסגרת הרעיונית, שכן רק בצרפת, ארץ האמנציפציה המלאה, יכול היה הרצל לנסח את הטענה העקרונית שהאמנציפציה כשלעצמה אינה פותרת את השאלה היהודית. אלמלא שהה בפריז, ייתכן שהיה מגיע למסקנה מקומית, שאוסטריה אינה מקום ליהודים, ולא למסקנה שאין מקום ליהודים באירופה כולה .</w:t>
-      </w:r>
-      <w:r>
-        <w:rPr>
-          <w:rStyle w:val="FootnoteReference"/>
-        </w:rPr>
-        <w:footnoteReference w:id="56"/>
+        <w:t xml:space="preserve">"מדינת היהודים" ראתה אור בפברואר 1896, ובעקבותיה קיבל הרצל מכתבים מרחבי אירופה, ובעיקר ממזרחה, מחובבי ציון שגילו לתדהמתם שעיתונאי וינאי נודע הגיע בכוחות עצמו אל רעיונותיהם. הרצל, שלא ידע דבר על תנועת חובבי ציון ועל הספרות הציונית שקדמה לו, גילה תנועה מוכנה שחיכתה למנהיג. ביוני 1896 נסע לקושטא בניסיון ראשון לשאת ולתת עם השלטון העות'מאני, ובדרכו חזרה קיבלו את פניו בנמל סופיה המוני יהודים בקריאות "המלך". בקיץ 1897 ייסד את השבועון "די ולט", ובאוגוסט 1897 כינס בבזל את הקונגרס הציוני הראשון, שקבע את "תוכנית בזל" ובחר בו לנשיא ההסתדרות הציונית. ביומנו כתב: "בבזל ייסדתי את מדינת היהודים". כל התהליך הזה, מן הרעיון אל המוסד, התנהל ללא זיקה לפרשת דרייפוס, שהתלקחה מחדש רק בסתיו 1897, חודשיים לאחר הקונגרס .</w:t>
+      </w:r>
+      <w:r>
+        <w:rPr>
+          <w:rStyle w:val="FootnoteReference"/>
+        </w:rPr>
+        <w:footnoteReference w:id="57"/>
       </w:r>
     </w:p>
     <w:p>
@@ -1793,7 +1829,7 @@
           <w:szCs w:val="28"/>
           <w:rtl/>
         </w:rPr>
-        <w:t xml:space="preserve">7. סיכום הפרק</w:t>
+        <w:t xml:space="preserve">7. הגורמים במחקר: קורנברג, אבינרי, שורסקה ובלר</w:t>
       </w:r>
     </w:p>
     <w:p>
@@ -1809,13 +1845,150 @@
           <w:szCs w:val="24"/>
           <w:rtl/>
         </w:rPr>
-        <w:t xml:space="preserve">הגורמים שנסקרו מצטרפים לשרשרת: היכרות ממושכת עם האנטישמיות הווינאית מאז 1882, לקחי פריז בדבר הפוליטיקה ההמונית, תפישת האנטישמיות כעובדה אובייקטיבית שלמד מדרימון, משבר אישי שדרש משימה כוללת, ומכה פוליטית בבית, ניצחון לואגר, בדיוק בחודשים שבהם נולד הרעיון. הרצל עצמו, כשמנה את הגורמים ביומנו, מנה את אלה ולא את דרייפוס. הפרק הבא יבחן מה מקומה של הפרשה לצדם .</w:t>
-      </w:r>
-      <w:r>
-        <w:rPr>
-          <w:rStyle w:val="FootnoteReference"/>
-        </w:rPr>
-        <w:footnoteReference w:id="57"/>
+        <w:t xml:space="preserve">הערעור השיטתי הראשון על התיאור המקובל בא במאמרו של קורנברג משנת 1980 ובספרו משנת 1993. קורנברג ביסס את טענתו על דיווחי הרצל מפריז, על שתיקת היומן בעניין דרייפוס ועל "הגטו החדש", וחיפש את הסבר המהפך בתחום הפסיכולוגי־תרבותי: הציונות של הרצל הייתה פתרון למשבר של זהות יהודית מתבוללת שהפנימה את בוז הסביבה, וניסיון להחזיר ליהודים את כבודם באמצעות הפיכתם לעם ריבוני .</w:t>
+      </w:r>
+      <w:r>
+        <w:rPr>
+          <w:rStyle w:val="FootnoteReference"/>
+        </w:rPr>
+        <w:footnoteReference w:id="58"/>
+      </w:r>
+    </w:p>
+    <w:p>
+      <w:pPr>
+        <w:bidi/>
+        <w:spacing w:after="120" w:line="360" w:lineRule="auto"/>
+        <w:jc w:val="right"/>
+      </w:pPr>
+      <w:r>
+        <w:rPr>
+          <w:rFonts w:ascii="David" w:cs="David" w:eastAsia="David" w:hAnsi="David"/>
+          <w:sz w:val="24"/>
+          <w:szCs w:val="24"/>
+          <w:rtl/>
+        </w:rPr>
+        <w:t xml:space="preserve">אבינרי העביר את מרכז הכובד מפריז לווינה, והוסיף טיעון היסטוריוגרפי: הרצל בנה בשנת 1899 את "מיתוס דרייפוס" משום שהיה זקוק לסיפור מוצא שידבר אל יהודי המערב ולא אל סכסוכים מקומיים באוסטריה, וההיסטוריונים הציונים אימצו את המיתוס משום שסיפק לתנועה ציווי מוסרי אוניברסלי .</w:t>
+      </w:r>
+      <w:r>
+        <w:rPr>
+          <w:rStyle w:val="FootnoteReference"/>
+        </w:rPr>
+        <w:footnoteReference w:id="59"/>
+      </w:r>
+      <w:r>
+        <w:rPr>
+          <w:rFonts w:ascii="David" w:cs="David" w:eastAsia="David" w:hAnsi="David"/>
+          <w:sz w:val="24"/>
+          <w:szCs w:val="24"/>
+          <w:rtl/>
+        </w:rPr>
+        <w:t xml:space="preserve"> שורסקה הציג את הרצל כחלק מ"השלישייה האוסטרית", לצד שנרר ולואגר, וטען שניתן להבין את הציונות שלו רק בהקשר הווינאי של שקיעת הליברליזם ועליית פוליטיקת ההמונים .</w:t>
+      </w:r>
+      <w:r>
+        <w:rPr>
+          <w:rStyle w:val="FootnoteReference"/>
+        </w:rPr>
+        <w:footnoteReference w:id="60"/>
+      </w:r>
+      <w:r>
+        <w:rPr>
+          <w:rFonts w:ascii="David" w:cs="David" w:eastAsia="David" w:hAnsi="David"/>
+          <w:sz w:val="24"/>
+          <w:szCs w:val="24"/>
+          <w:rtl/>
+        </w:rPr>
+        <w:t xml:space="preserve"> רוברט ויסטריך הדגיש אף הוא את המקור הווינאי ואת כישרונו של הרצל לבנות מיתוסים, ובכלל זה את מיתוס הולדתו שלו כציוני .</w:t>
+      </w:r>
+      <w:r>
+        <w:rPr>
+          <w:rStyle w:val="FootnoteReference"/>
+        </w:rPr>
+        <w:footnoteReference w:id="61"/>
+      </w:r>
+    </w:p>
+    <w:p>
+      <w:pPr>
+        <w:bidi/>
+        <w:spacing w:after="120" w:line="360" w:lineRule="auto"/>
+        <w:jc w:val="right"/>
+      </w:pPr>
+      <w:r>
+        <w:rPr>
+          <w:rFonts w:ascii="David" w:cs="David" w:eastAsia="David" w:hAnsi="David"/>
+          <w:sz w:val="24"/>
+          <w:szCs w:val="24"/>
+          <w:rtl/>
+        </w:rPr>
+        <w:t xml:space="preserve">ויסטריך הוסיף נדבך חברתי לטיעון הווינאי. בספרו על יהודי וינה בעידן פרנץ יוזף הראה שהרצל השתייך לשכבה של יהודים מתבוללים דוברי גרמנית שהזדהותם עם הליברליזם ועם התרבות הגרמנית הייתה טוטלית, ושעליית לואגר פגעה בה קשה מכל שכבה אחרת, מפני שהיא שללה את עצם האפשרות להיות גרמני ויהודי כאחד. הציונות של הרצל, לפי ויסטריך, הייתה תגובה של השכבה הזאת דווקא, ולא של ההמונים היהודים ממזרח אירופה שאליהם פנה בפועל .</w:t>
+      </w:r>
+      <w:r>
+        <w:rPr>
+          <w:rStyle w:val="FootnoteReference"/>
+        </w:rPr>
+        <w:footnoteReference w:id="62"/>
+      </w:r>
+    </w:p>
+    <w:p>
+      <w:pPr>
+        <w:bidi/>
+        <w:spacing w:after="120" w:line="360" w:lineRule="auto"/>
+        <w:jc w:val="right"/>
+      </w:pPr>
+      <w:r>
+        <w:rPr>
+          <w:rFonts w:ascii="David" w:cs="David" w:eastAsia="David" w:hAnsi="David"/>
+          <w:sz w:val="24"/>
+          <w:szCs w:val="24"/>
+          <w:rtl/>
+        </w:rPr>
+        <w:t xml:space="preserve">עמדת ביניים הציע סטיבן בלר. הוא קיבל שהרקע הווינאי חשוב מן הפריזאי, אך הבחין בין הסיבה למהפך לבין המסגרת שלו: וינה סיפקה את הסיבה, משבר הליברליזם ועליית לואגר, ואילו פריז סיפקה את המסגרת הרעיונית, שכן רק בצרפת, ארץ האמנציפציה המלאה, יכול היה הרצל לנסח את הטענה העקרונית שהאמנציפציה כשלעצמה אינה פותרת את השאלה היהודית. אלמלא שהה בפריז, ייתכן שהיה מגיע למסקנה מקומית, שאוסטריה אינה מקום ליהודים, ולא למסקנה שאין מקום ליהודים באירופה כולה .</w:t>
+      </w:r>
+      <w:r>
+        <w:rPr>
+          <w:rStyle w:val="FootnoteReference"/>
+        </w:rPr>
+        <w:footnoteReference w:id="63"/>
+      </w:r>
+    </w:p>
+    <w:p>
+      <w:pPr>
+        <w:pStyle w:val="Heading2"/>
+        <w:bidi/>
+        <w:spacing w:after="160" w:before="240" w:line="360"/>
+        <w:jc w:val="right"/>
+      </w:pPr>
+      <w:r>
+        <w:rPr>
+          <w:rFonts w:ascii="David" w:cs="David" w:eastAsia="David" w:hAnsi="David"/>
+          <w:b/>
+          <w:bCs/>
+          <w:sz w:val="28"/>
+          <w:szCs w:val="28"/>
+          <w:rtl/>
+        </w:rPr>
+        <w:t xml:space="preserve">8. סיכום הפרק</w:t>
+      </w:r>
+    </w:p>
+    <w:p>
+      <w:pPr>
+        <w:bidi/>
+        <w:spacing w:after="120" w:line="360" w:lineRule="auto"/>
+        <w:jc w:val="right"/>
+      </w:pPr>
+      <w:r>
+        <w:rPr>
+          <w:rFonts w:ascii="David" w:cs="David" w:eastAsia="David" w:hAnsi="David"/>
+          <w:sz w:val="24"/>
+          <w:szCs w:val="24"/>
+          <w:rtl/>
+        </w:rPr>
+        <w:t xml:space="preserve">הגורמים שנסקרו מצטרפים לשרשרת: היכרות ממושכת עם האנטישמיות הווינאית מאז 1882, לקחי פריז בדבר הפוליטיקה ההמונית, תפישת האנטישמיות כעובדה אובייקטיבית שלמד מדרימון, משבר אישי שדרש משימה כוללת, ומכה פוליטית בבית, ניצחון לואגר, בדיוק בחודשים שבהם נולד הרעיון. גם המעבר מן הרעיון אל התנועה, מפגישת נורדאו ועד קונגרס בזל, התרחש בשנים שבהן לא הייתה פרשת דרייפוס על סדר היום. הרצל עצמו, כשמנה את הגורמים ביומנו, מנה את אלה ולא את דרייפוס. הפרק הבא יבחן מה מקומה של הפרשה לצדם .</w:t>
+      </w:r>
+      <w:r>
+        <w:rPr>
+          <w:rStyle w:val="FootnoteReference"/>
+        </w:rPr>
+        <w:footnoteReference w:id="64"/>
       </w:r>
     </w:p>
     <w:p>
@@ -1892,7 +2065,7 @@
         <w:rPr>
           <w:rStyle w:val="FootnoteReference"/>
         </w:rPr>
-        <w:footnoteReference w:id="58"/>
+        <w:footnoteReference w:id="65"/>
       </w:r>
     </w:p>
     <w:p>
@@ -1914,7 +2087,7 @@
         <w:rPr>
           <w:rStyle w:val="FootnoteReference"/>
         </w:rPr>
-        <w:footnoteReference w:id="59"/>
+        <w:footnoteReference w:id="66"/>
       </w:r>
     </w:p>
     <w:p>
@@ -1936,7 +2109,7 @@
         <w:rPr>
           <w:rStyle w:val="FootnoteReference"/>
         </w:rPr>
-        <w:footnoteReference w:id="60"/>
+        <w:footnoteReference w:id="67"/>
       </w:r>
     </w:p>
     <w:p>
@@ -1958,7 +2131,7 @@
         <w:rPr>
           <w:rStyle w:val="FootnoteReference"/>
         </w:rPr>
-        <w:footnoteReference w:id="61"/>
+        <w:footnoteReference w:id="68"/>
       </w:r>
     </w:p>
     <w:p>
@@ -1974,13 +2147,66 @@
           <w:szCs w:val="24"/>
           <w:rtl/>
         </w:rPr>
+        <w:t xml:space="preserve">משפטו של זולא, שהתנהל בפריז בין 7 ל-23 בפברואר 1898, היה אירוע ציבורי דרמטי: המונים צרו על בניין בית המשפט בקריאות "מוות לזולא, מוות ליהודים", וגנרלים הופיעו על דוכן העדים ואיימו בהתפטרות אם יורשע הצבא. זולא נידון לשנת מאסר ולקנס, ולאחר שהורשע שנית במשפט חוזר נמלט לאנגליה, שם שהה כאחד עשר חודשים. המכתב והמשפט הפכו את המאבק על דרייפוס למאבק על דמות הרפובליקה, והביאו לחתימת אלפי אנשי רוח על "עצומת האינטלקטואלים", מונח שנטבע באותם ימים, בלעג, בידי מתנגדיהם .</w:t>
+      </w:r>
+      <w:r>
+        <w:rPr>
+          <w:rStyle w:val="FootnoteReference"/>
+        </w:rPr>
+        <w:footnoteReference w:id="69"/>
+      </w:r>
+    </w:p>
+    <w:p>
+      <w:pPr>
+        <w:bidi/>
+        <w:spacing w:after="120" w:line="360" w:lineRule="auto"/>
+        <w:jc w:val="right"/>
+      </w:pPr>
+      <w:r>
+        <w:rPr>
+          <w:rFonts w:ascii="David" w:cs="David" w:eastAsia="David" w:hAnsi="David"/>
+          <w:sz w:val="24"/>
+          <w:szCs w:val="24"/>
+          <w:rtl/>
+        </w:rPr>
         <w:t xml:space="preserve">ביוני 1899 ביטל בית המשפט העליון את פסק הדין והורה על משפט חוזר. בית הדין הצבאי ברן הרשיע את דרייפוס שוב, "בנסיבות מקלות", ונשיא הרפובליקה העניק לו חנינה ב-19 בספטמבר 1899. רק ביולי 1906 בוטל פסק הדין סופית ודרייפוס הוחזר לצבא. מבחינה פוליטית הסתיימה הפרשה בניצחון הרפובליקה, ששיאו בחוק הפרדת הדת מן המדינה בשנת 1905. מבחינת יהודי צרפת הייתה משמעותה כפולה: הפרשה הוכיחה שהמדינה מסוגלת בסופו של דבר להגן על אזרחיה היהודים, אך גם חשפה שגם במולדת האמנציפציה אפשר להפוך את היהודי המשולב ביותר ל"זר" בתוך ימים .</w:t>
       </w:r>
       <w:r>
         <w:rPr>
           <w:rStyle w:val="FootnoteReference"/>
         </w:rPr>
-        <w:footnoteReference w:id="62"/>
+        <w:footnoteReference w:id="70"/>
+      </w:r>
+    </w:p>
+    <w:p>
+      <w:pPr>
+        <w:bidi/>
+        <w:spacing w:after="120" w:line="360" w:lineRule="auto"/>
+        <w:jc w:val="right"/>
+      </w:pPr>
+      <w:r>
+        <w:rPr>
+          <w:rFonts w:ascii="David" w:cs="David" w:eastAsia="David" w:hAnsi="David"/>
+          <w:sz w:val="24"/>
+          <w:szCs w:val="24"/>
+          <w:rtl/>
+        </w:rPr>
+        <w:t xml:space="preserve">תגובת יהודי צרפת לפרשה חשובה להבנת האופן שבו נתפשה בזמן אמת. מייקל מרוס הראה בספרו "הפוליטיקה של ההתבוללות" שרוב יהודי צרפת, ובראשם הממסד הקהילתי, בחרו בשתיקה ובאיפוק. הם קיבלו את פסק הדין של 1894, נמנעו מכל פעולה קולקטיבית מחשש שתאשר את האשמת "הסינדיקט", והשאירו את המאבק בידי בני המשפחה ובידי לא־יהודים. מרוס ראה בכך כישלון של אסטרטגיית ההתבוללות. היימן הציעה קריאה סלחנית יותר: האיפוק היה בחירה רציונלית של קהילה שביטחונה נשען על המדינה, והניצחון הסופי של הרפובליקה הצדיק אותה בדיעבד. מנקודת מבטם של יהודי צרפת, כתבה, "המערכת פעלה": זכויות היהודים כאזרחים הוגנו באמצעות הפוליטיקה הצרפתית הרגילה, ודווקא הציונים ויהודי מזרח אירופה הם שראו בפרשה, במבט לאחור, אזהרה שיהודי צרפת עצמם לא ראו בה .</w:t>
+      </w:r>
+      <w:r>
+        <w:rPr>
+          <w:rStyle w:val="FootnoteReference"/>
+        </w:rPr>
+        <w:footnoteReference w:id="71"/>
+      </w:r>
+      <w:r>
+        <w:rPr>
+          <w:rFonts w:ascii="David" w:cs="David" w:eastAsia="David" w:hAnsi="David"/>
+          <w:sz w:val="24"/>
+          <w:szCs w:val="24"/>
+          <w:rtl/>
+        </w:rPr>
+        <w:t xml:space="preserve"> הבדל זה בין תפישת הפרשה בצרפת לבין תפישתה מבחוץ הוא הרקע לדיון בהרצל.</w:t>
       </w:r>
     </w:p>
     <w:p>
@@ -2021,7 +2247,7 @@
         <w:rPr>
           <w:rStyle w:val="FootnoteReference"/>
         </w:rPr>
-        <w:footnoteReference w:id="63"/>
+        <w:footnoteReference w:id="72"/>
       </w:r>
     </w:p>
     <w:p>
@@ -2043,7 +2269,7 @@
         <w:rPr>
           <w:rStyle w:val="FootnoteReference"/>
         </w:rPr>
-        <w:footnoteReference w:id="64"/>
+        <w:footnoteReference w:id="73"/>
       </w:r>
     </w:p>
     <w:p>
@@ -2059,13 +2285,35 @@
           <w:szCs w:val="24"/>
           <w:rtl/>
         </w:rPr>
+        <w:t xml:space="preserve">שני פרטים מחזקים את הקריאה הזאת. הראשון הוא סדר הזמנים של "הגטו החדש": המחזה נכתב בין 21 באוקטובר ל-8 בנובמבר 1894, כלומר הוא הושלם שבוע לאחר שנודע דבר המעצר ולפני שהחל המשפט. הרצל עצמו, כשמנה את המחזה בין תחנות דרכו, לא קשר אותו לדרייפוס. השני הוא אופי הדיווחים. אלכס ביין, שכינס את כתבותיו ומאמריו של הרצל על משפט דרייפוס בקובץ עברי, הראה שהן דיווחים עיתונאיים לכל דבר: תיאור ההליך, הערכת האווירה בפריז, ניחושים על גורל הנאשם, ללא כל התייחסות למשמעות יהודית. קוץ הוסיף שהרצל הזכיר את יהדותו של דרייפוס פעם אחת בלבד בכל דיווחיו .</w:t>
+      </w:r>
+      <w:r>
+        <w:rPr>
+          <w:rStyle w:val="FootnoteReference"/>
+        </w:rPr>
+        <w:footnoteReference w:id="74"/>
+      </w:r>
+    </w:p>
+    <w:p>
+      <w:pPr>
+        <w:bidi/>
+        <w:spacing w:after="120" w:line="360" w:lineRule="auto"/>
+        <w:jc w:val="right"/>
+      </w:pPr>
+      <w:r>
+        <w:rPr>
+          <w:rFonts w:ascii="David" w:cs="David" w:eastAsia="David" w:hAnsi="David"/>
+          <w:sz w:val="24"/>
+          <w:szCs w:val="24"/>
+          <w:rtl/>
+        </w:rPr>
         <w:t xml:space="preserve">"מדינת היהודים" ראתה אור ב-14 בפברואר 1896. הטיעון בנוי בהיגיון הדוק: השאלה היהודית קיימת בכל מקום שבו חיים יהודים במספר ניכר, והיא שאלה לאומית; האמנציפציה באה מאוחר מדי, אינה ניתנת לביטול משפטי אך גם אינה ניתנת למימוש חברתי, מפני שהעמים אינם מאפשרים ליהודים להיטמע; האנטישמיות המודרנית היא תוצאה של האמנציפציה ולא של היעדרה, והיא גוברת עם התחרות הכלכלית; מכאן שהיהודים הם עם, ועם זקוק לטריטוריה ולריבונות. צרפת נזכרת בחוברת פעמים אחדות כדוגמה לארץ שבה קיימת אנטישמיות אף שהאמנציפציה בה מלאה, אך דרייפוס אינו נזכר בה ולו פעם אחת. בפברואר 1896 היה המקרה סגור ונשכח, ומחבר החוברת, שעדיין האמין באשמת דרייפוס, לא ראה בו הוכחה לטענתו. ההוכחה שהביא הייתה הניתוח הסוציולוגי של האנטישמיות כתופעה הנלווית לאמנציפציה, ניתוח שדוד ויטל ראה בו את תרומתו החשובה ביותר למחשבה הציונית .</w:t>
       </w:r>
       <w:r>
         <w:rPr>
           <w:rStyle w:val="FootnoteReference"/>
         </w:rPr>
-        <w:footnoteReference w:id="65"/>
+        <w:footnoteReference w:id="75"/>
       </w:r>
     </w:p>
     <w:p>
@@ -2106,7 +2354,7 @@
         <w:rPr>
           <w:rStyle w:val="FootnoteReference"/>
         </w:rPr>
-        <w:footnoteReference w:id="66"/>
+        <w:footnoteReference w:id="76"/>
       </w:r>
     </w:p>
     <w:p>
@@ -2122,13 +2370,35 @@
           <w:szCs w:val="24"/>
           <w:rtl/>
         </w:rPr>
+        <w:t xml:space="preserve">פרישתו של לאזאר מלמדת על גבולות הקשר בין הפרשה לציונות. לאזאר הגיע אל הלאומיות היהודית מתוך הפרשה, אך תפישתו הייתה שונה מזו של הרצל: הוא ראה בציונות תנועה של שחרור עממי ומוסרי, וסלד מן הדיפלומטיה של הרצל עם קיסרים ושרים ומן הסגנון הסמכותי של הנהגתו. הוא פרש בשנת 1899, וקוץ ולנג הראו שגם בעיתונות היהודית של הזמן נתפשו לאזאר וריינך, ולא הרצל, כמי שדיברו בשם יהודי צרפת בפרשה .</w:t>
+      </w:r>
+      <w:r>
+        <w:rPr>
+          <w:rStyle w:val="FootnoteReference"/>
+        </w:rPr>
+        <w:footnoteReference w:id="77"/>
+      </w:r>
+    </w:p>
+    <w:p>
+      <w:pPr>
+        <w:bidi/>
+        <w:spacing w:after="120" w:line="360" w:lineRule="auto"/>
+        <w:jc w:val="right"/>
+      </w:pPr>
+      <w:r>
+        <w:rPr>
+          <w:rFonts w:ascii="David" w:cs="David" w:eastAsia="David" w:hAnsi="David"/>
+          <w:sz w:val="24"/>
+          <w:szCs w:val="24"/>
+          <w:rtl/>
+        </w:rPr>
         <w:t xml:space="preserve">עד ינואר 1898 היה "מקרה דרייפוס" עניין צרפתי בעיקרו. קוץ הראה שהעיתונות היהודית בצרפת טיפלה בראשית הפרשה בזהירות, מתוך הנחה שהפרשה גרמה להתפרצות האנטישמית ולא שהאנטישמיות הביאה לעלילה, ושבעיתונות העברית באירופה נחלקו העמדות לפי קו אידאולוגי: העיתונים הציוניים, "המליץ" ו"המגיד", ראו בדרייפוס קורבן לעלילה אנטישמית, ואילו "הצפירה" של נחום סוקולוב, שהאמין בעתיד היהודים כאזרחים שווים, נטה לקבל את הרשעתו. גם בארץ ישראל, כפי שהראה יוסף לנג, פירשה עיתונותו של אליעזר בן־יהודה את הפרשה בכלים לאומיים, ואברהם לודוויפול כתב ב"הצבי" שהתקרבותם של לאזאר ונורדאו לרעיון הלאומי נבעה מ"מדינת היהודים" של הרצל .</w:t>
       </w:r>
       <w:r>
         <w:rPr>
           <w:rStyle w:val="FootnoteReference"/>
         </w:rPr>
-        <w:footnoteReference w:id="67"/>
+        <w:footnoteReference w:id="78"/>
       </w:r>
       <w:r>
         <w:rPr>
@@ -2143,7 +2413,7 @@
         <w:rPr>
           <w:rStyle w:val="FootnoteReference"/>
         </w:rPr>
-        <w:footnoteReference w:id="68"/>
+        <w:footnoteReference w:id="79"/>
       </w:r>
       <w:r>
         <w:rPr>
@@ -2158,7 +2428,7 @@
         <w:rPr>
           <w:rStyle w:val="FootnoteReference"/>
         </w:rPr>
-        <w:footnoteReference w:id="69"/>
+        <w:footnoteReference w:id="80"/>
       </w:r>
       <w:r>
         <w:rPr>
@@ -2173,7 +2443,7 @@
         <w:rPr>
           <w:rStyle w:val="FootnoteReference"/>
         </w:rPr>
-        <w:footnoteReference w:id="70"/>
+        <w:footnoteReference w:id="81"/>
       </w:r>
     </w:p>
     <w:p>
@@ -2189,13 +2459,35 @@
           <w:szCs w:val="24"/>
           <w:rtl/>
         </w:rPr>
+        <w:t xml:space="preserve">השימוש שעשה הרצל בפרשה משנת 1898 ואילך היה שימוש של מנהיג ולא של משקיף. ב"די ולט" הוצגו המהומות בצרפת ובאלג'יריה כהוכחה שהאמנציפציה נכשלה גם במקום שבו הצליחה ביותר, ומשפט זולא הוצג כראיה לכך שגם הצרפתים הישרים ביותר אינם יכולים להגן על היהודים מפני ההמון. הפרשה שימשה גם במשא ומתן הדיפלומטי: בפגישותיו עם מדינאים גרמנים ואחרים בשנים 1898-1899 הציג הרצל את הציונות כפתרון שיסיר את "השאלה היהודית" מסדר היום של המדינות, ופרשת דרייפוס הייתה הדוגמה הנוחה ביותר למחיר שהיא גובה מהן. במובן זה סיפקה הפרשה להרצל לא רק סיפור מוצא אלא טיעון מדיני .</w:t>
+      </w:r>
+      <w:r>
+        <w:rPr>
+          <w:rStyle w:val="FootnoteReference"/>
+        </w:rPr>
+        <w:footnoteReference w:id="82"/>
+      </w:r>
+    </w:p>
+    <w:p>
+      <w:pPr>
+        <w:bidi/>
+        <w:spacing w:after="120" w:line="360" w:lineRule="auto"/>
+        <w:jc w:val="right"/>
+      </w:pPr>
+      <w:r>
+        <w:rPr>
+          <w:rFonts w:ascii="David" w:cs="David" w:eastAsia="David" w:hAnsi="David"/>
+          <w:sz w:val="24"/>
+          <w:szCs w:val="24"/>
+          <w:rtl/>
+        </w:rPr>
         <w:t xml:space="preserve">השיא של התהליך הוא המאמר "ציונות", שפרסם הרצל ביולי 1899 ב"נורת' אמריקן ריוויו", חודשיים לפני משפט רן, כשהפרשה עמדה בשיא תשומת הלב העולמית. במאמר, שנועד לקהל אמריקני שאהדתו לדרייפוס הייתה מלאה, כתב הרצל שמשפט דרייפוס, שבו נכח בשנת 1894, הוא שעשה אותו לציוני; שדרייפוס הורשע משום שהיה יהודי; ושההמון צעק "מוות ליהודים". אם עם כה מתקדם כעם הצרפתי מסוגל לכך, שאל, מה יכולים היהודים לצפות מעמים אחרים? ניסוח זה, שחזר עליו הרצל עד מותו, הוא מקור המיתוס. הוא נכתב בידי מנהיג פוליטי המבקש לתת לתנועתו סיפור מוצא משכנע, בשעה שהפרשה סיפקה לו את הסיפור הטוב ביותר האפשרי: לא פוליטיקה עירונית וינאית שהעולם לא הכיר, אלא דרמה עולמית שבה כל קורא נאור עמד לצד היהודי .</w:t>
       </w:r>
       <w:r>
         <w:rPr>
           <w:rStyle w:val="FootnoteReference"/>
         </w:rPr>
-        <w:footnoteReference w:id="71"/>
+        <w:footnoteReference w:id="83"/>
       </w:r>
     </w:p>
     <w:p>
@@ -2236,7 +2528,7 @@
         <w:rPr>
           <w:rStyle w:val="FootnoteReference"/>
         </w:rPr>
-        <w:footnoteReference w:id="72"/>
+        <w:footnoteReference w:id="84"/>
       </w:r>
     </w:p>
     <w:p>
@@ -2258,7 +2550,29 @@
         <w:rPr>
           <w:rStyle w:val="FootnoteReference"/>
         </w:rPr>
-        <w:footnoteReference w:id="73"/>
+        <w:footnoteReference w:id="85"/>
+      </w:r>
+    </w:p>
+    <w:p>
+      <w:pPr>
+        <w:bidi/>
+        <w:spacing w:after="120" w:line="360" w:lineRule="auto"/>
+        <w:jc w:val="right"/>
+      </w:pPr>
+      <w:r>
+        <w:rPr>
+          <w:rFonts w:ascii="David" w:cs="David" w:eastAsia="David" w:hAnsi="David"/>
+          <w:sz w:val="24"/>
+          <w:szCs w:val="24"/>
+          <w:rtl/>
+        </w:rPr>
+        <w:t xml:space="preserve">ויסטריך הרחיב את הדיון מן השאלה הביוגרפית אל השאלה כיצד נבנה המיתוס. במאמרו על הרצל כ"יוצר מיתוסים" טען שהרצל היה מודע לחלוטין לכוחם של סיפורים וסמלים בפוליטיקה ההמונית, ושעיצוב סיפור הולדתו כציוני בטקס הורדת הדרגות היה מעשה מכוון של מנהיג הבונה את דמותו הציבורית, בדיוק כפי שבנה את טקסיות הקונגרסים ואת דמותו כ"מלך היהודים". ארנסט פאוול, בביוגרפיה הפסיכולוגית שלו, הגיע למסקנה דומה מכיוון אחר: הרצל האמין בסיפור שסיפר, מפני שהזיכרון מארגן את העבר לאור ההווה, והרצל של 1899 לא יכול היה עוד לזכור את הרצל של 1895 שלא ראה בפרשה דבר .</w:t>
+      </w:r>
+      <w:r>
+        <w:rPr>
+          <w:rStyle w:val="FootnoteReference"/>
+        </w:rPr>
+        <w:footnoteReference w:id="86"/>
       </w:r>
     </w:p>
     <w:p>
@@ -2299,7 +2613,7 @@
         <w:rPr>
           <w:rStyle w:val="FootnoteReference"/>
         </w:rPr>
-        <w:footnoteReference w:id="74"/>
+        <w:footnoteReference w:id="87"/>
       </w:r>
     </w:p>
     <w:p>
@@ -2315,13 +2629,35 @@
           <w:szCs w:val="24"/>
           <w:rtl/>
         </w:rPr>
+        <w:t xml:space="preserve">ההבחנה בין השלבים מתבהרת אם מיישמים על צרפת את מושג "הקוד התרבותי" של וולקוב, שהוצג בפרק הראשון. מינואר 1898 ואילך הפכה העמדה כלפי דרייפוס לסימן היכר של השקפת עולם שלמה: מי שהאמין בחפותו היה רפובליקני, חילוני ותומך בשלטון החוק; מי שהאמין באשמתו היה לאומני, קתולי ומעריץ של הצבא. השאלה העובדתית, מי כתב את ה"בורדרו", נעשתה משנית לעומת המשמעות הסמלית של התשובה, ולכן יכלו גם מי שהשתכנעו בחפותו, כמוראס, לדרוש להשאיר את פסק הדין על כנו למען כבוד הצבא. אך בשנים 1894-1896 טרם היה קוד כזה: המקרה היה משפט צבאי סגור, שעליו לא נחלקו המחנות. הרצל של 1895 לא יכול היה לראות בפרשה סמל, מפני שהיא עדיין לא הייתה סמל. הרצל של 1899 ראה בה סמל מפני שצרפת כולה כבר ראתה בה סמל .</w:t>
+      </w:r>
+      <w:r>
+        <w:rPr>
+          <w:rStyle w:val="FootnoteReference"/>
+        </w:rPr>
+        <w:footnoteReference w:id="88"/>
+      </w:r>
+    </w:p>
+    <w:p>
+      <w:pPr>
+        <w:bidi/>
+        <w:spacing w:after="120" w:line="360" w:lineRule="auto"/>
+        <w:jc w:val="right"/>
+      </w:pPr>
+      <w:r>
+        <w:rPr>
+          <w:rFonts w:ascii="David" w:cs="David" w:eastAsia="David" w:hAnsi="David"/>
+          <w:sz w:val="24"/>
+          <w:szCs w:val="24"/>
+          <w:rtl/>
+        </w:rPr>
         <w:t xml:space="preserve">להבחנה זו יש תוספת שהוויכוח הביוגרפי נוטה להזניח: ההבדל בין השפעת הפרשה על הרצל לבין השפעתה על התנועה הציונית. גם אם לא הפרשה עשתה את הרצל לציוני, היא תרמה להצלחת הציונות בשנים 1898-1904. היא סיפקה לתנועה את הטיעון הנוח ביותר במשא ומתן עם יהודי המערב ועם מדינאי אירופה; היא הביאה אליה אינטלקטואלים כלאזאר וכמקס נורדאו, שחוו את הפרשה בפריז מקרוב; והיא העניקה למנהיגה סיפור מוצא שהפך אותו מפיליטוניסט וינאי לנביא שראה בפריז את הכתובת על הקיר. המיתוס שיצר הרצל היה עצמו גורם היסטורי, ואת פועלו אין לבטל בביטול אמיתותו .</w:t>
       </w:r>
       <w:r>
         <w:rPr>
           <w:rStyle w:val="FootnoteReference"/>
         </w:rPr>
-        <w:footnoteReference w:id="75"/>
+        <w:footnoteReference w:id="89"/>
       </w:r>
     </w:p>
     <w:p>
@@ -2406,6 +2742,22 @@
           <w:rtl/>
         </w:rPr>
         <w:t xml:space="preserve">מסקנה זו מתיישבת עם הוויכוח ההיסטוריוגרפי שהוצג בפרק הראשון. גישתו של אנגל, הקוראת להסביר כל תופעה בהקשרה הקונקרטי, הוכיחה את ערכה: רק בחינה של מה שראה הרצל, מה שכתב ומתי כתב מאפשרת להבחין בין הפרשה כגורם לבין הפרשה כסיפור. אך גם הסתייגותה של השל נמצאה מועילה, שכן החוויה החושית של טקס ההשפלה, גם אם לא הולידה את הרעיון, סיפקה לו את הדימוי שבאמצעותו נחרת בזיכרון.</w:t>
+      </w:r>
+    </w:p>
+    <w:p>
+      <w:pPr>
+        <w:bidi/>
+        <w:spacing w:after="120" w:line="360" w:lineRule="auto"/>
+        <w:jc w:val="right"/>
+      </w:pPr>
+      <w:r>
+        <w:rPr>
+          <w:rFonts w:ascii="David" w:cs="David" w:eastAsia="David" w:hAnsi="David"/>
+          <w:sz w:val="24"/>
+          <w:szCs w:val="24"/>
+          <w:rtl/>
+        </w:rPr>
+        <w:t xml:space="preserve">לממצאים אלה יש גם השלכה על הדרך שבה ראוי ללמד ולספר את ראשית הציונות. הסיפור על הרצל בחצר בית הספר הצבאי הוא סיפור נוח: הוא ממקם את הולדת הציונות במקום אחד, ברגע אחד ובאדם אחד, ומעניק לה ציווי מוסרי אוניברסלי. התמונה המורכבת יותר, שבה הרעיון נולד מהצטברות של התנסויות וינאיות ופריזאיות ומקבל את סיפורו רק בדיעבד, נוחה פחות, אך היא קרובה יותר לאופן שבו נולדים רעיונות פוליטיים. היא גם מחזירה למרכז את מה שהמיתוס הסיט לשוליים: את וינה, את הפוליטיקה ההמונית ואת האנטישמיות של המחנה שניצח בבחירות, ולא רק את ההמון הצועק ברחוב.</w:t>
       </w:r>
     </w:p>
     <w:p>
@@ -7461,27 +7813,7 @@
           <w:szCs w:val="20"/>
           <w:rtl w:val="false"/>
         </w:rPr>
-        <w:t xml:space="preserve">Elon, </w:t>
-      </w:r>
-      <w:r>
-        <w:rPr>
-          <w:rFonts w:ascii="David" w:cs="David" w:eastAsia="David" w:hAnsi="David"/>
-          <w:i/>
-          <w:iCs/>
-          <w:sz w:val="20"/>
-          <w:szCs w:val="20"/>
-          <w:rtl w:val="false"/>
-        </w:rPr>
-        <w:t xml:space="preserve">Herzl</w:t>
-      </w:r>
-      <w:r>
-        <w:rPr>
-          <w:rFonts w:ascii="David" w:cs="David" w:eastAsia="David" w:hAnsi="David"/>
-          <w:sz w:val="20"/>
-          <w:szCs w:val="20"/>
-          <w:rtl w:val="false"/>
-        </w:rPr>
-        <w:t xml:space="preserve">, pp. 100-113; Penslar, </w:t>
+        <w:t xml:space="preserve">Kornberg, </w:t>
       </w:r>
       <w:r>
         <w:rPr>
@@ -7501,11 +7833,103 @@
           <w:szCs w:val="20"/>
           <w:rtl w:val="false"/>
         </w:rPr>
-        <w:t xml:space="preserve">, pp. 40-48.</w:t>
+        <w:t xml:space="preserve">, pp. 59-80; Schorske, </w:t>
+      </w:r>
+      <w:r>
+        <w:rPr>
+          <w:rFonts w:ascii="David" w:cs="David" w:eastAsia="David" w:hAnsi="David"/>
+          <w:i/>
+          <w:iCs/>
+          <w:sz w:val="20"/>
+          <w:szCs w:val="20"/>
+          <w:rtl w:val="false"/>
+        </w:rPr>
+        <w:t xml:space="preserve">Fin-de-siècle Vienna</w:t>
+      </w:r>
+      <w:r>
+        <w:rPr>
+          <w:rFonts w:ascii="David" w:cs="David" w:eastAsia="David" w:hAnsi="David"/>
+          <w:sz w:val="20"/>
+          <w:szCs w:val="20"/>
+          <w:rtl w:val="false"/>
+        </w:rPr>
+        <w:t xml:space="preserve">, pp. 153-160.</w:t>
       </w:r>
     </w:p>
   </w:footnote>
   <w:footnote w:id="45">
+    <w:p>
+      <w:pPr>
+        <w:bidi w:val="false"/>
+        <w:spacing w:after="40" w:line="240" w:lineRule="auto"/>
+        <w:jc w:val="left"/>
+      </w:pPr>
+      <w:r>
+        <w:rPr>
+          <w:rStyle w:val="FootnoteReference"/>
+        </w:rPr>
+        <w:footnoteRef/>
+      </w:r>
+      <w:r>
+        <w:rPr>
+          <w:rFonts w:ascii="David" w:cs="David" w:eastAsia="David" w:hAnsi="David"/>
+          <w:sz w:val="20"/>
+          <w:szCs w:val="20"/>
+        </w:rPr>
+        <w:t xml:space="preserve"> </w:t>
+      </w:r>
+      <w:r>
+        <w:rPr>
+          <w:rFonts w:ascii="David" w:cs="David" w:eastAsia="David" w:hAnsi="David"/>
+          <w:sz w:val="20"/>
+          <w:szCs w:val="20"/>
+          <w:rtl w:val="false"/>
+        </w:rPr>
+        <w:t xml:space="preserve">Elon, </w:t>
+      </w:r>
+      <w:r>
+        <w:rPr>
+          <w:rFonts w:ascii="David" w:cs="David" w:eastAsia="David" w:hAnsi="David"/>
+          <w:i/>
+          <w:iCs/>
+          <w:sz w:val="20"/>
+          <w:szCs w:val="20"/>
+          <w:rtl w:val="false"/>
+        </w:rPr>
+        <w:t xml:space="preserve">Herzl</w:t>
+      </w:r>
+      <w:r>
+        <w:rPr>
+          <w:rFonts w:ascii="David" w:cs="David" w:eastAsia="David" w:hAnsi="David"/>
+          <w:sz w:val="20"/>
+          <w:szCs w:val="20"/>
+          <w:rtl w:val="false"/>
+        </w:rPr>
+        <w:t xml:space="preserve">, pp. 100-113; Penslar, </w:t>
+      </w:r>
+      <w:r>
+        <w:rPr>
+          <w:rFonts w:ascii="David" w:cs="David" w:eastAsia="David" w:hAnsi="David"/>
+          <w:i/>
+          <w:iCs/>
+          <w:sz w:val="20"/>
+          <w:szCs w:val="20"/>
+          <w:rtl w:val="false"/>
+        </w:rPr>
+        <w:t xml:space="preserve">Theodor Herzl</w:t>
+      </w:r>
+      <w:r>
+        <w:rPr>
+          <w:rFonts w:ascii="David" w:cs="David" w:eastAsia="David" w:hAnsi="David"/>
+          <w:sz w:val="20"/>
+          <w:szCs w:val="20"/>
+          <w:rtl w:val="false"/>
+        </w:rPr>
+        <w:t xml:space="preserve">, pp. 40-48.</w:t>
+      </w:r>
+    </w:p>
+  </w:footnote>
+  <w:footnote w:id="46">
     <w:p>
       <w:pPr>
         <w:bidi w:val="false"/>
@@ -7579,7 +8003,7 @@
       </w:r>
     </w:p>
   </w:footnote>
-  <w:footnote w:id="46">
+  <w:footnote w:id="47">
     <w:p>
       <w:pPr>
         <w:bidi w:val="false"/>
@@ -7607,27 +8031,7 @@
           <w:szCs w:val="20"/>
           <w:rtl w:val="false"/>
         </w:rPr>
-        <w:t xml:space="preserve">Herzl, </w:t>
-      </w:r>
-      <w:r>
-        <w:rPr>
-          <w:rFonts w:ascii="David" w:cs="David" w:eastAsia="David" w:hAnsi="David"/>
-          <w:i/>
-          <w:iCs/>
-          <w:sz w:val="20"/>
-          <w:szCs w:val="20"/>
-          <w:rtl w:val="false"/>
-        </w:rPr>
-        <w:t xml:space="preserve">Complete Diaries</w:t>
-      </w:r>
-      <w:r>
-        <w:rPr>
-          <w:rFonts w:ascii="David" w:cs="David" w:eastAsia="David" w:hAnsi="David"/>
-          <w:sz w:val="20"/>
-          <w:szCs w:val="20"/>
-          <w:rtl w:val="false"/>
-        </w:rPr>
-        <w:t xml:space="preserve">, vol. 1, p. 22; Kornberg, </w:t>
+        <w:t xml:space="preserve">Kornberg, </w:t>
       </w:r>
       <w:r>
         <w:rPr>
@@ -7647,31 +8051,31 @@
           <w:szCs w:val="20"/>
           <w:rtl w:val="false"/>
         </w:rPr>
-        <w:t xml:space="preserve">, pp. 159-182; Theodor Herzl, </w:t>
-      </w:r>
-      <w:r>
-        <w:rPr>
-          <w:rFonts w:ascii="David" w:cs="David" w:eastAsia="David" w:hAnsi="David"/>
-          <w:i/>
-          <w:iCs/>
-          <w:sz w:val="20"/>
-          <w:szCs w:val="20"/>
-          <w:rtl w:val="false"/>
-        </w:rPr>
-        <w:t xml:space="preserve">The Jewish State</w:t>
-      </w:r>
-      <w:r>
-        <w:rPr>
-          <w:rFonts w:ascii="David" w:cs="David" w:eastAsia="David" w:hAnsi="David"/>
-          <w:sz w:val="20"/>
-          <w:szCs w:val="20"/>
-          <w:rtl w:val="false"/>
-        </w:rPr>
-        <w:t xml:space="preserve"> (New York: Dover, 1988; first published 1896), pp. 80-83.</w:t>
+        <w:t xml:space="preserve">, pp. 115-125; Pawel, </w:t>
+      </w:r>
+      <w:r>
+        <w:rPr>
+          <w:rFonts w:ascii="David" w:cs="David" w:eastAsia="David" w:hAnsi="David"/>
+          <w:i/>
+          <w:iCs/>
+          <w:sz w:val="20"/>
+          <w:szCs w:val="20"/>
+          <w:rtl w:val="false"/>
+        </w:rPr>
+        <w:t xml:space="preserve">The Labyrinth of Exile</w:t>
+      </w:r>
+      <w:r>
+        <w:rPr>
+          <w:rFonts w:ascii="David" w:cs="David" w:eastAsia="David" w:hAnsi="David"/>
+          <w:sz w:val="20"/>
+          <w:szCs w:val="20"/>
+          <w:rtl w:val="false"/>
+        </w:rPr>
+        <w:t xml:space="preserve">, pp. 160-175.</w:t>
       </w:r>
     </w:p>
   </w:footnote>
-  <w:footnote w:id="47">
+  <w:footnote w:id="48">
     <w:p>
       <w:pPr>
         <w:bidi w:val="false"/>
@@ -7699,6 +8103,98 @@
           <w:szCs w:val="20"/>
           <w:rtl w:val="false"/>
         </w:rPr>
+        <w:t xml:space="preserve">Herzl, </w:t>
+      </w:r>
+      <w:r>
+        <w:rPr>
+          <w:rFonts w:ascii="David" w:cs="David" w:eastAsia="David" w:hAnsi="David"/>
+          <w:i/>
+          <w:iCs/>
+          <w:sz w:val="20"/>
+          <w:szCs w:val="20"/>
+          <w:rtl w:val="false"/>
+        </w:rPr>
+        <w:t xml:space="preserve">Complete Diaries</w:t>
+      </w:r>
+      <w:r>
+        <w:rPr>
+          <w:rFonts w:ascii="David" w:cs="David" w:eastAsia="David" w:hAnsi="David"/>
+          <w:sz w:val="20"/>
+          <w:szCs w:val="20"/>
+          <w:rtl w:val="false"/>
+        </w:rPr>
+        <w:t xml:space="preserve">, vol. 1, p. 22; Kornberg, </w:t>
+      </w:r>
+      <w:r>
+        <w:rPr>
+          <w:rFonts w:ascii="David" w:cs="David" w:eastAsia="David" w:hAnsi="David"/>
+          <w:i/>
+          <w:iCs/>
+          <w:sz w:val="20"/>
+          <w:szCs w:val="20"/>
+          <w:rtl w:val="false"/>
+        </w:rPr>
+        <w:t xml:space="preserve">Theodor Herzl</w:t>
+      </w:r>
+      <w:r>
+        <w:rPr>
+          <w:rFonts w:ascii="David" w:cs="David" w:eastAsia="David" w:hAnsi="David"/>
+          <w:sz w:val="20"/>
+          <w:szCs w:val="20"/>
+          <w:rtl w:val="false"/>
+        </w:rPr>
+        <w:t xml:space="preserve">, pp. 159-182; Theodor Herzl, </w:t>
+      </w:r>
+      <w:r>
+        <w:rPr>
+          <w:rFonts w:ascii="David" w:cs="David" w:eastAsia="David" w:hAnsi="David"/>
+          <w:i/>
+          <w:iCs/>
+          <w:sz w:val="20"/>
+          <w:szCs w:val="20"/>
+          <w:rtl w:val="false"/>
+        </w:rPr>
+        <w:t xml:space="preserve">The Jewish State</w:t>
+      </w:r>
+      <w:r>
+        <w:rPr>
+          <w:rFonts w:ascii="David" w:cs="David" w:eastAsia="David" w:hAnsi="David"/>
+          <w:sz w:val="20"/>
+          <w:szCs w:val="20"/>
+          <w:rtl w:val="false"/>
+        </w:rPr>
+        <w:t xml:space="preserve"> (New York: Dover, 1988; first published 1896), pp. 80-83.</w:t>
+      </w:r>
+    </w:p>
+  </w:footnote>
+  <w:footnote w:id="49">
+    <w:p>
+      <w:pPr>
+        <w:bidi w:val="false"/>
+        <w:spacing w:after="40" w:line="240" w:lineRule="auto"/>
+        <w:jc w:val="left"/>
+      </w:pPr>
+      <w:r>
+        <w:rPr>
+          <w:rStyle w:val="FootnoteReference"/>
+        </w:rPr>
+        <w:footnoteRef/>
+      </w:r>
+      <w:r>
+        <w:rPr>
+          <w:rFonts w:ascii="David" w:cs="David" w:eastAsia="David" w:hAnsi="David"/>
+          <w:sz w:val="20"/>
+          <w:szCs w:val="20"/>
+        </w:rPr>
+        <w:t xml:space="preserve"> </w:t>
+      </w:r>
+      <w:r>
+        <w:rPr>
+          <w:rFonts w:ascii="David" w:cs="David" w:eastAsia="David" w:hAnsi="David"/>
+          <w:sz w:val="20"/>
+          <w:szCs w:val="20"/>
+          <w:rtl w:val="false"/>
+        </w:rPr>
         <w:t xml:space="preserve">Elon, </w:t>
       </w:r>
       <w:r>
@@ -7743,7 +8239,79 @@
       </w:r>
     </w:p>
   </w:footnote>
-  <w:footnote w:id="48">
+  <w:footnote w:id="50">
+    <w:p>
+      <w:pPr>
+        <w:bidi w:val="false"/>
+        <w:spacing w:after="40" w:line="240" w:lineRule="auto"/>
+        <w:jc w:val="left"/>
+      </w:pPr>
+      <w:r>
+        <w:rPr>
+          <w:rStyle w:val="FootnoteReference"/>
+        </w:rPr>
+        <w:footnoteRef/>
+      </w:r>
+      <w:r>
+        <w:rPr>
+          <w:rFonts w:ascii="David" w:cs="David" w:eastAsia="David" w:hAnsi="David"/>
+          <w:sz w:val="20"/>
+          <w:szCs w:val="20"/>
+        </w:rPr>
+        <w:t xml:space="preserve"> </w:t>
+      </w:r>
+      <w:r>
+        <w:rPr>
+          <w:rFonts w:ascii="David" w:cs="David" w:eastAsia="David" w:hAnsi="David"/>
+          <w:sz w:val="20"/>
+          <w:szCs w:val="20"/>
+          <w:rtl w:val="false"/>
+        </w:rPr>
+        <w:t xml:space="preserve">Elon, </w:t>
+      </w:r>
+      <w:r>
+        <w:rPr>
+          <w:rFonts w:ascii="David" w:cs="David" w:eastAsia="David" w:hAnsi="David"/>
+          <w:i/>
+          <w:iCs/>
+          <w:sz w:val="20"/>
+          <w:szCs w:val="20"/>
+          <w:rtl w:val="false"/>
+        </w:rPr>
+        <w:t xml:space="preserve">Herzl</w:t>
+      </w:r>
+      <w:r>
+        <w:rPr>
+          <w:rFonts w:ascii="David" w:cs="David" w:eastAsia="David" w:hAnsi="David"/>
+          <w:sz w:val="20"/>
+          <w:szCs w:val="20"/>
+          <w:rtl w:val="false"/>
+        </w:rPr>
+        <w:t xml:space="preserve">, pp. 68-86, 114-130; Penslar, </w:t>
+      </w:r>
+      <w:r>
+        <w:rPr>
+          <w:rFonts w:ascii="David" w:cs="David" w:eastAsia="David" w:hAnsi="David"/>
+          <w:i/>
+          <w:iCs/>
+          <w:sz w:val="20"/>
+          <w:szCs w:val="20"/>
+          <w:rtl w:val="false"/>
+        </w:rPr>
+        <w:t xml:space="preserve">Theodor Herzl</w:t>
+      </w:r>
+      <w:r>
+        <w:rPr>
+          <w:rFonts w:ascii="David" w:cs="David" w:eastAsia="David" w:hAnsi="David"/>
+          <w:sz w:val="20"/>
+          <w:szCs w:val="20"/>
+          <w:rtl w:val="false"/>
+        </w:rPr>
+        <w:t xml:space="preserve">, pp. 21-30, 49-56.</w:t>
+      </w:r>
+    </w:p>
+  </w:footnote>
+  <w:footnote w:id="51">
     <w:p>
       <w:pPr>
         <w:bidi w:val="false"/>
@@ -7817,7 +8385,7 @@
       </w:r>
     </w:p>
   </w:footnote>
-  <w:footnote w:id="49">
+  <w:footnote w:id="52">
     <w:p>
       <w:pPr>
         <w:bidi w:val="false"/>
@@ -7869,7 +8437,7 @@
       </w:r>
     </w:p>
   </w:footnote>
-  <w:footnote w:id="50">
+  <w:footnote w:id="53">
     <w:p>
       <w:pPr>
         <w:bidi/>
@@ -7945,7 +8513,7 @@
       </w:r>
     </w:p>
   </w:footnote>
-  <w:footnote w:id="51">
+  <w:footnote w:id="54">
     <w:p>
       <w:pPr>
         <w:bidi w:val="false"/>
@@ -7971,133 +8539,9 @@
           <w:rFonts w:ascii="David" w:cs="David" w:eastAsia="David" w:hAnsi="David"/>
           <w:sz w:val="20"/>
           <w:szCs w:val="20"/>
-          <w:rtl w:val="false"/>
-        </w:rPr>
-        <w:t xml:space="preserve">Herzl, </w:t>
-      </w:r>
-      <w:r>
-        <w:rPr>
-          <w:rFonts w:ascii="David" w:cs="David" w:eastAsia="David" w:hAnsi="David"/>
-          <w:i/>
-          <w:iCs/>
-          <w:sz w:val="20"/>
-          <w:szCs w:val="20"/>
-          <w:rtl w:val="false"/>
-        </w:rPr>
-        <w:t xml:space="preserve">Complete Diaries</w:t>
-      </w:r>
-      <w:r>
-        <w:rPr>
-          <w:rFonts w:ascii="David" w:cs="David" w:eastAsia="David" w:hAnsi="David"/>
-          <w:sz w:val="20"/>
-          <w:szCs w:val="20"/>
-          <w:rtl w:val="false"/>
-        </w:rPr>
-        <w:t xml:space="preserve">, vol. 1, pp. 13-130; Pawel, </w:t>
-      </w:r>
-      <w:r>
-        <w:rPr>
-          <w:rFonts w:ascii="David" w:cs="David" w:eastAsia="David" w:hAnsi="David"/>
-          <w:i/>
-          <w:iCs/>
-          <w:sz w:val="20"/>
-          <w:szCs w:val="20"/>
-          <w:rtl w:val="false"/>
-        </w:rPr>
-        <w:t xml:space="preserve">The Labyrinth of Exile</w:t>
-      </w:r>
-      <w:r>
-        <w:rPr>
-          <w:rFonts w:ascii="David" w:cs="David" w:eastAsia="David" w:hAnsi="David"/>
-          <w:sz w:val="20"/>
-          <w:szCs w:val="20"/>
-          <w:rtl w:val="false"/>
-        </w:rPr>
-        <w:t xml:space="preserve">, pp. 218-240.</w:t>
-      </w:r>
-    </w:p>
-  </w:footnote>
-  <w:footnote w:id="52">
-    <w:p>
-      <w:pPr>
-        <w:bidi w:val="false"/>
-        <w:spacing w:after="40" w:line="240" w:lineRule="auto"/>
-        <w:jc w:val="left"/>
-      </w:pPr>
-      <w:r>
-        <w:rPr>
-          <w:rStyle w:val="FootnoteReference"/>
-        </w:rPr>
-        <w:footnoteRef/>
-      </w:r>
-      <w:r>
-        <w:rPr>
-          <w:rFonts w:ascii="David" w:cs="David" w:eastAsia="David" w:hAnsi="David"/>
-          <w:sz w:val="20"/>
-          <w:szCs w:val="20"/>
-        </w:rPr>
-        <w:t xml:space="preserve"> </w:t>
-      </w:r>
-      <w:r>
-        <w:rPr>
-          <w:rFonts w:ascii="David" w:cs="David" w:eastAsia="David" w:hAnsi="David"/>
-          <w:sz w:val="20"/>
-          <w:szCs w:val="20"/>
-          <w:rtl w:val="false"/>
-        </w:rPr>
-        <w:t xml:space="preserve">Kornberg, "A Reevaluation," pp. 226-252; Kornberg, </w:t>
-      </w:r>
-      <w:r>
-        <w:rPr>
-          <w:rFonts w:ascii="David" w:cs="David" w:eastAsia="David" w:hAnsi="David"/>
-          <w:i/>
-          <w:iCs/>
-          <w:sz w:val="20"/>
-          <w:szCs w:val="20"/>
-          <w:rtl w:val="false"/>
-        </w:rPr>
-        <w:t xml:space="preserve">Theodor Herzl</w:t>
-      </w:r>
-      <w:r>
-        <w:rPr>
-          <w:rFonts w:ascii="David" w:cs="David" w:eastAsia="David" w:hAnsi="David"/>
-          <w:sz w:val="20"/>
-          <w:szCs w:val="20"/>
-          <w:rtl w:val="false"/>
-        </w:rPr>
-        <w:t xml:space="preserve">, pp. 183-202.</w:t>
-      </w:r>
-    </w:p>
-  </w:footnote>
-  <w:footnote w:id="53">
-    <w:p>
-      <w:pPr>
-        <w:bidi/>
-        <w:spacing w:after="40" w:line="240" w:lineRule="auto"/>
-        <w:jc w:val="both"/>
-      </w:pPr>
-      <w:r>
-        <w:rPr>
-          <w:rStyle w:val="FootnoteReference"/>
-        </w:rPr>
-        <w:footnoteRef/>
-      </w:r>
-      <w:r>
-        <w:rPr>
-          <w:rFonts w:ascii="David" w:cs="David" w:eastAsia="David" w:hAnsi="David"/>
-          <w:sz w:val="20"/>
-          <w:szCs w:val="20"/>
-        </w:rPr>
-        <w:t xml:space="preserve"> </w:t>
-      </w:r>
-      <w:r>
-        <w:rPr>
-          <w:rFonts w:ascii="David" w:cs="David" w:eastAsia="David" w:hAnsi="David"/>
-          <w:sz w:val="20"/>
-          <w:szCs w:val="20"/>
-          <w:rtl/>
-        </w:rPr>
-        <w:t xml:space="preserve">אבינרי, </w:t>
+          <w:rtl/>
+        </w:rPr>
+        <w:t xml:space="preserve">הרצל, </w:t>
       </w:r>
       <w:r>
         <w:rPr>
@@ -8110,20 +8554,60 @@
           <w:szCs w:val="20"/>
           <w:rtl/>
         </w:rPr>
-        <w:t xml:space="preserve">הרצל</w:t>
-      </w:r>
-      <w:r>
-        <w:rPr>
-          <w:rFonts w:ascii="David" w:cs="David" w:eastAsia="David" w:hAnsi="David"/>
-          <w:sz w:val="20"/>
-          <w:szCs w:val="20"/>
-          <w:rtl/>
-        </w:rPr>
-        <w:t xml:space="preserve">, עמ' 84-108.</w:t>
+        <w:t xml:space="preserve">עניין היהודים</w:t>
+      </w:r>
+      <w:r>
+        <w:rPr>
+          <w:rFonts w:ascii="David" w:cs="David" w:eastAsia="David" w:hAnsi="David"/>
+          <w:sz w:val="20"/>
+          <w:szCs w:val="20"/>
+          <w:rtl/>
+        </w:rPr>
+        <w:t xml:space="preserve">, כרך א, רשימות מיוני 1895; Herzl, </w:t>
+      </w:r>
+      <w:r>
+        <w:rPr>
+          <w:rFonts w:ascii="David" w:cs="David" w:eastAsia="David" w:hAnsi="David"/>
+          <w:i/>
+          <w:iCs/>
+          <w:sz w:val="20"/>
+          <w:szCs w:val="20"/>
+          <w:rtl w:val="false"/>
+        </w:rPr>
+        <w:t xml:space="preserve">Complete Diaries</w:t>
+      </w:r>
+      <w:r>
+        <w:rPr>
+          <w:rFonts w:ascii="David" w:cs="David" w:eastAsia="David" w:hAnsi="David"/>
+          <w:sz w:val="20"/>
+          <w:szCs w:val="20"/>
+          <w:rtl w:val="false"/>
+        </w:rPr>
+        <w:t xml:space="preserve">, vol. 1, pp. 6-10; Wistrich, </w:t>
+      </w:r>
+      <w:r>
+        <w:rPr>
+          <w:rFonts w:ascii="David" w:cs="David" w:eastAsia="David" w:hAnsi="David"/>
+          <w:i/>
+          <w:iCs/>
+          <w:sz w:val="20"/>
+          <w:szCs w:val="20"/>
+          <w:rtl w:val="false"/>
+        </w:rPr>
+        <w:t xml:space="preserve">The Jews of Vienna</w:t>
+      </w:r>
+      <w:r>
+        <w:rPr>
+          <w:rFonts w:ascii="David" w:cs="David" w:eastAsia="David" w:hAnsi="David"/>
+          <w:sz w:val="20"/>
+          <w:szCs w:val="20"/>
+          <w:rtl w:val="false"/>
+        </w:rPr>
+        <w:t xml:space="preserve">, pp. 421-440.</w:t>
       </w:r>
     </w:p>
   </w:footnote>
-  <w:footnote w:id="54">
+  <w:footnote w:id="55">
     <w:p>
       <w:pPr>
         <w:bidi w:val="false"/>
@@ -8151,88 +8635,56 @@
           <w:szCs w:val="20"/>
           <w:rtl w:val="false"/>
         </w:rPr>
-        <w:t xml:space="preserve">Schorske, </w:t>
-      </w:r>
-      <w:r>
-        <w:rPr>
-          <w:rFonts w:ascii="David" w:cs="David" w:eastAsia="David" w:hAnsi="David"/>
-          <w:i/>
-          <w:iCs/>
-          <w:sz w:val="20"/>
-          <w:szCs w:val="20"/>
-          <w:rtl w:val="false"/>
-        </w:rPr>
-        <w:t xml:space="preserve">Fin-de-siècle Vienna</w:t>
-      </w:r>
-      <w:r>
-        <w:rPr>
-          <w:rFonts w:ascii="David" w:cs="David" w:eastAsia="David" w:hAnsi="David"/>
-          <w:sz w:val="20"/>
-          <w:szCs w:val="20"/>
-          <w:rtl w:val="false"/>
-        </w:rPr>
-        <w:t xml:space="preserve">, pp. 146-175.</w:t>
-      </w:r>
-    </w:p>
-  </w:footnote>
-  <w:footnote w:id="55">
-    <w:p>
-      <w:pPr>
-        <w:bidi w:val="false"/>
-        <w:spacing w:after="40" w:line="240" w:lineRule="auto"/>
-        <w:jc w:val="left"/>
-      </w:pPr>
-      <w:r>
-        <w:rPr>
-          <w:rStyle w:val="FootnoteReference"/>
-        </w:rPr>
-        <w:footnoteRef/>
-      </w:r>
-      <w:r>
-        <w:rPr>
-          <w:rFonts w:ascii="David" w:cs="David" w:eastAsia="David" w:hAnsi="David"/>
-          <w:sz w:val="20"/>
-          <w:szCs w:val="20"/>
-        </w:rPr>
-        <w:t xml:space="preserve"> </w:t>
-      </w:r>
-      <w:r>
-        <w:rPr>
-          <w:rFonts w:ascii="David" w:cs="David" w:eastAsia="David" w:hAnsi="David"/>
-          <w:sz w:val="20"/>
-          <w:szCs w:val="20"/>
-          <w:rtl w:val="false"/>
-        </w:rPr>
-        <w:t xml:space="preserve">Robert S. Wistrich, "Theodor Herzl: Zionist Icon, Myth-Maker, and Social Utopian," </w:t>
-      </w:r>
-      <w:r>
-        <w:rPr>
-          <w:rFonts w:ascii="David" w:cs="David" w:eastAsia="David" w:hAnsi="David"/>
-          <w:i/>
-          <w:iCs/>
-          <w:sz w:val="20"/>
-          <w:szCs w:val="20"/>
-          <w:rtl w:val="false"/>
-        </w:rPr>
-        <w:t xml:space="preserve">Israel Affairs</w:t>
-      </w:r>
-      <w:r>
-        <w:rPr>
-          <w:rFonts w:ascii="David" w:cs="David" w:eastAsia="David" w:hAnsi="David"/>
-          <w:sz w:val="20"/>
-          <w:szCs w:val="20"/>
-          <w:rtl w:val="false"/>
-        </w:rPr>
-        <w:t xml:space="preserve"> 1:3 (1995), pp. 1-37.</w:t>
+        <w:t xml:space="preserve">Herzl, </w:t>
+      </w:r>
+      <w:r>
+        <w:rPr>
+          <w:rFonts w:ascii="David" w:cs="David" w:eastAsia="David" w:hAnsi="David"/>
+          <w:i/>
+          <w:iCs/>
+          <w:sz w:val="20"/>
+          <w:szCs w:val="20"/>
+          <w:rtl w:val="false"/>
+        </w:rPr>
+        <w:t xml:space="preserve">Complete Diaries</w:t>
+      </w:r>
+      <w:r>
+        <w:rPr>
+          <w:rFonts w:ascii="David" w:cs="David" w:eastAsia="David" w:hAnsi="David"/>
+          <w:sz w:val="20"/>
+          <w:szCs w:val="20"/>
+          <w:rtl w:val="false"/>
+        </w:rPr>
+        <w:t xml:space="preserve">, vol. 1, pp. 13-130; Pawel, </w:t>
+      </w:r>
+      <w:r>
+        <w:rPr>
+          <w:rFonts w:ascii="David" w:cs="David" w:eastAsia="David" w:hAnsi="David"/>
+          <w:i/>
+          <w:iCs/>
+          <w:sz w:val="20"/>
+          <w:szCs w:val="20"/>
+          <w:rtl w:val="false"/>
+        </w:rPr>
+        <w:t xml:space="preserve">The Labyrinth of Exile</w:t>
+      </w:r>
+      <w:r>
+        <w:rPr>
+          <w:rFonts w:ascii="David" w:cs="David" w:eastAsia="David" w:hAnsi="David"/>
+          <w:sz w:val="20"/>
+          <w:szCs w:val="20"/>
+          <w:rtl w:val="false"/>
+        </w:rPr>
+        <w:t xml:space="preserve">, pp. 218-240.</w:t>
       </w:r>
     </w:p>
   </w:footnote>
   <w:footnote w:id="56">
     <w:p>
       <w:pPr>
-        <w:bidi w:val="false"/>
+        <w:bidi/>
         <w:spacing w:after="40" w:line="240" w:lineRule="auto"/>
-        <w:jc w:val="left"/>
+        <w:jc w:val="both"/>
       </w:pPr>
       <w:r>
         <w:rPr>
@@ -8253,18 +8705,18 @@
           <w:rFonts w:ascii="David" w:cs="David" w:eastAsia="David" w:hAnsi="David"/>
           <w:sz w:val="20"/>
           <w:szCs w:val="20"/>
-          <w:rtl w:val="false"/>
-        </w:rPr>
-        <w:t xml:space="preserve">Beller, </w:t>
-      </w:r>
-      <w:r>
-        <w:rPr>
-          <w:rFonts w:ascii="David" w:cs="David" w:eastAsia="David" w:hAnsi="David"/>
-          <w:i/>
-          <w:iCs/>
-          <w:sz w:val="20"/>
-          <w:szCs w:val="20"/>
-          <w:rtl w:val="false"/>
+          <w:rtl/>
+        </w:rPr>
+        <w:t xml:space="preserve">Elon, </w:t>
+      </w:r>
+      <w:r>
+        <w:rPr>
+          <w:rFonts w:ascii="David" w:cs="David" w:eastAsia="David" w:hAnsi="David"/>
+          <w:i/>
+          <w:iCs/>
+          <w:sz w:val="20"/>
+          <w:szCs w:val="20"/>
+          <w:rtl/>
         </w:rPr>
         <w:t xml:space="preserve">Herzl</w:t>
       </w:r>
@@ -8273,41 +8725,9 @@
           <w:rFonts w:ascii="David" w:cs="David" w:eastAsia="David" w:hAnsi="David"/>
           <w:sz w:val="20"/>
           <w:szCs w:val="20"/>
-          <w:rtl w:val="false"/>
-        </w:rPr>
-        <w:t xml:space="preserve">, pp. 20-45.</w:t>
-      </w:r>
-    </w:p>
-  </w:footnote>
-  <w:footnote w:id="57">
-    <w:p>
-      <w:pPr>
-        <w:bidi w:val="false"/>
-        <w:spacing w:after="40" w:line="240" w:lineRule="auto"/>
-        <w:jc w:val="left"/>
-      </w:pPr>
-      <w:r>
-        <w:rPr>
-          <w:rStyle w:val="FootnoteReference"/>
-        </w:rPr>
-        <w:footnoteRef/>
-      </w:r>
-      <w:r>
-        <w:rPr>
-          <w:rFonts w:ascii="David" w:cs="David" w:eastAsia="David" w:hAnsi="David"/>
-          <w:sz w:val="20"/>
-          <w:szCs w:val="20"/>
-        </w:rPr>
-        <w:t xml:space="preserve"> </w:t>
-      </w:r>
-      <w:r>
-        <w:rPr>
-          <w:rFonts w:ascii="David" w:cs="David" w:eastAsia="David" w:hAnsi="David"/>
-          <w:sz w:val="20"/>
-          <w:szCs w:val="20"/>
-          <w:rtl/>
-        </w:rPr>
-        <w:t xml:space="preserve">אבינרי, </w:t>
+          <w:rtl/>
+        </w:rPr>
+        <w:t xml:space="preserve">, pp. 149-160; דוד ויטל, </w:t>
       </w:r>
       <w:r>
         <w:rPr>
@@ -8320,45 +8740,25 @@
           <w:szCs w:val="20"/>
           <w:rtl/>
         </w:rPr>
-        <w:t xml:space="preserve">הרצל</w:t>
-      </w:r>
-      <w:r>
-        <w:rPr>
-          <w:rFonts w:ascii="David" w:cs="David" w:eastAsia="David" w:hAnsi="David"/>
-          <w:sz w:val="20"/>
-          <w:szCs w:val="20"/>
-          <w:rtl/>
-        </w:rPr>
-        <w:t xml:space="preserve">, עמ' 93-108; Kornberg, </w:t>
-      </w:r>
-      <w:r>
-        <w:rPr>
-          <w:rFonts w:ascii="David" w:cs="David" w:eastAsia="David" w:hAnsi="David"/>
-          <w:i/>
-          <w:iCs/>
-          <w:sz w:val="20"/>
-          <w:szCs w:val="20"/>
-          <w:rtl w:val="false"/>
-        </w:rPr>
-        <w:t xml:space="preserve">Theodor Herzl</w:t>
-      </w:r>
-      <w:r>
-        <w:rPr>
-          <w:rFonts w:ascii="David" w:cs="David" w:eastAsia="David" w:hAnsi="David"/>
-          <w:sz w:val="20"/>
-          <w:szCs w:val="20"/>
-          <w:rtl w:val="false"/>
-        </w:rPr>
-        <w:t xml:space="preserve">, pp. 159-202.</w:t>
+        <w:t xml:space="preserve">המהפכה הציונית: ראשית התנועה</w:t>
+      </w:r>
+      <w:r>
+        <w:rPr>
+          <w:rFonts w:ascii="David" w:cs="David" w:eastAsia="David" w:hAnsi="David"/>
+          <w:sz w:val="20"/>
+          <w:szCs w:val="20"/>
+          <w:rtl/>
+        </w:rPr>
+        <w:t xml:space="preserve"> (תל אביב: עם עובד, 1978), עמ' 263-290.</w:t>
       </w:r>
     </w:p>
   </w:footnote>
-  <w:footnote w:id="58">
-    <w:p>
-      <w:pPr>
-        <w:bidi w:val="false"/>
+  <w:footnote w:id="57">
+    <w:p>
+      <w:pPr>
+        <w:bidi/>
         <w:spacing w:after="40" w:line="240" w:lineRule="auto"/>
-        <w:jc w:val="left"/>
+        <w:jc w:val="both"/>
       </w:pPr>
       <w:r>
         <w:rPr>
@@ -8379,337 +8779,9 @@
           <w:rFonts w:ascii="David" w:cs="David" w:eastAsia="David" w:hAnsi="David"/>
           <w:sz w:val="20"/>
           <w:szCs w:val="20"/>
-          <w:rtl w:val="false"/>
-        </w:rPr>
-        <w:t xml:space="preserve">Jean-Denis Bredin, </w:t>
-      </w:r>
-      <w:r>
-        <w:rPr>
-          <w:rFonts w:ascii="David" w:cs="David" w:eastAsia="David" w:hAnsi="David"/>
-          <w:i/>
-          <w:iCs/>
-          <w:sz w:val="20"/>
-          <w:szCs w:val="20"/>
-          <w:rtl w:val="false"/>
-        </w:rPr>
-        <w:t xml:space="preserve">The Affair: The Case of Alfred Dreyfus</w:t>
-      </w:r>
-      <w:r>
-        <w:rPr>
-          <w:rFonts w:ascii="David" w:cs="David" w:eastAsia="David" w:hAnsi="David"/>
-          <w:sz w:val="20"/>
-          <w:szCs w:val="20"/>
-          <w:rtl w:val="false"/>
-        </w:rPr>
-        <w:t xml:space="preserve">, trans. Jeffrey Mehlman (New York: George Braziller, 1986), pp. 59-95; Hyman, </w:t>
-      </w:r>
-      <w:r>
-        <w:rPr>
-          <w:rFonts w:ascii="David" w:cs="David" w:eastAsia="David" w:hAnsi="David"/>
-          <w:i/>
-          <w:iCs/>
-          <w:sz w:val="20"/>
-          <w:szCs w:val="20"/>
-          <w:rtl w:val="false"/>
-        </w:rPr>
-        <w:t xml:space="preserve">The Jews of Modern France</w:t>
-      </w:r>
-      <w:r>
-        <w:rPr>
-          <w:rFonts w:ascii="David" w:cs="David" w:eastAsia="David" w:hAnsi="David"/>
-          <w:sz w:val="20"/>
-          <w:szCs w:val="20"/>
-          <w:rtl w:val="false"/>
-        </w:rPr>
-        <w:t xml:space="preserve">, pp. 99-102.</w:t>
-      </w:r>
-    </w:p>
-  </w:footnote>
-  <w:footnote w:id="59">
-    <w:p>
-      <w:pPr>
-        <w:bidi w:val="false"/>
-        <w:spacing w:after="40" w:line="240" w:lineRule="auto"/>
-        <w:jc w:val="left"/>
-      </w:pPr>
-      <w:r>
-        <w:rPr>
-          <w:rStyle w:val="FootnoteReference"/>
-        </w:rPr>
-        <w:footnoteRef/>
-      </w:r>
-      <w:r>
-        <w:rPr>
-          <w:rFonts w:ascii="David" w:cs="David" w:eastAsia="David" w:hAnsi="David"/>
-          <w:sz w:val="20"/>
-          <w:szCs w:val="20"/>
-        </w:rPr>
-        <w:t xml:space="preserve"> </w:t>
-      </w:r>
-      <w:r>
-        <w:rPr>
-          <w:rFonts w:ascii="David" w:cs="David" w:eastAsia="David" w:hAnsi="David"/>
-          <w:sz w:val="20"/>
-          <w:szCs w:val="20"/>
-          <w:rtl w:val="false"/>
-        </w:rPr>
-        <w:t xml:space="preserve">Bredin, </w:t>
-      </w:r>
-      <w:r>
-        <w:rPr>
-          <w:rFonts w:ascii="David" w:cs="David" w:eastAsia="David" w:hAnsi="David"/>
-          <w:i/>
-          <w:iCs/>
-          <w:sz w:val="20"/>
-          <w:szCs w:val="20"/>
-          <w:rtl w:val="false"/>
-        </w:rPr>
-        <w:t xml:space="preserve">The Affair</w:t>
-      </w:r>
-      <w:r>
-        <w:rPr>
-          <w:rFonts w:ascii="David" w:cs="David" w:eastAsia="David" w:hAnsi="David"/>
-          <w:sz w:val="20"/>
-          <w:szCs w:val="20"/>
-          <w:rtl w:val="false"/>
-        </w:rPr>
-        <w:t xml:space="preserve">, pp. 96-128; Ruth Harris, </w:t>
-      </w:r>
-      <w:r>
-        <w:rPr>
-          <w:rFonts w:ascii="David" w:cs="David" w:eastAsia="David" w:hAnsi="David"/>
-          <w:i/>
-          <w:iCs/>
-          <w:sz w:val="20"/>
-          <w:szCs w:val="20"/>
-          <w:rtl w:val="false"/>
-        </w:rPr>
-        <w:t xml:space="preserve">Dreyfus: Politics, Emotion, and the Scandal of the Century</w:t>
-      </w:r>
-      <w:r>
-        <w:rPr>
-          <w:rFonts w:ascii="David" w:cs="David" w:eastAsia="David" w:hAnsi="David"/>
-          <w:sz w:val="20"/>
-          <w:szCs w:val="20"/>
-          <w:rtl w:val="false"/>
-        </w:rPr>
-        <w:t xml:space="preserve"> (New York: Metropolitan Books, 2010), pp. 20-43.</w:t>
-      </w:r>
-    </w:p>
-  </w:footnote>
-  <w:footnote w:id="60">
-    <w:p>
-      <w:pPr>
-        <w:bidi w:val="false"/>
-        <w:spacing w:after="40" w:line="240" w:lineRule="auto"/>
-        <w:jc w:val="left"/>
-      </w:pPr>
-      <w:r>
-        <w:rPr>
-          <w:rStyle w:val="FootnoteReference"/>
-        </w:rPr>
-        <w:footnoteRef/>
-      </w:r>
-      <w:r>
-        <w:rPr>
-          <w:rFonts w:ascii="David" w:cs="David" w:eastAsia="David" w:hAnsi="David"/>
-          <w:sz w:val="20"/>
-          <w:szCs w:val="20"/>
-        </w:rPr>
-        <w:t xml:space="preserve"> </w:t>
-      </w:r>
-      <w:r>
-        <w:rPr>
-          <w:rFonts w:ascii="David" w:cs="David" w:eastAsia="David" w:hAnsi="David"/>
-          <w:sz w:val="20"/>
-          <w:szCs w:val="20"/>
-          <w:rtl w:val="false"/>
-        </w:rPr>
-        <w:t xml:space="preserve">Bernard Lazare, </w:t>
-      </w:r>
-      <w:r>
-        <w:rPr>
-          <w:rFonts w:ascii="David" w:cs="David" w:eastAsia="David" w:hAnsi="David"/>
-          <w:i/>
-          <w:iCs/>
-          <w:sz w:val="20"/>
-          <w:szCs w:val="20"/>
-          <w:rtl w:val="false"/>
-        </w:rPr>
-        <w:t xml:space="preserve">Une erreur judiciaire: La vérité sur l'affaire Dreyfus</w:t>
-      </w:r>
-      <w:r>
-        <w:rPr>
-          <w:rFonts w:ascii="David" w:cs="David" w:eastAsia="David" w:hAnsi="David"/>
-          <w:sz w:val="20"/>
-          <w:szCs w:val="20"/>
-          <w:rtl w:val="false"/>
-        </w:rPr>
-        <w:t xml:space="preserve"> (Brussels: Veuve Monnom, 1896); Hyman, </w:t>
-      </w:r>
-      <w:r>
-        <w:rPr>
-          <w:rFonts w:ascii="David" w:cs="David" w:eastAsia="David" w:hAnsi="David"/>
-          <w:i/>
-          <w:iCs/>
-          <w:sz w:val="20"/>
-          <w:szCs w:val="20"/>
-          <w:rtl w:val="false"/>
-        </w:rPr>
-        <w:t xml:space="preserve">The Jews of Modern France</w:t>
-      </w:r>
-      <w:r>
-        <w:rPr>
-          <w:rFonts w:ascii="David" w:cs="David" w:eastAsia="David" w:hAnsi="David"/>
-          <w:sz w:val="20"/>
-          <w:szCs w:val="20"/>
-          <w:rtl w:val="false"/>
-        </w:rPr>
-        <w:t xml:space="preserve">, pp. 102-104; Bredin, </w:t>
-      </w:r>
-      <w:r>
-        <w:rPr>
-          <w:rFonts w:ascii="David" w:cs="David" w:eastAsia="David" w:hAnsi="David"/>
-          <w:i/>
-          <w:iCs/>
-          <w:sz w:val="20"/>
-          <w:szCs w:val="20"/>
-          <w:rtl w:val="false"/>
-        </w:rPr>
-        <w:t xml:space="preserve">The Affair</w:t>
-      </w:r>
-      <w:r>
-        <w:rPr>
-          <w:rFonts w:ascii="David" w:cs="David" w:eastAsia="David" w:hAnsi="David"/>
-          <w:sz w:val="20"/>
-          <w:szCs w:val="20"/>
-          <w:rtl w:val="false"/>
-        </w:rPr>
-        <w:t xml:space="preserve">, pp. 129-247.</w:t>
-      </w:r>
-    </w:p>
-  </w:footnote>
-  <w:footnote w:id="61">
-    <w:p>
-      <w:pPr>
-        <w:bidi w:val="false"/>
-        <w:spacing w:after="40" w:line="240" w:lineRule="auto"/>
-        <w:jc w:val="left"/>
-      </w:pPr>
-      <w:r>
-        <w:rPr>
-          <w:rStyle w:val="FootnoteReference"/>
-        </w:rPr>
-        <w:footnoteRef/>
-      </w:r>
-      <w:r>
-        <w:rPr>
-          <w:rFonts w:ascii="David" w:cs="David" w:eastAsia="David" w:hAnsi="David"/>
-          <w:sz w:val="20"/>
-          <w:szCs w:val="20"/>
-        </w:rPr>
-        <w:t xml:space="preserve"> </w:t>
-      </w:r>
-      <w:r>
-        <w:rPr>
-          <w:rFonts w:ascii="David" w:cs="David" w:eastAsia="David" w:hAnsi="David"/>
-          <w:sz w:val="20"/>
-          <w:szCs w:val="20"/>
-          <w:rtl w:val="false"/>
-        </w:rPr>
-        <w:t xml:space="preserve">Émile Zola, "J'accuse...! Lettre au Président de la République," </w:t>
-      </w:r>
-      <w:r>
-        <w:rPr>
-          <w:rFonts w:ascii="David" w:cs="David" w:eastAsia="David" w:hAnsi="David"/>
-          <w:i/>
-          <w:iCs/>
-          <w:sz w:val="20"/>
-          <w:szCs w:val="20"/>
-          <w:rtl w:val="false"/>
-        </w:rPr>
-        <w:t xml:space="preserve">L'Aurore</w:t>
-      </w:r>
-      <w:r>
-        <w:rPr>
-          <w:rFonts w:ascii="David" w:cs="David" w:eastAsia="David" w:hAnsi="David"/>
-          <w:sz w:val="20"/>
-          <w:szCs w:val="20"/>
-          <w:rtl w:val="false"/>
-        </w:rPr>
-        <w:t xml:space="preserve">, 13 January 1898; Wilson, </w:t>
-      </w:r>
-      <w:r>
-        <w:rPr>
-          <w:rFonts w:ascii="David" w:cs="David" w:eastAsia="David" w:hAnsi="David"/>
-          <w:i/>
-          <w:iCs/>
-          <w:sz w:val="20"/>
-          <w:szCs w:val="20"/>
-          <w:rtl w:val="false"/>
-        </w:rPr>
-        <w:t xml:space="preserve">Ideology and Experience</w:t>
-      </w:r>
-      <w:r>
-        <w:rPr>
-          <w:rFonts w:ascii="David" w:cs="David" w:eastAsia="David" w:hAnsi="David"/>
-          <w:sz w:val="20"/>
-          <w:szCs w:val="20"/>
-          <w:rtl w:val="false"/>
-        </w:rPr>
-        <w:t xml:space="preserve">, pp. 106-124; Harris, </w:t>
-      </w:r>
-      <w:r>
-        <w:rPr>
-          <w:rFonts w:ascii="David" w:cs="David" w:eastAsia="David" w:hAnsi="David"/>
-          <w:i/>
-          <w:iCs/>
-          <w:sz w:val="20"/>
-          <w:szCs w:val="20"/>
-          <w:rtl w:val="false"/>
-        </w:rPr>
-        <w:t xml:space="preserve">Dreyfus</w:t>
-      </w:r>
-      <w:r>
-        <w:rPr>
-          <w:rFonts w:ascii="David" w:cs="David" w:eastAsia="David" w:hAnsi="David"/>
-          <w:sz w:val="20"/>
-          <w:szCs w:val="20"/>
-          <w:rtl w:val="false"/>
-        </w:rPr>
-        <w:t xml:space="preserve">, pp. 104-160.</w:t>
-      </w:r>
-    </w:p>
-  </w:footnote>
-  <w:footnote w:id="62">
-    <w:p>
-      <w:pPr>
-        <w:bidi w:val="false"/>
-        <w:spacing w:after="40" w:line="240" w:lineRule="auto"/>
-        <w:jc w:val="left"/>
-      </w:pPr>
-      <w:r>
-        <w:rPr>
-          <w:rStyle w:val="FootnoteReference"/>
-        </w:rPr>
-        <w:footnoteRef/>
-      </w:r>
-      <w:r>
-        <w:rPr>
-          <w:rFonts w:ascii="David" w:cs="David" w:eastAsia="David" w:hAnsi="David"/>
-          <w:sz w:val="20"/>
-          <w:szCs w:val="20"/>
-        </w:rPr>
-        <w:t xml:space="preserve"> </w:t>
-      </w:r>
-      <w:r>
-        <w:rPr>
-          <w:rFonts w:ascii="David" w:cs="David" w:eastAsia="David" w:hAnsi="David"/>
-          <w:sz w:val="20"/>
-          <w:szCs w:val="20"/>
-          <w:rtl/>
-        </w:rPr>
-        <w:t xml:space="preserve">מירון, </w:t>
+          <w:rtl/>
+        </w:rPr>
+        <w:t xml:space="preserve">הרצל, </w:t>
       </w:r>
       <w:r>
         <w:rPr>
@@ -8722,88 +8794,16 @@
           <w:szCs w:val="20"/>
           <w:rtl/>
         </w:rPr>
-        <w:t xml:space="preserve">מדריך למידה</w:t>
-      </w:r>
-      <w:r>
-        <w:rPr>
-          <w:rFonts w:ascii="David" w:cs="David" w:eastAsia="David" w:hAnsi="David"/>
-          <w:sz w:val="20"/>
-          <w:szCs w:val="20"/>
-          <w:rtl/>
-        </w:rPr>
-        <w:t xml:space="preserve">, עמ' 63; Bredin, </w:t>
-      </w:r>
-      <w:r>
-        <w:rPr>
-          <w:rFonts w:ascii="David" w:cs="David" w:eastAsia="David" w:hAnsi="David"/>
-          <w:i/>
-          <w:iCs/>
-          <w:sz w:val="20"/>
-          <w:szCs w:val="20"/>
-          <w:rtl w:val="false"/>
-        </w:rPr>
-        <w:t xml:space="preserve">The Affair</w:t>
-      </w:r>
-      <w:r>
-        <w:rPr>
-          <w:rFonts w:ascii="David" w:cs="David" w:eastAsia="David" w:hAnsi="David"/>
-          <w:sz w:val="20"/>
-          <w:szCs w:val="20"/>
-          <w:rtl w:val="false"/>
-        </w:rPr>
-        <w:t xml:space="preserve">, pp. 379-485; Hyman, </w:t>
-      </w:r>
-      <w:r>
-        <w:rPr>
-          <w:rFonts w:ascii="David" w:cs="David" w:eastAsia="David" w:hAnsi="David"/>
-          <w:i/>
-          <w:iCs/>
-          <w:sz w:val="20"/>
-          <w:szCs w:val="20"/>
-          <w:rtl w:val="false"/>
-        </w:rPr>
-        <w:t xml:space="preserve">The Jews of Modern France</w:t>
-      </w:r>
-      <w:r>
-        <w:rPr>
-          <w:rFonts w:ascii="David" w:cs="David" w:eastAsia="David" w:hAnsi="David"/>
-          <w:sz w:val="20"/>
-          <w:szCs w:val="20"/>
-          <w:rtl w:val="false"/>
-        </w:rPr>
-        <w:t xml:space="preserve">, pp. 106-114.</w:t>
-      </w:r>
-    </w:p>
-  </w:footnote>
-  <w:footnote w:id="63">
-    <w:p>
-      <w:pPr>
-        <w:bidi/>
-        <w:spacing w:after="40" w:line="240" w:lineRule="auto"/>
-        <w:jc w:val="both"/>
-      </w:pPr>
-      <w:r>
-        <w:rPr>
-          <w:rStyle w:val="FootnoteReference"/>
-        </w:rPr>
-        <w:footnoteRef/>
-      </w:r>
-      <w:r>
-        <w:rPr>
-          <w:rFonts w:ascii="David" w:cs="David" w:eastAsia="David" w:hAnsi="David"/>
-          <w:sz w:val="20"/>
-          <w:szCs w:val="20"/>
-        </w:rPr>
-        <w:t xml:space="preserve"> </w:t>
-      </w:r>
-      <w:r>
-        <w:rPr>
-          <w:rFonts w:ascii="David" w:cs="David" w:eastAsia="David" w:hAnsi="David"/>
-          <w:sz w:val="20"/>
-          <w:szCs w:val="20"/>
-          <w:rtl/>
-        </w:rPr>
-        <w:t xml:space="preserve">אבינרי, </w:t>
+        <w:t xml:space="preserve">עניין היהודים</w:t>
+      </w:r>
+      <w:r>
+        <w:rPr>
+          <w:rFonts w:ascii="David" w:cs="David" w:eastAsia="David" w:hAnsi="David"/>
+          <w:sz w:val="20"/>
+          <w:szCs w:val="20"/>
+          <w:rtl/>
+        </w:rPr>
+        <w:t xml:space="preserve">, כרך א; ויטל, </w:t>
       </w:r>
       <w:r>
         <w:rPr>
@@ -8816,16 +8816,120 @@
           <w:szCs w:val="20"/>
           <w:rtl/>
         </w:rPr>
-        <w:t xml:space="preserve">הרצל</w:t>
-      </w:r>
-      <w:r>
-        <w:rPr>
-          <w:rFonts w:ascii="David" w:cs="David" w:eastAsia="David" w:hAnsi="David"/>
-          <w:sz w:val="20"/>
-          <w:szCs w:val="20"/>
-          <w:rtl/>
-        </w:rPr>
-        <w:t xml:space="preserve">, עמ' 84-92; גדעון קוץ, "ראשיתה של פרשת דרייפוס בעיתונות העברית והיהודית באירופה: כוחן של אידאולוגיות", </w:t>
+        <w:t xml:space="preserve">המהפכה הציונית</w:t>
+      </w:r>
+      <w:r>
+        <w:rPr>
+          <w:rFonts w:ascii="David" w:cs="David" w:eastAsia="David" w:hAnsi="David"/>
+          <w:sz w:val="20"/>
+          <w:szCs w:val="20"/>
+          <w:rtl/>
+        </w:rPr>
+        <w:t xml:space="preserve">, עמ' 291-370; Penslar, </w:t>
+      </w:r>
+      <w:r>
+        <w:rPr>
+          <w:rFonts w:ascii="David" w:cs="David" w:eastAsia="David" w:hAnsi="David"/>
+          <w:i/>
+          <w:iCs/>
+          <w:sz w:val="20"/>
+          <w:szCs w:val="20"/>
+          <w:rtl/>
+        </w:rPr>
+        <w:t xml:space="preserve">Theodor Herzl</w:t>
+      </w:r>
+      <w:r>
+        <w:rPr>
+          <w:rFonts w:ascii="David" w:cs="David" w:eastAsia="David" w:hAnsi="David"/>
+          <w:sz w:val="20"/>
+          <w:szCs w:val="20"/>
+          <w:rtl/>
+        </w:rPr>
+        <w:t xml:space="preserve">, pp. 71-100.</w:t>
+      </w:r>
+    </w:p>
+  </w:footnote>
+  <w:footnote w:id="58">
+    <w:p>
+      <w:pPr>
+        <w:bidi w:val="false"/>
+        <w:spacing w:after="40" w:line="240" w:lineRule="auto"/>
+        <w:jc w:val="left"/>
+      </w:pPr>
+      <w:r>
+        <w:rPr>
+          <w:rStyle w:val="FootnoteReference"/>
+        </w:rPr>
+        <w:footnoteRef/>
+      </w:r>
+      <w:r>
+        <w:rPr>
+          <w:rFonts w:ascii="David" w:cs="David" w:eastAsia="David" w:hAnsi="David"/>
+          <w:sz w:val="20"/>
+          <w:szCs w:val="20"/>
+        </w:rPr>
+        <w:t xml:space="preserve"> </w:t>
+      </w:r>
+      <w:r>
+        <w:rPr>
+          <w:rFonts w:ascii="David" w:cs="David" w:eastAsia="David" w:hAnsi="David"/>
+          <w:sz w:val="20"/>
+          <w:szCs w:val="20"/>
+          <w:rtl w:val="false"/>
+        </w:rPr>
+        <w:t xml:space="preserve">Kornberg, "A Reevaluation," pp. 226-252; Kornberg, </w:t>
+      </w:r>
+      <w:r>
+        <w:rPr>
+          <w:rFonts w:ascii="David" w:cs="David" w:eastAsia="David" w:hAnsi="David"/>
+          <w:i/>
+          <w:iCs/>
+          <w:sz w:val="20"/>
+          <w:szCs w:val="20"/>
+          <w:rtl w:val="false"/>
+        </w:rPr>
+        <w:t xml:space="preserve">Theodor Herzl</w:t>
+      </w:r>
+      <w:r>
+        <w:rPr>
+          <w:rFonts w:ascii="David" w:cs="David" w:eastAsia="David" w:hAnsi="David"/>
+          <w:sz w:val="20"/>
+          <w:szCs w:val="20"/>
+          <w:rtl w:val="false"/>
+        </w:rPr>
+        <w:t xml:space="preserve">, pp. 183-202.</w:t>
+      </w:r>
+    </w:p>
+  </w:footnote>
+  <w:footnote w:id="59">
+    <w:p>
+      <w:pPr>
+        <w:bidi/>
+        <w:spacing w:after="40" w:line="240" w:lineRule="auto"/>
+        <w:jc w:val="both"/>
+      </w:pPr>
+      <w:r>
+        <w:rPr>
+          <w:rStyle w:val="FootnoteReference"/>
+        </w:rPr>
+        <w:footnoteRef/>
+      </w:r>
+      <w:r>
+        <w:rPr>
+          <w:rFonts w:ascii="David" w:cs="David" w:eastAsia="David" w:hAnsi="David"/>
+          <w:sz w:val="20"/>
+          <w:szCs w:val="20"/>
+        </w:rPr>
+        <w:t xml:space="preserve"> </w:t>
+      </w:r>
+      <w:r>
+        <w:rPr>
+          <w:rFonts w:ascii="David" w:cs="David" w:eastAsia="David" w:hAnsi="David"/>
+          <w:sz w:val="20"/>
+          <w:szCs w:val="20"/>
+          <w:rtl/>
+        </w:rPr>
+        <w:t xml:space="preserve">אבינרי, </w:t>
       </w:r>
       <w:r>
         <w:rPr>
@@ -8838,40 +8942,20 @@
           <w:szCs w:val="20"/>
           <w:rtl/>
         </w:rPr>
-        <w:t xml:space="preserve">קשר</w:t>
-      </w:r>
-      <w:r>
-        <w:rPr>
-          <w:rFonts w:ascii="David" w:cs="David" w:eastAsia="David" w:hAnsi="David"/>
-          <w:sz w:val="20"/>
-          <w:szCs w:val="20"/>
-          <w:rtl/>
-        </w:rPr>
-        <w:t xml:space="preserve"> 46 (2014), עמ' 8; Kornberg, </w:t>
-      </w:r>
-      <w:r>
-        <w:rPr>
-          <w:rFonts w:ascii="David" w:cs="David" w:eastAsia="David" w:hAnsi="David"/>
-          <w:i/>
-          <w:iCs/>
-          <w:sz w:val="20"/>
-          <w:szCs w:val="20"/>
-          <w:rtl/>
-        </w:rPr>
-        <w:t xml:space="preserve">Theodor Herzl</w:t>
-      </w:r>
-      <w:r>
-        <w:rPr>
-          <w:rFonts w:ascii="David" w:cs="David" w:eastAsia="David" w:hAnsi="David"/>
-          <w:sz w:val="20"/>
-          <w:szCs w:val="20"/>
-          <w:rtl/>
-        </w:rPr>
-        <w:t xml:space="preserve">, pp. 183-194.</w:t>
+        <w:t xml:space="preserve">הרצל</w:t>
+      </w:r>
+      <w:r>
+        <w:rPr>
+          <w:rFonts w:ascii="David" w:cs="David" w:eastAsia="David" w:hAnsi="David"/>
+          <w:sz w:val="20"/>
+          <w:szCs w:val="20"/>
+          <w:rtl/>
+        </w:rPr>
+        <w:t xml:space="preserve">, עמ' 84-108.</w:t>
       </w:r>
     </w:p>
   </w:footnote>
-  <w:footnote w:id="64">
+  <w:footnote w:id="60">
     <w:p>
       <w:pPr>
         <w:bidi w:val="false"/>
@@ -8897,9 +8981,217 @@
           <w:rFonts w:ascii="David" w:cs="David" w:eastAsia="David" w:hAnsi="David"/>
           <w:sz w:val="20"/>
           <w:szCs w:val="20"/>
-          <w:rtl/>
-        </w:rPr>
-        <w:t xml:space="preserve">הרצל, </w:t>
+          <w:rtl w:val="false"/>
+        </w:rPr>
+        <w:t xml:space="preserve">Schorske, </w:t>
+      </w:r>
+      <w:r>
+        <w:rPr>
+          <w:rFonts w:ascii="David" w:cs="David" w:eastAsia="David" w:hAnsi="David"/>
+          <w:i/>
+          <w:iCs/>
+          <w:sz w:val="20"/>
+          <w:szCs w:val="20"/>
+          <w:rtl w:val="false"/>
+        </w:rPr>
+        <w:t xml:space="preserve">Fin-de-siècle Vienna</w:t>
+      </w:r>
+      <w:r>
+        <w:rPr>
+          <w:rFonts w:ascii="David" w:cs="David" w:eastAsia="David" w:hAnsi="David"/>
+          <w:sz w:val="20"/>
+          <w:szCs w:val="20"/>
+          <w:rtl w:val="false"/>
+        </w:rPr>
+        <w:t xml:space="preserve">, pp. 146-175.</w:t>
+      </w:r>
+    </w:p>
+  </w:footnote>
+  <w:footnote w:id="61">
+    <w:p>
+      <w:pPr>
+        <w:bidi w:val="false"/>
+        <w:spacing w:after="40" w:line="240" w:lineRule="auto"/>
+        <w:jc w:val="left"/>
+      </w:pPr>
+      <w:r>
+        <w:rPr>
+          <w:rStyle w:val="FootnoteReference"/>
+        </w:rPr>
+        <w:footnoteRef/>
+      </w:r>
+      <w:r>
+        <w:rPr>
+          <w:rFonts w:ascii="David" w:cs="David" w:eastAsia="David" w:hAnsi="David"/>
+          <w:sz w:val="20"/>
+          <w:szCs w:val="20"/>
+        </w:rPr>
+        <w:t xml:space="preserve"> </w:t>
+      </w:r>
+      <w:r>
+        <w:rPr>
+          <w:rFonts w:ascii="David" w:cs="David" w:eastAsia="David" w:hAnsi="David"/>
+          <w:sz w:val="20"/>
+          <w:szCs w:val="20"/>
+          <w:rtl w:val="false"/>
+        </w:rPr>
+        <w:t xml:space="preserve">Robert S. Wistrich, "Theodor Herzl: Zionist Icon, Myth-Maker, and Social Utopian," </w:t>
+      </w:r>
+      <w:r>
+        <w:rPr>
+          <w:rFonts w:ascii="David" w:cs="David" w:eastAsia="David" w:hAnsi="David"/>
+          <w:i/>
+          <w:iCs/>
+          <w:sz w:val="20"/>
+          <w:szCs w:val="20"/>
+          <w:rtl w:val="false"/>
+        </w:rPr>
+        <w:t xml:space="preserve">Israel Affairs</w:t>
+      </w:r>
+      <w:r>
+        <w:rPr>
+          <w:rFonts w:ascii="David" w:cs="David" w:eastAsia="David" w:hAnsi="David"/>
+          <w:sz w:val="20"/>
+          <w:szCs w:val="20"/>
+          <w:rtl w:val="false"/>
+        </w:rPr>
+        <w:t xml:space="preserve"> 1:3 (1995), pp. 1-37.</w:t>
+      </w:r>
+    </w:p>
+  </w:footnote>
+  <w:footnote w:id="62">
+    <w:p>
+      <w:pPr>
+        <w:bidi w:val="false"/>
+        <w:spacing w:after="40" w:line="240" w:lineRule="auto"/>
+        <w:jc w:val="left"/>
+      </w:pPr>
+      <w:r>
+        <w:rPr>
+          <w:rStyle w:val="FootnoteReference"/>
+        </w:rPr>
+        <w:footnoteRef/>
+      </w:r>
+      <w:r>
+        <w:rPr>
+          <w:rFonts w:ascii="David" w:cs="David" w:eastAsia="David" w:hAnsi="David"/>
+          <w:sz w:val="20"/>
+          <w:szCs w:val="20"/>
+        </w:rPr>
+        <w:t xml:space="preserve"> </w:t>
+      </w:r>
+      <w:r>
+        <w:rPr>
+          <w:rFonts w:ascii="David" w:cs="David" w:eastAsia="David" w:hAnsi="David"/>
+          <w:sz w:val="20"/>
+          <w:szCs w:val="20"/>
+          <w:rtl w:val="false"/>
+        </w:rPr>
+        <w:t xml:space="preserve">Wistrich, </w:t>
+      </w:r>
+      <w:r>
+        <w:rPr>
+          <w:rFonts w:ascii="David" w:cs="David" w:eastAsia="David" w:hAnsi="David"/>
+          <w:i/>
+          <w:iCs/>
+          <w:sz w:val="20"/>
+          <w:szCs w:val="20"/>
+          <w:rtl w:val="false"/>
+        </w:rPr>
+        <w:t xml:space="preserve">The Jews of Vienna</w:t>
+      </w:r>
+      <w:r>
+        <w:rPr>
+          <w:rFonts w:ascii="David" w:cs="David" w:eastAsia="David" w:hAnsi="David"/>
+          <w:sz w:val="20"/>
+          <w:szCs w:val="20"/>
+          <w:rtl w:val="false"/>
+        </w:rPr>
+        <w:t xml:space="preserve">, pp. 421-460.</w:t>
+      </w:r>
+    </w:p>
+  </w:footnote>
+  <w:footnote w:id="63">
+    <w:p>
+      <w:pPr>
+        <w:bidi w:val="false"/>
+        <w:spacing w:after="40" w:line="240" w:lineRule="auto"/>
+        <w:jc w:val="left"/>
+      </w:pPr>
+      <w:r>
+        <w:rPr>
+          <w:rStyle w:val="FootnoteReference"/>
+        </w:rPr>
+        <w:footnoteRef/>
+      </w:r>
+      <w:r>
+        <w:rPr>
+          <w:rFonts w:ascii="David" w:cs="David" w:eastAsia="David" w:hAnsi="David"/>
+          <w:sz w:val="20"/>
+          <w:szCs w:val="20"/>
+        </w:rPr>
+        <w:t xml:space="preserve"> </w:t>
+      </w:r>
+      <w:r>
+        <w:rPr>
+          <w:rFonts w:ascii="David" w:cs="David" w:eastAsia="David" w:hAnsi="David"/>
+          <w:sz w:val="20"/>
+          <w:szCs w:val="20"/>
+          <w:rtl w:val="false"/>
+        </w:rPr>
+        <w:t xml:space="preserve">Beller, </w:t>
+      </w:r>
+      <w:r>
+        <w:rPr>
+          <w:rFonts w:ascii="David" w:cs="David" w:eastAsia="David" w:hAnsi="David"/>
+          <w:i/>
+          <w:iCs/>
+          <w:sz w:val="20"/>
+          <w:szCs w:val="20"/>
+          <w:rtl w:val="false"/>
+        </w:rPr>
+        <w:t xml:space="preserve">Herzl</w:t>
+      </w:r>
+      <w:r>
+        <w:rPr>
+          <w:rFonts w:ascii="David" w:cs="David" w:eastAsia="David" w:hAnsi="David"/>
+          <w:sz w:val="20"/>
+          <w:szCs w:val="20"/>
+          <w:rtl w:val="false"/>
+        </w:rPr>
+        <w:t xml:space="preserve">, pp. 20-45.</w:t>
+      </w:r>
+    </w:p>
+  </w:footnote>
+  <w:footnote w:id="64">
+    <w:p>
+      <w:pPr>
+        <w:bidi w:val="false"/>
+        <w:spacing w:after="40" w:line="240" w:lineRule="auto"/>
+        <w:jc w:val="left"/>
+      </w:pPr>
+      <w:r>
+        <w:rPr>
+          <w:rStyle w:val="FootnoteReference"/>
+        </w:rPr>
+        <w:footnoteRef/>
+      </w:r>
+      <w:r>
+        <w:rPr>
+          <w:rFonts w:ascii="David" w:cs="David" w:eastAsia="David" w:hAnsi="David"/>
+          <w:sz w:val="20"/>
+          <w:szCs w:val="20"/>
+        </w:rPr>
+        <w:t xml:space="preserve"> </w:t>
+      </w:r>
+      <w:r>
+        <w:rPr>
+          <w:rFonts w:ascii="David" w:cs="David" w:eastAsia="David" w:hAnsi="David"/>
+          <w:sz w:val="20"/>
+          <w:szCs w:val="20"/>
+          <w:rtl/>
+        </w:rPr>
+        <w:t xml:space="preserve">אבינרי, </w:t>
       </w:r>
       <w:r>
         <w:rPr>
@@ -8912,45 +9204,45 @@
           <w:szCs w:val="20"/>
           <w:rtl/>
         </w:rPr>
-        <w:t xml:space="preserve">עניין היהודים</w:t>
-      </w:r>
-      <w:r>
-        <w:rPr>
-          <w:rFonts w:ascii="David" w:cs="David" w:eastAsia="David" w:hAnsi="David"/>
-          <w:sz w:val="20"/>
-          <w:szCs w:val="20"/>
-          <w:rtl/>
-        </w:rPr>
-        <w:t xml:space="preserve">, כרך א; Herzl, </w:t>
-      </w:r>
-      <w:r>
-        <w:rPr>
-          <w:rFonts w:ascii="David" w:cs="David" w:eastAsia="David" w:hAnsi="David"/>
-          <w:i/>
-          <w:iCs/>
-          <w:sz w:val="20"/>
-          <w:szCs w:val="20"/>
-          <w:rtl w:val="false"/>
-        </w:rPr>
-        <w:t xml:space="preserve">Complete Diaries</w:t>
-      </w:r>
-      <w:r>
-        <w:rPr>
-          <w:rFonts w:ascii="David" w:cs="David" w:eastAsia="David" w:hAnsi="David"/>
-          <w:sz w:val="20"/>
-          <w:szCs w:val="20"/>
-          <w:rtl w:val="false"/>
-        </w:rPr>
-        <w:t xml:space="preserve">, vol. 1, pp. 3-130.</w:t>
+        <w:t xml:space="preserve">הרצל</w:t>
+      </w:r>
+      <w:r>
+        <w:rPr>
+          <w:rFonts w:ascii="David" w:cs="David" w:eastAsia="David" w:hAnsi="David"/>
+          <w:sz w:val="20"/>
+          <w:szCs w:val="20"/>
+          <w:rtl/>
+        </w:rPr>
+        <w:t xml:space="preserve">, עמ' 93-108; Kornberg, </w:t>
+      </w:r>
+      <w:r>
+        <w:rPr>
+          <w:rFonts w:ascii="David" w:cs="David" w:eastAsia="David" w:hAnsi="David"/>
+          <w:i/>
+          <w:iCs/>
+          <w:sz w:val="20"/>
+          <w:szCs w:val="20"/>
+          <w:rtl w:val="false"/>
+        </w:rPr>
+        <w:t xml:space="preserve">Theodor Herzl</w:t>
+      </w:r>
+      <w:r>
+        <w:rPr>
+          <w:rFonts w:ascii="David" w:cs="David" w:eastAsia="David" w:hAnsi="David"/>
+          <w:sz w:val="20"/>
+          <w:szCs w:val="20"/>
+          <w:rtl w:val="false"/>
+        </w:rPr>
+        <w:t xml:space="preserve">, pp. 159-202.</w:t>
       </w:r>
     </w:p>
   </w:footnote>
   <w:footnote w:id="65">
     <w:p>
       <w:pPr>
-        <w:bidi/>
+        <w:bidi w:val="false"/>
         <w:spacing w:after="40" w:line="240" w:lineRule="auto"/>
-        <w:jc w:val="both"/>
+        <w:jc w:val="left"/>
       </w:pPr>
       <w:r>
         <w:rPr>
@@ -8971,9 +9263,409 @@
           <w:rFonts w:ascii="David" w:cs="David" w:eastAsia="David" w:hAnsi="David"/>
           <w:sz w:val="20"/>
           <w:szCs w:val="20"/>
-          <w:rtl/>
-        </w:rPr>
-        <w:t xml:space="preserve">דוד ויטל, </w:t>
+          <w:rtl w:val="false"/>
+        </w:rPr>
+        <w:t xml:space="preserve">Jean-Denis Bredin, </w:t>
+      </w:r>
+      <w:r>
+        <w:rPr>
+          <w:rFonts w:ascii="David" w:cs="David" w:eastAsia="David" w:hAnsi="David"/>
+          <w:i/>
+          <w:iCs/>
+          <w:sz w:val="20"/>
+          <w:szCs w:val="20"/>
+          <w:rtl w:val="false"/>
+        </w:rPr>
+        <w:t xml:space="preserve">The Affair: The Case of Alfred Dreyfus</w:t>
+      </w:r>
+      <w:r>
+        <w:rPr>
+          <w:rFonts w:ascii="David" w:cs="David" w:eastAsia="David" w:hAnsi="David"/>
+          <w:sz w:val="20"/>
+          <w:szCs w:val="20"/>
+          <w:rtl w:val="false"/>
+        </w:rPr>
+        <w:t xml:space="preserve">, trans. Jeffrey Mehlman (New York: George Braziller, 1986), pp. 59-95; Hyman, </w:t>
+      </w:r>
+      <w:r>
+        <w:rPr>
+          <w:rFonts w:ascii="David" w:cs="David" w:eastAsia="David" w:hAnsi="David"/>
+          <w:i/>
+          <w:iCs/>
+          <w:sz w:val="20"/>
+          <w:szCs w:val="20"/>
+          <w:rtl w:val="false"/>
+        </w:rPr>
+        <w:t xml:space="preserve">The Jews of Modern France</w:t>
+      </w:r>
+      <w:r>
+        <w:rPr>
+          <w:rFonts w:ascii="David" w:cs="David" w:eastAsia="David" w:hAnsi="David"/>
+          <w:sz w:val="20"/>
+          <w:szCs w:val="20"/>
+          <w:rtl w:val="false"/>
+        </w:rPr>
+        <w:t xml:space="preserve">, pp. 99-102.</w:t>
+      </w:r>
+    </w:p>
+  </w:footnote>
+  <w:footnote w:id="66">
+    <w:p>
+      <w:pPr>
+        <w:bidi w:val="false"/>
+        <w:spacing w:after="40" w:line="240" w:lineRule="auto"/>
+        <w:jc w:val="left"/>
+      </w:pPr>
+      <w:r>
+        <w:rPr>
+          <w:rStyle w:val="FootnoteReference"/>
+        </w:rPr>
+        <w:footnoteRef/>
+      </w:r>
+      <w:r>
+        <w:rPr>
+          <w:rFonts w:ascii="David" w:cs="David" w:eastAsia="David" w:hAnsi="David"/>
+          <w:sz w:val="20"/>
+          <w:szCs w:val="20"/>
+        </w:rPr>
+        <w:t xml:space="preserve"> </w:t>
+      </w:r>
+      <w:r>
+        <w:rPr>
+          <w:rFonts w:ascii="David" w:cs="David" w:eastAsia="David" w:hAnsi="David"/>
+          <w:sz w:val="20"/>
+          <w:szCs w:val="20"/>
+          <w:rtl w:val="false"/>
+        </w:rPr>
+        <w:t xml:space="preserve">Bredin, </w:t>
+      </w:r>
+      <w:r>
+        <w:rPr>
+          <w:rFonts w:ascii="David" w:cs="David" w:eastAsia="David" w:hAnsi="David"/>
+          <w:i/>
+          <w:iCs/>
+          <w:sz w:val="20"/>
+          <w:szCs w:val="20"/>
+          <w:rtl w:val="false"/>
+        </w:rPr>
+        <w:t xml:space="preserve">The Affair</w:t>
+      </w:r>
+      <w:r>
+        <w:rPr>
+          <w:rFonts w:ascii="David" w:cs="David" w:eastAsia="David" w:hAnsi="David"/>
+          <w:sz w:val="20"/>
+          <w:szCs w:val="20"/>
+          <w:rtl w:val="false"/>
+        </w:rPr>
+        <w:t xml:space="preserve">, pp. 96-128; Ruth Harris, </w:t>
+      </w:r>
+      <w:r>
+        <w:rPr>
+          <w:rFonts w:ascii="David" w:cs="David" w:eastAsia="David" w:hAnsi="David"/>
+          <w:i/>
+          <w:iCs/>
+          <w:sz w:val="20"/>
+          <w:szCs w:val="20"/>
+          <w:rtl w:val="false"/>
+        </w:rPr>
+        <w:t xml:space="preserve">Dreyfus: Politics, Emotion, and the Scandal of the Century</w:t>
+      </w:r>
+      <w:r>
+        <w:rPr>
+          <w:rFonts w:ascii="David" w:cs="David" w:eastAsia="David" w:hAnsi="David"/>
+          <w:sz w:val="20"/>
+          <w:szCs w:val="20"/>
+          <w:rtl w:val="false"/>
+        </w:rPr>
+        <w:t xml:space="preserve"> (New York: Metropolitan Books, 2010), pp. 20-43.</w:t>
+      </w:r>
+    </w:p>
+  </w:footnote>
+  <w:footnote w:id="67">
+    <w:p>
+      <w:pPr>
+        <w:bidi w:val="false"/>
+        <w:spacing w:after="40" w:line="240" w:lineRule="auto"/>
+        <w:jc w:val="left"/>
+      </w:pPr>
+      <w:r>
+        <w:rPr>
+          <w:rStyle w:val="FootnoteReference"/>
+        </w:rPr>
+        <w:footnoteRef/>
+      </w:r>
+      <w:r>
+        <w:rPr>
+          <w:rFonts w:ascii="David" w:cs="David" w:eastAsia="David" w:hAnsi="David"/>
+          <w:sz w:val="20"/>
+          <w:szCs w:val="20"/>
+        </w:rPr>
+        <w:t xml:space="preserve"> </w:t>
+      </w:r>
+      <w:r>
+        <w:rPr>
+          <w:rFonts w:ascii="David" w:cs="David" w:eastAsia="David" w:hAnsi="David"/>
+          <w:sz w:val="20"/>
+          <w:szCs w:val="20"/>
+          <w:rtl w:val="false"/>
+        </w:rPr>
+        <w:t xml:space="preserve">Bernard Lazare, </w:t>
+      </w:r>
+      <w:r>
+        <w:rPr>
+          <w:rFonts w:ascii="David" w:cs="David" w:eastAsia="David" w:hAnsi="David"/>
+          <w:i/>
+          <w:iCs/>
+          <w:sz w:val="20"/>
+          <w:szCs w:val="20"/>
+          <w:rtl w:val="false"/>
+        </w:rPr>
+        <w:t xml:space="preserve">Une erreur judiciaire: La vérité sur l'affaire Dreyfus</w:t>
+      </w:r>
+      <w:r>
+        <w:rPr>
+          <w:rFonts w:ascii="David" w:cs="David" w:eastAsia="David" w:hAnsi="David"/>
+          <w:sz w:val="20"/>
+          <w:szCs w:val="20"/>
+          <w:rtl w:val="false"/>
+        </w:rPr>
+        <w:t xml:space="preserve"> (Brussels: Veuve Monnom, 1896); Hyman, </w:t>
+      </w:r>
+      <w:r>
+        <w:rPr>
+          <w:rFonts w:ascii="David" w:cs="David" w:eastAsia="David" w:hAnsi="David"/>
+          <w:i/>
+          <w:iCs/>
+          <w:sz w:val="20"/>
+          <w:szCs w:val="20"/>
+          <w:rtl w:val="false"/>
+        </w:rPr>
+        <w:t xml:space="preserve">The Jews of Modern France</w:t>
+      </w:r>
+      <w:r>
+        <w:rPr>
+          <w:rFonts w:ascii="David" w:cs="David" w:eastAsia="David" w:hAnsi="David"/>
+          <w:sz w:val="20"/>
+          <w:szCs w:val="20"/>
+          <w:rtl w:val="false"/>
+        </w:rPr>
+        <w:t xml:space="preserve">, pp. 102-104; Bredin, </w:t>
+      </w:r>
+      <w:r>
+        <w:rPr>
+          <w:rFonts w:ascii="David" w:cs="David" w:eastAsia="David" w:hAnsi="David"/>
+          <w:i/>
+          <w:iCs/>
+          <w:sz w:val="20"/>
+          <w:szCs w:val="20"/>
+          <w:rtl w:val="false"/>
+        </w:rPr>
+        <w:t xml:space="preserve">The Affair</w:t>
+      </w:r>
+      <w:r>
+        <w:rPr>
+          <w:rFonts w:ascii="David" w:cs="David" w:eastAsia="David" w:hAnsi="David"/>
+          <w:sz w:val="20"/>
+          <w:szCs w:val="20"/>
+          <w:rtl w:val="false"/>
+        </w:rPr>
+        <w:t xml:space="preserve">, pp. 129-247.</w:t>
+      </w:r>
+    </w:p>
+  </w:footnote>
+  <w:footnote w:id="68">
+    <w:p>
+      <w:pPr>
+        <w:bidi w:val="false"/>
+        <w:spacing w:after="40" w:line="240" w:lineRule="auto"/>
+        <w:jc w:val="left"/>
+      </w:pPr>
+      <w:r>
+        <w:rPr>
+          <w:rStyle w:val="FootnoteReference"/>
+        </w:rPr>
+        <w:footnoteRef/>
+      </w:r>
+      <w:r>
+        <w:rPr>
+          <w:rFonts w:ascii="David" w:cs="David" w:eastAsia="David" w:hAnsi="David"/>
+          <w:sz w:val="20"/>
+          <w:szCs w:val="20"/>
+        </w:rPr>
+        <w:t xml:space="preserve"> </w:t>
+      </w:r>
+      <w:r>
+        <w:rPr>
+          <w:rFonts w:ascii="David" w:cs="David" w:eastAsia="David" w:hAnsi="David"/>
+          <w:sz w:val="20"/>
+          <w:szCs w:val="20"/>
+          <w:rtl w:val="false"/>
+        </w:rPr>
+        <w:t xml:space="preserve">Émile Zola, "J'accuse...! Lettre au Président de la République," </w:t>
+      </w:r>
+      <w:r>
+        <w:rPr>
+          <w:rFonts w:ascii="David" w:cs="David" w:eastAsia="David" w:hAnsi="David"/>
+          <w:i/>
+          <w:iCs/>
+          <w:sz w:val="20"/>
+          <w:szCs w:val="20"/>
+          <w:rtl w:val="false"/>
+        </w:rPr>
+        <w:t xml:space="preserve">L'Aurore</w:t>
+      </w:r>
+      <w:r>
+        <w:rPr>
+          <w:rFonts w:ascii="David" w:cs="David" w:eastAsia="David" w:hAnsi="David"/>
+          <w:sz w:val="20"/>
+          <w:szCs w:val="20"/>
+          <w:rtl w:val="false"/>
+        </w:rPr>
+        <w:t xml:space="preserve">, 13 January 1898; Wilson, </w:t>
+      </w:r>
+      <w:r>
+        <w:rPr>
+          <w:rFonts w:ascii="David" w:cs="David" w:eastAsia="David" w:hAnsi="David"/>
+          <w:i/>
+          <w:iCs/>
+          <w:sz w:val="20"/>
+          <w:szCs w:val="20"/>
+          <w:rtl w:val="false"/>
+        </w:rPr>
+        <w:t xml:space="preserve">Ideology and Experience</w:t>
+      </w:r>
+      <w:r>
+        <w:rPr>
+          <w:rFonts w:ascii="David" w:cs="David" w:eastAsia="David" w:hAnsi="David"/>
+          <w:sz w:val="20"/>
+          <w:szCs w:val="20"/>
+          <w:rtl w:val="false"/>
+        </w:rPr>
+        <w:t xml:space="preserve">, pp. 106-124; Harris, </w:t>
+      </w:r>
+      <w:r>
+        <w:rPr>
+          <w:rFonts w:ascii="David" w:cs="David" w:eastAsia="David" w:hAnsi="David"/>
+          <w:i/>
+          <w:iCs/>
+          <w:sz w:val="20"/>
+          <w:szCs w:val="20"/>
+          <w:rtl w:val="false"/>
+        </w:rPr>
+        <w:t xml:space="preserve">Dreyfus</w:t>
+      </w:r>
+      <w:r>
+        <w:rPr>
+          <w:rFonts w:ascii="David" w:cs="David" w:eastAsia="David" w:hAnsi="David"/>
+          <w:sz w:val="20"/>
+          <w:szCs w:val="20"/>
+          <w:rtl w:val="false"/>
+        </w:rPr>
+        <w:t xml:space="preserve">, pp. 104-160.</w:t>
+      </w:r>
+    </w:p>
+  </w:footnote>
+  <w:footnote w:id="69">
+    <w:p>
+      <w:pPr>
+        <w:bidi w:val="false"/>
+        <w:spacing w:after="40" w:line="240" w:lineRule="auto"/>
+        <w:jc w:val="left"/>
+      </w:pPr>
+      <w:r>
+        <w:rPr>
+          <w:rStyle w:val="FootnoteReference"/>
+        </w:rPr>
+        <w:footnoteRef/>
+      </w:r>
+      <w:r>
+        <w:rPr>
+          <w:rFonts w:ascii="David" w:cs="David" w:eastAsia="David" w:hAnsi="David"/>
+          <w:sz w:val="20"/>
+          <w:szCs w:val="20"/>
+        </w:rPr>
+        <w:t xml:space="preserve"> </w:t>
+      </w:r>
+      <w:r>
+        <w:rPr>
+          <w:rFonts w:ascii="David" w:cs="David" w:eastAsia="David" w:hAnsi="David"/>
+          <w:sz w:val="20"/>
+          <w:szCs w:val="20"/>
+          <w:rtl w:val="false"/>
+        </w:rPr>
+        <w:t xml:space="preserve">Harris, </w:t>
+      </w:r>
+      <w:r>
+        <w:rPr>
+          <w:rFonts w:ascii="David" w:cs="David" w:eastAsia="David" w:hAnsi="David"/>
+          <w:i/>
+          <w:iCs/>
+          <w:sz w:val="20"/>
+          <w:szCs w:val="20"/>
+          <w:rtl w:val="false"/>
+        </w:rPr>
+        <w:t xml:space="preserve">Dreyfus</w:t>
+      </w:r>
+      <w:r>
+        <w:rPr>
+          <w:rFonts w:ascii="David" w:cs="David" w:eastAsia="David" w:hAnsi="David"/>
+          <w:sz w:val="20"/>
+          <w:szCs w:val="20"/>
+          <w:rtl w:val="false"/>
+        </w:rPr>
+        <w:t xml:space="preserve">, pp. 121-189; Cahm, </w:t>
+      </w:r>
+      <w:r>
+        <w:rPr>
+          <w:rFonts w:ascii="David" w:cs="David" w:eastAsia="David" w:hAnsi="David"/>
+          <w:i/>
+          <w:iCs/>
+          <w:sz w:val="20"/>
+          <w:szCs w:val="20"/>
+          <w:rtl w:val="false"/>
+        </w:rPr>
+        <w:t xml:space="preserve">The Dreyfus Affair</w:t>
+      </w:r>
+      <w:r>
+        <w:rPr>
+          <w:rFonts w:ascii="David" w:cs="David" w:eastAsia="David" w:hAnsi="David"/>
+          <w:sz w:val="20"/>
+          <w:szCs w:val="20"/>
+          <w:rtl w:val="false"/>
+        </w:rPr>
+        <w:t xml:space="preserve">, pp. 49-68.</w:t>
+      </w:r>
+    </w:p>
+  </w:footnote>
+  <w:footnote w:id="70">
+    <w:p>
+      <w:pPr>
+        <w:bidi w:val="false"/>
+        <w:spacing w:after="40" w:line="240" w:lineRule="auto"/>
+        <w:jc w:val="left"/>
+      </w:pPr>
+      <w:r>
+        <w:rPr>
+          <w:rStyle w:val="FootnoteReference"/>
+        </w:rPr>
+        <w:footnoteRef/>
+      </w:r>
+      <w:r>
+        <w:rPr>
+          <w:rFonts w:ascii="David" w:cs="David" w:eastAsia="David" w:hAnsi="David"/>
+          <w:sz w:val="20"/>
+          <w:szCs w:val="20"/>
+        </w:rPr>
+        <w:t xml:space="preserve"> </w:t>
+      </w:r>
+      <w:r>
+        <w:rPr>
+          <w:rFonts w:ascii="David" w:cs="David" w:eastAsia="David" w:hAnsi="David"/>
+          <w:sz w:val="20"/>
+          <w:szCs w:val="20"/>
+          <w:rtl/>
+        </w:rPr>
+        <w:t xml:space="preserve">מירון, </w:t>
       </w:r>
       <w:r>
         <w:rPr>
@@ -8986,16 +9678,160 @@
           <w:szCs w:val="20"/>
           <w:rtl/>
         </w:rPr>
-        <w:t xml:space="preserve">המהפכה הציונית: ראשית התנועה</w:t>
-      </w:r>
-      <w:r>
-        <w:rPr>
-          <w:rFonts w:ascii="David" w:cs="David" w:eastAsia="David" w:hAnsi="David"/>
-          <w:sz w:val="20"/>
-          <w:szCs w:val="20"/>
-          <w:rtl/>
-        </w:rPr>
-        <w:t xml:space="preserve"> (תל אביב: עם עובד, 1978), עמ' 217-262; שלמה אבינרי, </w:t>
+        <w:t xml:space="preserve">מדריך למידה</w:t>
+      </w:r>
+      <w:r>
+        <w:rPr>
+          <w:rFonts w:ascii="David" w:cs="David" w:eastAsia="David" w:hAnsi="David"/>
+          <w:sz w:val="20"/>
+          <w:szCs w:val="20"/>
+          <w:rtl/>
+        </w:rPr>
+        <w:t xml:space="preserve">, עמ' 63; Bredin, </w:t>
+      </w:r>
+      <w:r>
+        <w:rPr>
+          <w:rFonts w:ascii="David" w:cs="David" w:eastAsia="David" w:hAnsi="David"/>
+          <w:i/>
+          <w:iCs/>
+          <w:sz w:val="20"/>
+          <w:szCs w:val="20"/>
+          <w:rtl w:val="false"/>
+        </w:rPr>
+        <w:t xml:space="preserve">The Affair</w:t>
+      </w:r>
+      <w:r>
+        <w:rPr>
+          <w:rFonts w:ascii="David" w:cs="David" w:eastAsia="David" w:hAnsi="David"/>
+          <w:sz w:val="20"/>
+          <w:szCs w:val="20"/>
+          <w:rtl w:val="false"/>
+        </w:rPr>
+        <w:t xml:space="preserve">, pp. 379-485; Hyman, </w:t>
+      </w:r>
+      <w:r>
+        <w:rPr>
+          <w:rFonts w:ascii="David" w:cs="David" w:eastAsia="David" w:hAnsi="David"/>
+          <w:i/>
+          <w:iCs/>
+          <w:sz w:val="20"/>
+          <w:szCs w:val="20"/>
+          <w:rtl w:val="false"/>
+        </w:rPr>
+        <w:t xml:space="preserve">The Jews of Modern France</w:t>
+      </w:r>
+      <w:r>
+        <w:rPr>
+          <w:rFonts w:ascii="David" w:cs="David" w:eastAsia="David" w:hAnsi="David"/>
+          <w:sz w:val="20"/>
+          <w:szCs w:val="20"/>
+          <w:rtl w:val="false"/>
+        </w:rPr>
+        <w:t xml:space="preserve">, pp. 106-114.</w:t>
+      </w:r>
+    </w:p>
+  </w:footnote>
+  <w:footnote w:id="71">
+    <w:p>
+      <w:pPr>
+        <w:bidi w:val="false"/>
+        <w:spacing w:after="40" w:line="240" w:lineRule="auto"/>
+        <w:jc w:val="left"/>
+      </w:pPr>
+      <w:r>
+        <w:rPr>
+          <w:rStyle w:val="FootnoteReference"/>
+        </w:rPr>
+        <w:footnoteRef/>
+      </w:r>
+      <w:r>
+        <w:rPr>
+          <w:rFonts w:ascii="David" w:cs="David" w:eastAsia="David" w:hAnsi="David"/>
+          <w:sz w:val="20"/>
+          <w:szCs w:val="20"/>
+        </w:rPr>
+        <w:t xml:space="preserve"> </w:t>
+      </w:r>
+      <w:r>
+        <w:rPr>
+          <w:rFonts w:ascii="David" w:cs="David" w:eastAsia="David" w:hAnsi="David"/>
+          <w:sz w:val="20"/>
+          <w:szCs w:val="20"/>
+          <w:rtl w:val="false"/>
+        </w:rPr>
+        <w:t xml:space="preserve">Marrus, </w:t>
+      </w:r>
+      <w:r>
+        <w:rPr>
+          <w:rFonts w:ascii="David" w:cs="David" w:eastAsia="David" w:hAnsi="David"/>
+          <w:i/>
+          <w:iCs/>
+          <w:sz w:val="20"/>
+          <w:szCs w:val="20"/>
+          <w:rtl w:val="false"/>
+        </w:rPr>
+        <w:t xml:space="preserve">The Politics of Assimilation</w:t>
+      </w:r>
+      <w:r>
+        <w:rPr>
+          <w:rFonts w:ascii="David" w:cs="David" w:eastAsia="David" w:hAnsi="David"/>
+          <w:sz w:val="20"/>
+          <w:szCs w:val="20"/>
+          <w:rtl w:val="false"/>
+        </w:rPr>
+        <w:t xml:space="preserve">, pp. 196-242; Hyman, </w:t>
+      </w:r>
+      <w:r>
+        <w:rPr>
+          <w:rFonts w:ascii="David" w:cs="David" w:eastAsia="David" w:hAnsi="David"/>
+          <w:i/>
+          <w:iCs/>
+          <w:sz w:val="20"/>
+          <w:szCs w:val="20"/>
+          <w:rtl w:val="false"/>
+        </w:rPr>
+        <w:t xml:space="preserve">The Jews of Modern France</w:t>
+      </w:r>
+      <w:r>
+        <w:rPr>
+          <w:rFonts w:ascii="David" w:cs="David" w:eastAsia="David" w:hAnsi="David"/>
+          <w:sz w:val="20"/>
+          <w:szCs w:val="20"/>
+          <w:rtl w:val="false"/>
+        </w:rPr>
+        <w:t xml:space="preserve">, pp. 111-113.</w:t>
+      </w:r>
+    </w:p>
+  </w:footnote>
+  <w:footnote w:id="72">
+    <w:p>
+      <w:pPr>
+        <w:bidi/>
+        <w:spacing w:after="40" w:line="240" w:lineRule="auto"/>
+        <w:jc w:val="both"/>
+      </w:pPr>
+      <w:r>
+        <w:rPr>
+          <w:rStyle w:val="FootnoteReference"/>
+        </w:rPr>
+        <w:footnoteRef/>
+      </w:r>
+      <w:r>
+        <w:rPr>
+          <w:rFonts w:ascii="David" w:cs="David" w:eastAsia="David" w:hAnsi="David"/>
+          <w:sz w:val="20"/>
+          <w:szCs w:val="20"/>
+        </w:rPr>
+        <w:t xml:space="preserve"> </w:t>
+      </w:r>
+      <w:r>
+        <w:rPr>
+          <w:rFonts w:ascii="David" w:cs="David" w:eastAsia="David" w:hAnsi="David"/>
+          <w:sz w:val="20"/>
+          <w:szCs w:val="20"/>
+          <w:rtl/>
+        </w:rPr>
+        <w:t xml:space="preserve">אבינרי, </w:t>
       </w:r>
       <w:r>
         <w:rPr>
@@ -9008,68 +9844,16 @@
           <w:szCs w:val="20"/>
           <w:rtl/>
         </w:rPr>
-        <w:t xml:space="preserve">הרעיון הציוני לגווניו: פרקים בתולדות המחשבה המדינית היהודית</w:t>
-      </w:r>
-      <w:r>
-        <w:rPr>
-          <w:rFonts w:ascii="David" w:cs="David" w:eastAsia="David" w:hAnsi="David"/>
-          <w:sz w:val="20"/>
-          <w:szCs w:val="20"/>
-          <w:rtl/>
-        </w:rPr>
-        <w:t xml:space="preserve"> (תל אביב: עם עובד, 1980), עמ' 107-124; Herzl, </w:t>
-      </w:r>
-      <w:r>
-        <w:rPr>
-          <w:rFonts w:ascii="David" w:cs="David" w:eastAsia="David" w:hAnsi="David"/>
-          <w:i/>
-          <w:iCs/>
-          <w:sz w:val="20"/>
-          <w:szCs w:val="20"/>
-          <w:rtl/>
-        </w:rPr>
-        <w:t xml:space="preserve">The Jewish State</w:t>
-      </w:r>
-      <w:r>
-        <w:rPr>
-          <w:rFonts w:ascii="David" w:cs="David" w:eastAsia="David" w:hAnsi="David"/>
-          <w:sz w:val="20"/>
-          <w:szCs w:val="20"/>
-          <w:rtl/>
-        </w:rPr>
-        <w:t xml:space="preserve">, pp. 75-100.</w:t>
-      </w:r>
-    </w:p>
-  </w:footnote>
-  <w:footnote w:id="66">
-    <w:p>
-      <w:pPr>
-        <w:bidi/>
-        <w:spacing w:after="40" w:line="240" w:lineRule="auto"/>
-        <w:jc w:val="both"/>
-      </w:pPr>
-      <w:r>
-        <w:rPr>
-          <w:rStyle w:val="FootnoteReference"/>
-        </w:rPr>
-        <w:footnoteRef/>
-      </w:r>
-      <w:r>
-        <w:rPr>
-          <w:rFonts w:ascii="David" w:cs="David" w:eastAsia="David" w:hAnsi="David"/>
-          <w:sz w:val="20"/>
-          <w:szCs w:val="20"/>
-        </w:rPr>
-        <w:t xml:space="preserve"> </w:t>
-      </w:r>
-      <w:r>
-        <w:rPr>
-          <w:rFonts w:ascii="David" w:cs="David" w:eastAsia="David" w:hAnsi="David"/>
-          <w:sz w:val="20"/>
-          <w:szCs w:val="20"/>
-          <w:rtl/>
-        </w:rPr>
-        <w:t xml:space="preserve">יוסף לנג, "תגובות העיתונות העברית בארץ ישראל על פרשת דרייפוס (1894-1906)", </w:t>
+        <w:t xml:space="preserve">הרצל</w:t>
+      </w:r>
+      <w:r>
+        <w:rPr>
+          <w:rFonts w:ascii="David" w:cs="David" w:eastAsia="David" w:hAnsi="David"/>
+          <w:sz w:val="20"/>
+          <w:szCs w:val="20"/>
+          <w:rtl/>
+        </w:rPr>
+        <w:t xml:space="preserve">, עמ' 84-92; גדעון קוץ, "ראשיתה של פרשת דרייפוס בעיתונות העברית והיהודית באירופה: כוחן של אידאולוגיות", </w:t>
       </w:r>
       <w:r>
         <w:rPr>
@@ -9091,56 +9875,36 @@
           <w:szCs w:val="20"/>
           <w:rtl/>
         </w:rPr>
-        <w:t xml:space="preserve"> 46 (2014), עמ' 21; Elon, </w:t>
-      </w:r>
-      <w:r>
-        <w:rPr>
-          <w:rFonts w:ascii="David" w:cs="David" w:eastAsia="David" w:hAnsi="David"/>
-          <w:i/>
-          <w:iCs/>
-          <w:sz w:val="20"/>
-          <w:szCs w:val="20"/>
-          <w:rtl/>
-        </w:rPr>
-        <w:t xml:space="preserve">Herzl</w:t>
-      </w:r>
-      <w:r>
-        <w:rPr>
-          <w:rFonts w:ascii="David" w:cs="David" w:eastAsia="David" w:hAnsi="David"/>
-          <w:sz w:val="20"/>
-          <w:szCs w:val="20"/>
-          <w:rtl/>
-        </w:rPr>
-        <w:t xml:space="preserve">, pp. 253-260; Hyman, </w:t>
-      </w:r>
-      <w:r>
-        <w:rPr>
-          <w:rFonts w:ascii="David" w:cs="David" w:eastAsia="David" w:hAnsi="David"/>
-          <w:i/>
-          <w:iCs/>
-          <w:sz w:val="20"/>
-          <w:szCs w:val="20"/>
-          <w:rtl/>
-        </w:rPr>
-        <w:t xml:space="preserve">The Jews of Modern France</w:t>
-      </w:r>
-      <w:r>
-        <w:rPr>
-          <w:rFonts w:ascii="David" w:cs="David" w:eastAsia="David" w:hAnsi="David"/>
-          <w:sz w:val="20"/>
-          <w:szCs w:val="20"/>
-          <w:rtl/>
-        </w:rPr>
-        <w:t xml:space="preserve">, pp. 104, 111-113.</w:t>
+        <w:t xml:space="preserve"> 46 (2014), עמ' 8; Kornberg, </w:t>
+      </w:r>
+      <w:r>
+        <w:rPr>
+          <w:rFonts w:ascii="David" w:cs="David" w:eastAsia="David" w:hAnsi="David"/>
+          <w:i/>
+          <w:iCs/>
+          <w:sz w:val="20"/>
+          <w:szCs w:val="20"/>
+          <w:rtl/>
+        </w:rPr>
+        <w:t xml:space="preserve">Theodor Herzl</w:t>
+      </w:r>
+      <w:r>
+        <w:rPr>
+          <w:rFonts w:ascii="David" w:cs="David" w:eastAsia="David" w:hAnsi="David"/>
+          <w:sz w:val="20"/>
+          <w:szCs w:val="20"/>
+          <w:rtl/>
+        </w:rPr>
+        <w:t xml:space="preserve">, pp. 183-194.</w:t>
       </w:r>
     </w:p>
   </w:footnote>
-  <w:footnote w:id="67">
-    <w:p>
-      <w:pPr>
-        <w:bidi/>
+  <w:footnote w:id="73">
+    <w:p>
+      <w:pPr>
+        <w:bidi w:val="false"/>
         <w:spacing w:after="40" w:line="240" w:lineRule="auto"/>
-        <w:jc w:val="both"/>
+        <w:jc w:val="left"/>
       </w:pPr>
       <w:r>
         <w:rPr>
@@ -9163,39 +9927,7 @@
           <w:szCs w:val="20"/>
           <w:rtl/>
         </w:rPr>
-        <w:t xml:space="preserve">קוץ, "ראשיתה של פרשת דרייפוס", עמ' 14-15; לנג, "תגובות העיתונות העברית", עמ' 18-19.</w:t>
-      </w:r>
-    </w:p>
-  </w:footnote>
-  <w:footnote w:id="68">
-    <w:p>
-      <w:pPr>
-        <w:bidi/>
-        <w:spacing w:after="40" w:line="240" w:lineRule="auto"/>
-        <w:jc w:val="both"/>
-      </w:pPr>
-      <w:r>
-        <w:rPr>
-          <w:rStyle w:val="FootnoteReference"/>
-        </w:rPr>
-        <w:footnoteRef/>
-      </w:r>
-      <w:r>
-        <w:rPr>
-          <w:rFonts w:ascii="David" w:cs="David" w:eastAsia="David" w:hAnsi="David"/>
-          <w:sz w:val="20"/>
-          <w:szCs w:val="20"/>
-        </w:rPr>
-        <w:t xml:space="preserve"> </w:t>
-      </w:r>
-      <w:r>
-        <w:rPr>
-          <w:rFonts w:ascii="David" w:cs="David" w:eastAsia="David" w:hAnsi="David"/>
-          <w:sz w:val="20"/>
-          <w:szCs w:val="20"/>
-          <w:rtl/>
-        </w:rPr>
-        <w:t xml:space="preserve">אגניישקה פרידריך, "פרשת דרייפוס וכתב העת הוורשאי Rola בין השנים 1894-1906", </w:t>
+        <w:t xml:space="preserve">הרצל, </w:t>
       </w:r>
       <w:r>
         <w:rPr>
@@ -9208,20 +9940,40 @@
           <w:szCs w:val="20"/>
           <w:rtl/>
         </w:rPr>
-        <w:t xml:space="preserve">קשר</w:t>
-      </w:r>
-      <w:r>
-        <w:rPr>
-          <w:rFonts w:ascii="David" w:cs="David" w:eastAsia="David" w:hAnsi="David"/>
-          <w:sz w:val="20"/>
-          <w:szCs w:val="20"/>
-          <w:rtl/>
-        </w:rPr>
-        <w:t xml:space="preserve"> 46 (2014), עמ' 39-43.</w:t>
+        <w:t xml:space="preserve">עניין היהודים</w:t>
+      </w:r>
+      <w:r>
+        <w:rPr>
+          <w:rFonts w:ascii="David" w:cs="David" w:eastAsia="David" w:hAnsi="David"/>
+          <w:sz w:val="20"/>
+          <w:szCs w:val="20"/>
+          <w:rtl/>
+        </w:rPr>
+        <w:t xml:space="preserve">, כרך א; Herzl, </w:t>
+      </w:r>
+      <w:r>
+        <w:rPr>
+          <w:rFonts w:ascii="David" w:cs="David" w:eastAsia="David" w:hAnsi="David"/>
+          <w:i/>
+          <w:iCs/>
+          <w:sz w:val="20"/>
+          <w:szCs w:val="20"/>
+          <w:rtl w:val="false"/>
+        </w:rPr>
+        <w:t xml:space="preserve">Complete Diaries</w:t>
+      </w:r>
+      <w:r>
+        <w:rPr>
+          <w:rFonts w:ascii="David" w:cs="David" w:eastAsia="David" w:hAnsi="David"/>
+          <w:sz w:val="20"/>
+          <w:szCs w:val="20"/>
+          <w:rtl w:val="false"/>
+        </w:rPr>
+        <w:t xml:space="preserve">, vol. 1, pp. 3-130.</w:t>
       </w:r>
     </w:p>
   </w:footnote>
-  <w:footnote w:id="69">
+  <w:footnote w:id="74">
     <w:p>
       <w:pPr>
         <w:bidi/>
@@ -9249,7 +10001,59 @@
           <w:szCs w:val="20"/>
           <w:rtl/>
         </w:rPr>
-        <w:t xml:space="preserve">שאול סחייק, "פרשת דרייפוס בעיתונות הערבית", </w:t>
+        <w:t xml:space="preserve">קוץ, "ראשיתה של פרשת דרייפוס", עמ' 8; Kornberg, </w:t>
+      </w:r>
+      <w:r>
+        <w:rPr>
+          <w:rFonts w:ascii="David" w:cs="David" w:eastAsia="David" w:hAnsi="David"/>
+          <w:i/>
+          <w:iCs/>
+          <w:sz w:val="20"/>
+          <w:szCs w:val="20"/>
+          <w:rtl/>
+        </w:rPr>
+        <w:t xml:space="preserve">Theodor Herzl</w:t>
+      </w:r>
+      <w:r>
+        <w:rPr>
+          <w:rFonts w:ascii="David" w:cs="David" w:eastAsia="David" w:hAnsi="David"/>
+          <w:sz w:val="20"/>
+          <w:szCs w:val="20"/>
+          <w:rtl/>
+        </w:rPr>
+        <w:t xml:space="preserve">, pp. 134-158, 183-194.</w:t>
+      </w:r>
+    </w:p>
+  </w:footnote>
+  <w:footnote w:id="75">
+    <w:p>
+      <w:pPr>
+        <w:bidi/>
+        <w:spacing w:after="40" w:line="240" w:lineRule="auto"/>
+        <w:jc w:val="both"/>
+      </w:pPr>
+      <w:r>
+        <w:rPr>
+          <w:rStyle w:val="FootnoteReference"/>
+        </w:rPr>
+        <w:footnoteRef/>
+      </w:r>
+      <w:r>
+        <w:rPr>
+          <w:rFonts w:ascii="David" w:cs="David" w:eastAsia="David" w:hAnsi="David"/>
+          <w:sz w:val="20"/>
+          <w:szCs w:val="20"/>
+        </w:rPr>
+        <w:t xml:space="preserve"> </w:t>
+      </w:r>
+      <w:r>
+        <w:rPr>
+          <w:rFonts w:ascii="David" w:cs="David" w:eastAsia="David" w:hAnsi="David"/>
+          <w:sz w:val="20"/>
+          <w:szCs w:val="20"/>
+          <w:rtl/>
+        </w:rPr>
+        <w:t xml:space="preserve">ויטל, </w:t>
       </w:r>
       <w:r>
         <w:rPr>
@@ -9262,100 +10066,16 @@
           <w:szCs w:val="20"/>
           <w:rtl/>
         </w:rPr>
-        <w:t xml:space="preserve">מיכאל: מאסף לתולדות היהודים בתפוצות</w:t>
-      </w:r>
-      <w:r>
-        <w:rPr>
-          <w:rFonts w:ascii="David" w:cs="David" w:eastAsia="David" w:hAnsi="David"/>
-          <w:sz w:val="20"/>
-          <w:szCs w:val="20"/>
-          <w:rtl/>
-        </w:rPr>
-        <w:t xml:space="preserve"> יד (תשנ"ז), עמ' ריג-ריד.</w:t>
-      </w:r>
-    </w:p>
-  </w:footnote>
-  <w:footnote w:id="70">
-    <w:p>
-      <w:pPr>
-        <w:bidi w:val="false"/>
-        <w:spacing w:after="40" w:line="240" w:lineRule="auto"/>
-        <w:jc w:val="left"/>
-      </w:pPr>
-      <w:r>
-        <w:rPr>
-          <w:rStyle w:val="FootnoteReference"/>
-        </w:rPr>
-        <w:footnoteRef/>
-      </w:r>
-      <w:r>
-        <w:rPr>
-          <w:rFonts w:ascii="David" w:cs="David" w:eastAsia="David" w:hAnsi="David"/>
-          <w:sz w:val="20"/>
-          <w:szCs w:val="20"/>
-        </w:rPr>
-        <w:t xml:space="preserve"> </w:t>
-      </w:r>
-      <w:r>
-        <w:rPr>
-          <w:rFonts w:ascii="David" w:cs="David" w:eastAsia="David" w:hAnsi="David"/>
-          <w:sz w:val="20"/>
-          <w:szCs w:val="20"/>
-          <w:rtl w:val="false"/>
-        </w:rPr>
-        <w:t xml:space="preserve">Cahm, </w:t>
-      </w:r>
-      <w:r>
-        <w:rPr>
-          <w:rFonts w:ascii="David" w:cs="David" w:eastAsia="David" w:hAnsi="David"/>
-          <w:i/>
-          <w:iCs/>
-          <w:sz w:val="20"/>
-          <w:szCs w:val="20"/>
-          <w:rtl w:val="false"/>
-        </w:rPr>
-        <w:t xml:space="preserve">The Dreyfus Affair</w:t>
-      </w:r>
-      <w:r>
-        <w:rPr>
-          <w:rFonts w:ascii="David" w:cs="David" w:eastAsia="David" w:hAnsi="David"/>
-          <w:sz w:val="20"/>
-          <w:szCs w:val="20"/>
-          <w:rtl w:val="false"/>
-        </w:rPr>
-        <w:t xml:space="preserve">, pp. 49-68.</w:t>
-      </w:r>
-    </w:p>
-  </w:footnote>
-  <w:footnote w:id="71">
-    <w:p>
-      <w:pPr>
-        <w:bidi w:val="false"/>
-        <w:spacing w:after="40" w:line="240" w:lineRule="auto"/>
-        <w:jc w:val="left"/>
-      </w:pPr>
-      <w:r>
-        <w:rPr>
-          <w:rStyle w:val="FootnoteReference"/>
-        </w:rPr>
-        <w:footnoteRef/>
-      </w:r>
-      <w:r>
-        <w:rPr>
-          <w:rFonts w:ascii="David" w:cs="David" w:eastAsia="David" w:hAnsi="David"/>
-          <w:sz w:val="20"/>
-          <w:szCs w:val="20"/>
-        </w:rPr>
-        <w:t xml:space="preserve"> </w:t>
-      </w:r>
-      <w:r>
-        <w:rPr>
-          <w:rFonts w:ascii="David" w:cs="David" w:eastAsia="David" w:hAnsi="David"/>
-          <w:sz w:val="20"/>
-          <w:szCs w:val="20"/>
-          <w:rtl/>
-        </w:rPr>
-        <w:t xml:space="preserve">אבינרי, </w:t>
+        <w:t xml:space="preserve">המהפכה הציונית</w:t>
+      </w:r>
+      <w:r>
+        <w:rPr>
+          <w:rFonts w:ascii="David" w:cs="David" w:eastAsia="David" w:hAnsi="David"/>
+          <w:sz w:val="20"/>
+          <w:szCs w:val="20"/>
+          <w:rtl/>
+        </w:rPr>
+        <w:t xml:space="preserve">, עמ' 217-262; שלמה אבינרי, </w:t>
       </w:r>
       <w:r>
         <w:rPr>
@@ -9368,112 +10088,40 @@
           <w:szCs w:val="20"/>
           <w:rtl/>
         </w:rPr>
-        <w:t xml:space="preserve">הרצל</w:t>
-      </w:r>
-      <w:r>
-        <w:rPr>
-          <w:rFonts w:ascii="David" w:cs="David" w:eastAsia="David" w:hAnsi="David"/>
-          <w:sz w:val="20"/>
-          <w:szCs w:val="20"/>
-          <w:rtl/>
-        </w:rPr>
-        <w:t xml:space="preserve">, עמ' 86-90; Herzl, "Zionism," pp. 1-8.</w:t>
+        <w:t xml:space="preserve">הרעיון הציוני לגווניו: פרקים בתולדות המחשבה המדינית היהודית</w:t>
+      </w:r>
+      <w:r>
+        <w:rPr>
+          <w:rFonts w:ascii="David" w:cs="David" w:eastAsia="David" w:hAnsi="David"/>
+          <w:sz w:val="20"/>
+          <w:szCs w:val="20"/>
+          <w:rtl/>
+        </w:rPr>
+        <w:t xml:space="preserve"> (תל אביב: עם עובד, 1980), עמ' 107-124; Herzl, </w:t>
+      </w:r>
+      <w:r>
+        <w:rPr>
+          <w:rFonts w:ascii="David" w:cs="David" w:eastAsia="David" w:hAnsi="David"/>
+          <w:i/>
+          <w:iCs/>
+          <w:sz w:val="20"/>
+          <w:szCs w:val="20"/>
+          <w:rtl/>
+        </w:rPr>
+        <w:t xml:space="preserve">The Jewish State</w:t>
+      </w:r>
+      <w:r>
+        <w:rPr>
+          <w:rFonts w:ascii="David" w:cs="David" w:eastAsia="David" w:hAnsi="David"/>
+          <w:sz w:val="20"/>
+          <w:szCs w:val="20"/>
+          <w:rtl/>
+        </w:rPr>
+        <w:t xml:space="preserve">, pp. 75-100.</w:t>
       </w:r>
     </w:p>
   </w:footnote>
-  <w:footnote w:id="72">
-    <w:p>
-      <w:pPr>
-        <w:bidi w:val="false"/>
-        <w:spacing w:after="40" w:line="240" w:lineRule="auto"/>
-        <w:jc w:val="left"/>
-      </w:pPr>
-      <w:r>
-        <w:rPr>
-          <w:rStyle w:val="FootnoteReference"/>
-        </w:rPr>
-        <w:footnoteRef/>
-      </w:r>
-      <w:r>
-        <w:rPr>
-          <w:rFonts w:ascii="David" w:cs="David" w:eastAsia="David" w:hAnsi="David"/>
-          <w:sz w:val="20"/>
-          <w:szCs w:val="20"/>
-        </w:rPr>
-        <w:t xml:space="preserve"> </w:t>
-      </w:r>
-      <w:r>
-        <w:rPr>
-          <w:rFonts w:ascii="David" w:cs="David" w:eastAsia="David" w:hAnsi="David"/>
-          <w:sz w:val="20"/>
-          <w:szCs w:val="20"/>
-          <w:rtl w:val="false"/>
-        </w:rPr>
-        <w:t xml:space="preserve">Bein, </w:t>
-      </w:r>
-      <w:r>
-        <w:rPr>
-          <w:rFonts w:ascii="David" w:cs="David" w:eastAsia="David" w:hAnsi="David"/>
-          <w:i/>
-          <w:iCs/>
-          <w:sz w:val="20"/>
-          <w:szCs w:val="20"/>
-          <w:rtl w:val="false"/>
-        </w:rPr>
-        <w:t xml:space="preserve">Theodore Herzl</w:t>
-      </w:r>
-      <w:r>
-        <w:rPr>
-          <w:rFonts w:ascii="David" w:cs="David" w:eastAsia="David" w:hAnsi="David"/>
-          <w:sz w:val="20"/>
-          <w:szCs w:val="20"/>
-          <w:rtl w:val="false"/>
-        </w:rPr>
-        <w:t xml:space="preserve">, pp. 95-124; Elon, </w:t>
-      </w:r>
-      <w:r>
-        <w:rPr>
-          <w:rFonts w:ascii="David" w:cs="David" w:eastAsia="David" w:hAnsi="David"/>
-          <w:i/>
-          <w:iCs/>
-          <w:sz w:val="20"/>
-          <w:szCs w:val="20"/>
-          <w:rtl w:val="false"/>
-        </w:rPr>
-        <w:t xml:space="preserve">Herzl</w:t>
-      </w:r>
-      <w:r>
-        <w:rPr>
-          <w:rFonts w:ascii="David" w:cs="David" w:eastAsia="David" w:hAnsi="David"/>
-          <w:sz w:val="20"/>
-          <w:szCs w:val="20"/>
-          <w:rtl w:val="false"/>
-        </w:rPr>
-        <w:t xml:space="preserve">, pp. 114-130; Desmond Stewart, </w:t>
-      </w:r>
-      <w:r>
-        <w:rPr>
-          <w:rFonts w:ascii="David" w:cs="David" w:eastAsia="David" w:hAnsi="David"/>
-          <w:i/>
-          <w:iCs/>
-          <w:sz w:val="20"/>
-          <w:szCs w:val="20"/>
-          <w:rtl w:val="false"/>
-        </w:rPr>
-        <w:t xml:space="preserve">Theodor Herzl: Artist and Politician</w:t>
-      </w:r>
-      <w:r>
-        <w:rPr>
-          <w:rFonts w:ascii="David" w:cs="David" w:eastAsia="David" w:hAnsi="David"/>
-          <w:sz w:val="20"/>
-          <w:szCs w:val="20"/>
-          <w:rtl w:val="false"/>
-        </w:rPr>
-        <w:t xml:space="preserve"> (London: Hamish Hamilton, 1974), pp. 155-182.</w:t>
-      </w:r>
-    </w:p>
-  </w:footnote>
-  <w:footnote w:id="73">
+  <w:footnote w:id="76">
     <w:p>
       <w:pPr>
         <w:bidi/>
@@ -9501,59 +10149,7 @@
           <w:szCs w:val="20"/>
           <w:rtl/>
         </w:rPr>
-        <w:t xml:space="preserve">השל, "לקראת היסטוריוגרפיה ארוטית", עמ' 73-94; Penslar, </w:t>
-      </w:r>
-      <w:r>
-        <w:rPr>
-          <w:rFonts w:ascii="David" w:cs="David" w:eastAsia="David" w:hAnsi="David"/>
-          <w:i/>
-          <w:iCs/>
-          <w:sz w:val="20"/>
-          <w:szCs w:val="20"/>
-          <w:rtl/>
-        </w:rPr>
-        <w:t xml:space="preserve">Theodor Herzl</w:t>
-      </w:r>
-      <w:r>
-        <w:rPr>
-          <w:rFonts w:ascii="David" w:cs="David" w:eastAsia="David" w:hAnsi="David"/>
-          <w:sz w:val="20"/>
-          <w:szCs w:val="20"/>
-          <w:rtl/>
-        </w:rPr>
-        <w:t xml:space="preserve">, pp. 49-70.</w:t>
-      </w:r>
-    </w:p>
-  </w:footnote>
-  <w:footnote w:id="74">
-    <w:p>
-      <w:pPr>
-        <w:bidi/>
-        <w:spacing w:after="40" w:line="240" w:lineRule="auto"/>
-        <w:jc w:val="both"/>
-      </w:pPr>
-      <w:r>
-        <w:rPr>
-          <w:rStyle w:val="FootnoteReference"/>
-        </w:rPr>
-        <w:footnoteRef/>
-      </w:r>
-      <w:r>
-        <w:rPr>
-          <w:rFonts w:ascii="David" w:cs="David" w:eastAsia="David" w:hAnsi="David"/>
-          <w:sz w:val="20"/>
-          <w:szCs w:val="20"/>
-        </w:rPr>
-        <w:t xml:space="preserve"> </w:t>
-      </w:r>
-      <w:r>
-        <w:rPr>
-          <w:rFonts w:ascii="David" w:cs="David" w:eastAsia="David" w:hAnsi="David"/>
-          <w:sz w:val="20"/>
-          <w:szCs w:val="20"/>
-          <w:rtl/>
-        </w:rPr>
-        <w:t xml:space="preserve">אבינרי, </w:t>
+        <w:t xml:space="preserve">יוסף לנג, "תגובות העיתונות העברית בארץ ישראל על פרשת דרייפוס (1894-1906)", </w:t>
       </w:r>
       <w:r>
         <w:rPr>
@@ -9566,6 +10162,416 @@
           <w:szCs w:val="20"/>
           <w:rtl/>
         </w:rPr>
+        <w:t xml:space="preserve">קשר</w:t>
+      </w:r>
+      <w:r>
+        <w:rPr>
+          <w:rFonts w:ascii="David" w:cs="David" w:eastAsia="David" w:hAnsi="David"/>
+          <w:sz w:val="20"/>
+          <w:szCs w:val="20"/>
+          <w:rtl/>
+        </w:rPr>
+        <w:t xml:space="preserve"> 46 (2014), עמ' 21; Elon, </w:t>
+      </w:r>
+      <w:r>
+        <w:rPr>
+          <w:rFonts w:ascii="David" w:cs="David" w:eastAsia="David" w:hAnsi="David"/>
+          <w:i/>
+          <w:iCs/>
+          <w:sz w:val="20"/>
+          <w:szCs w:val="20"/>
+          <w:rtl/>
+        </w:rPr>
+        <w:t xml:space="preserve">Herzl</w:t>
+      </w:r>
+      <w:r>
+        <w:rPr>
+          <w:rFonts w:ascii="David" w:cs="David" w:eastAsia="David" w:hAnsi="David"/>
+          <w:sz w:val="20"/>
+          <w:szCs w:val="20"/>
+          <w:rtl/>
+        </w:rPr>
+        <w:t xml:space="preserve">, pp. 253-260; Hyman, </w:t>
+      </w:r>
+      <w:r>
+        <w:rPr>
+          <w:rFonts w:ascii="David" w:cs="David" w:eastAsia="David" w:hAnsi="David"/>
+          <w:i/>
+          <w:iCs/>
+          <w:sz w:val="20"/>
+          <w:szCs w:val="20"/>
+          <w:rtl/>
+        </w:rPr>
+        <w:t xml:space="preserve">The Jews of Modern France</w:t>
+      </w:r>
+      <w:r>
+        <w:rPr>
+          <w:rFonts w:ascii="David" w:cs="David" w:eastAsia="David" w:hAnsi="David"/>
+          <w:sz w:val="20"/>
+          <w:szCs w:val="20"/>
+          <w:rtl/>
+        </w:rPr>
+        <w:t xml:space="preserve">, pp. 104, 111-113.</w:t>
+      </w:r>
+    </w:p>
+  </w:footnote>
+  <w:footnote w:id="77">
+    <w:p>
+      <w:pPr>
+        <w:bidi w:val="false"/>
+        <w:spacing w:after="40" w:line="240" w:lineRule="auto"/>
+        <w:jc w:val="left"/>
+      </w:pPr>
+      <w:r>
+        <w:rPr>
+          <w:rStyle w:val="FootnoteReference"/>
+        </w:rPr>
+        <w:footnoteRef/>
+      </w:r>
+      <w:r>
+        <w:rPr>
+          <w:rFonts w:ascii="David" w:cs="David" w:eastAsia="David" w:hAnsi="David"/>
+          <w:sz w:val="20"/>
+          <w:szCs w:val="20"/>
+        </w:rPr>
+        <w:t xml:space="preserve"> </w:t>
+      </w:r>
+      <w:r>
+        <w:rPr>
+          <w:rFonts w:ascii="David" w:cs="David" w:eastAsia="David" w:hAnsi="David"/>
+          <w:sz w:val="20"/>
+          <w:szCs w:val="20"/>
+          <w:rtl/>
+        </w:rPr>
+        <w:t xml:space="preserve">לנג, "תגובות העיתונות העברית", עמ' 19-21; Hyman, </w:t>
+      </w:r>
+      <w:r>
+        <w:rPr>
+          <w:rFonts w:ascii="David" w:cs="David" w:eastAsia="David" w:hAnsi="David"/>
+          <w:i/>
+          <w:iCs/>
+          <w:sz w:val="20"/>
+          <w:szCs w:val="20"/>
+          <w:rtl w:val="false"/>
+        </w:rPr>
+        <w:t xml:space="preserve">The Jews of Modern France</w:t>
+      </w:r>
+      <w:r>
+        <w:rPr>
+          <w:rFonts w:ascii="David" w:cs="David" w:eastAsia="David" w:hAnsi="David"/>
+          <w:sz w:val="20"/>
+          <w:szCs w:val="20"/>
+          <w:rtl w:val="false"/>
+        </w:rPr>
+        <w:t xml:space="preserve">, pp. 112-113.</w:t>
+      </w:r>
+    </w:p>
+  </w:footnote>
+  <w:footnote w:id="78">
+    <w:p>
+      <w:pPr>
+        <w:bidi/>
+        <w:spacing w:after="40" w:line="240" w:lineRule="auto"/>
+        <w:jc w:val="both"/>
+      </w:pPr>
+      <w:r>
+        <w:rPr>
+          <w:rStyle w:val="FootnoteReference"/>
+        </w:rPr>
+        <w:footnoteRef/>
+      </w:r>
+      <w:r>
+        <w:rPr>
+          <w:rFonts w:ascii="David" w:cs="David" w:eastAsia="David" w:hAnsi="David"/>
+          <w:sz w:val="20"/>
+          <w:szCs w:val="20"/>
+        </w:rPr>
+        <w:t xml:space="preserve"> </w:t>
+      </w:r>
+      <w:r>
+        <w:rPr>
+          <w:rFonts w:ascii="David" w:cs="David" w:eastAsia="David" w:hAnsi="David"/>
+          <w:sz w:val="20"/>
+          <w:szCs w:val="20"/>
+          <w:rtl/>
+        </w:rPr>
+        <w:t xml:space="preserve">קוץ, "ראשיתה של פרשת דרייפוס", עמ' 14-15; לנג, "תגובות העיתונות העברית", עמ' 18-19.</w:t>
+      </w:r>
+    </w:p>
+  </w:footnote>
+  <w:footnote w:id="79">
+    <w:p>
+      <w:pPr>
+        <w:bidi/>
+        <w:spacing w:after="40" w:line="240" w:lineRule="auto"/>
+        <w:jc w:val="both"/>
+      </w:pPr>
+      <w:r>
+        <w:rPr>
+          <w:rStyle w:val="FootnoteReference"/>
+        </w:rPr>
+        <w:footnoteRef/>
+      </w:r>
+      <w:r>
+        <w:rPr>
+          <w:rFonts w:ascii="David" w:cs="David" w:eastAsia="David" w:hAnsi="David"/>
+          <w:sz w:val="20"/>
+          <w:szCs w:val="20"/>
+        </w:rPr>
+        <w:t xml:space="preserve"> </w:t>
+      </w:r>
+      <w:r>
+        <w:rPr>
+          <w:rFonts w:ascii="David" w:cs="David" w:eastAsia="David" w:hAnsi="David"/>
+          <w:sz w:val="20"/>
+          <w:szCs w:val="20"/>
+          <w:rtl/>
+        </w:rPr>
+        <w:t xml:space="preserve">אגניישקה פרידריך, "פרשת דרייפוס וכתב העת הוורשאי Rola בין השנים 1894-1906", </w:t>
+      </w:r>
+      <w:r>
+        <w:rPr>
+          <w:rFonts w:ascii="David" w:cs="David" w:eastAsia="David" w:hAnsi="David"/>
+          <w:b/>
+          <w:bCs/>
+          <w:i w:val="false"/>
+          <w:iCs w:val="false"/>
+          <w:sz w:val="20"/>
+          <w:szCs w:val="20"/>
+          <w:rtl/>
+        </w:rPr>
+        <w:t xml:space="preserve">קשר</w:t>
+      </w:r>
+      <w:r>
+        <w:rPr>
+          <w:rFonts w:ascii="David" w:cs="David" w:eastAsia="David" w:hAnsi="David"/>
+          <w:sz w:val="20"/>
+          <w:szCs w:val="20"/>
+          <w:rtl/>
+        </w:rPr>
+        <w:t xml:space="preserve"> 46 (2014), עמ' 39-43.</w:t>
+      </w:r>
+    </w:p>
+  </w:footnote>
+  <w:footnote w:id="80">
+    <w:p>
+      <w:pPr>
+        <w:bidi/>
+        <w:spacing w:after="40" w:line="240" w:lineRule="auto"/>
+        <w:jc w:val="both"/>
+      </w:pPr>
+      <w:r>
+        <w:rPr>
+          <w:rStyle w:val="FootnoteReference"/>
+        </w:rPr>
+        <w:footnoteRef/>
+      </w:r>
+      <w:r>
+        <w:rPr>
+          <w:rFonts w:ascii="David" w:cs="David" w:eastAsia="David" w:hAnsi="David"/>
+          <w:sz w:val="20"/>
+          <w:szCs w:val="20"/>
+        </w:rPr>
+        <w:t xml:space="preserve"> </w:t>
+      </w:r>
+      <w:r>
+        <w:rPr>
+          <w:rFonts w:ascii="David" w:cs="David" w:eastAsia="David" w:hAnsi="David"/>
+          <w:sz w:val="20"/>
+          <w:szCs w:val="20"/>
+          <w:rtl/>
+        </w:rPr>
+        <w:t xml:space="preserve">שאול סחייק, "פרשת דרייפוס בעיתונות הערבית", </w:t>
+      </w:r>
+      <w:r>
+        <w:rPr>
+          <w:rFonts w:ascii="David" w:cs="David" w:eastAsia="David" w:hAnsi="David"/>
+          <w:b/>
+          <w:bCs/>
+          <w:i w:val="false"/>
+          <w:iCs w:val="false"/>
+          <w:sz w:val="20"/>
+          <w:szCs w:val="20"/>
+          <w:rtl/>
+        </w:rPr>
+        <w:t xml:space="preserve">מיכאל: מאסף לתולדות היהודים בתפוצות</w:t>
+      </w:r>
+      <w:r>
+        <w:rPr>
+          <w:rFonts w:ascii="David" w:cs="David" w:eastAsia="David" w:hAnsi="David"/>
+          <w:sz w:val="20"/>
+          <w:szCs w:val="20"/>
+          <w:rtl/>
+        </w:rPr>
+        <w:t xml:space="preserve"> יד (תשנ"ז), עמ' ריג-ריד.</w:t>
+      </w:r>
+    </w:p>
+  </w:footnote>
+  <w:footnote w:id="81">
+    <w:p>
+      <w:pPr>
+        <w:bidi w:val="false"/>
+        <w:spacing w:after="40" w:line="240" w:lineRule="auto"/>
+        <w:jc w:val="left"/>
+      </w:pPr>
+      <w:r>
+        <w:rPr>
+          <w:rStyle w:val="FootnoteReference"/>
+        </w:rPr>
+        <w:footnoteRef/>
+      </w:r>
+      <w:r>
+        <w:rPr>
+          <w:rFonts w:ascii="David" w:cs="David" w:eastAsia="David" w:hAnsi="David"/>
+          <w:sz w:val="20"/>
+          <w:szCs w:val="20"/>
+        </w:rPr>
+        <w:t xml:space="preserve"> </w:t>
+      </w:r>
+      <w:r>
+        <w:rPr>
+          <w:rFonts w:ascii="David" w:cs="David" w:eastAsia="David" w:hAnsi="David"/>
+          <w:sz w:val="20"/>
+          <w:szCs w:val="20"/>
+          <w:rtl w:val="false"/>
+        </w:rPr>
+        <w:t xml:space="preserve">Cahm, </w:t>
+      </w:r>
+      <w:r>
+        <w:rPr>
+          <w:rFonts w:ascii="David" w:cs="David" w:eastAsia="David" w:hAnsi="David"/>
+          <w:i/>
+          <w:iCs/>
+          <w:sz w:val="20"/>
+          <w:szCs w:val="20"/>
+          <w:rtl w:val="false"/>
+        </w:rPr>
+        <w:t xml:space="preserve">The Dreyfus Affair</w:t>
+      </w:r>
+      <w:r>
+        <w:rPr>
+          <w:rFonts w:ascii="David" w:cs="David" w:eastAsia="David" w:hAnsi="David"/>
+          <w:sz w:val="20"/>
+          <w:szCs w:val="20"/>
+          <w:rtl w:val="false"/>
+        </w:rPr>
+        <w:t xml:space="preserve">, pp. 49-68.</w:t>
+      </w:r>
+    </w:p>
+  </w:footnote>
+  <w:footnote w:id="82">
+    <w:p>
+      <w:pPr>
+        <w:bidi w:val="false"/>
+        <w:spacing w:after="40" w:line="240" w:lineRule="auto"/>
+        <w:jc w:val="left"/>
+      </w:pPr>
+      <w:r>
+        <w:rPr>
+          <w:rStyle w:val="FootnoteReference"/>
+        </w:rPr>
+        <w:footnoteRef/>
+      </w:r>
+      <w:r>
+        <w:rPr>
+          <w:rFonts w:ascii="David" w:cs="David" w:eastAsia="David" w:hAnsi="David"/>
+          <w:sz w:val="20"/>
+          <w:szCs w:val="20"/>
+        </w:rPr>
+        <w:t xml:space="preserve"> </w:t>
+      </w:r>
+      <w:r>
+        <w:rPr>
+          <w:rFonts w:ascii="David" w:cs="David" w:eastAsia="David" w:hAnsi="David"/>
+          <w:sz w:val="20"/>
+          <w:szCs w:val="20"/>
+          <w:rtl w:val="false"/>
+        </w:rPr>
+        <w:t xml:space="preserve">Elon, </w:t>
+      </w:r>
+      <w:r>
+        <w:rPr>
+          <w:rFonts w:ascii="David" w:cs="David" w:eastAsia="David" w:hAnsi="David"/>
+          <w:i/>
+          <w:iCs/>
+          <w:sz w:val="20"/>
+          <w:szCs w:val="20"/>
+          <w:rtl w:val="false"/>
+        </w:rPr>
+        <w:t xml:space="preserve">Herzl</w:t>
+      </w:r>
+      <w:r>
+        <w:rPr>
+          <w:rFonts w:ascii="David" w:cs="David" w:eastAsia="David" w:hAnsi="David"/>
+          <w:sz w:val="20"/>
+          <w:szCs w:val="20"/>
+          <w:rtl w:val="false"/>
+        </w:rPr>
+        <w:t xml:space="preserve">, pp. 253-290; Penslar, </w:t>
+      </w:r>
+      <w:r>
+        <w:rPr>
+          <w:rFonts w:ascii="David" w:cs="David" w:eastAsia="David" w:hAnsi="David"/>
+          <w:i/>
+          <w:iCs/>
+          <w:sz w:val="20"/>
+          <w:szCs w:val="20"/>
+          <w:rtl w:val="false"/>
+        </w:rPr>
+        <w:t xml:space="preserve">Theodor Herzl</w:t>
+      </w:r>
+      <w:r>
+        <w:rPr>
+          <w:rFonts w:ascii="David" w:cs="David" w:eastAsia="David" w:hAnsi="David"/>
+          <w:sz w:val="20"/>
+          <w:szCs w:val="20"/>
+          <w:rtl w:val="false"/>
+        </w:rPr>
+        <w:t xml:space="preserve">, pp. 101-130.</w:t>
+      </w:r>
+    </w:p>
+  </w:footnote>
+  <w:footnote w:id="83">
+    <w:p>
+      <w:pPr>
+        <w:bidi w:val="false"/>
+        <w:spacing w:after="40" w:line="240" w:lineRule="auto"/>
+        <w:jc w:val="left"/>
+      </w:pPr>
+      <w:r>
+        <w:rPr>
+          <w:rStyle w:val="FootnoteReference"/>
+        </w:rPr>
+        <w:footnoteRef/>
+      </w:r>
+      <w:r>
+        <w:rPr>
+          <w:rFonts w:ascii="David" w:cs="David" w:eastAsia="David" w:hAnsi="David"/>
+          <w:sz w:val="20"/>
+          <w:szCs w:val="20"/>
+        </w:rPr>
+        <w:t xml:space="preserve"> </w:t>
+      </w:r>
+      <w:r>
+        <w:rPr>
+          <w:rFonts w:ascii="David" w:cs="David" w:eastAsia="David" w:hAnsi="David"/>
+          <w:sz w:val="20"/>
+          <w:szCs w:val="20"/>
+          <w:rtl/>
+        </w:rPr>
+        <w:t xml:space="preserve">אבינרי, </w:t>
+      </w:r>
+      <w:r>
+        <w:rPr>
+          <w:rFonts w:ascii="David" w:cs="David" w:eastAsia="David" w:hAnsi="David"/>
+          <w:b/>
+          <w:bCs/>
+          <w:i w:val="false"/>
+          <w:iCs w:val="false"/>
+          <w:sz w:val="20"/>
+          <w:szCs w:val="20"/>
+          <w:rtl/>
+        </w:rPr>
         <w:t xml:space="preserve">הרצל</w:t>
       </w:r>
       <w:r>
@@ -9575,6 +10581,256 @@
           <w:szCs w:val="20"/>
           <w:rtl/>
         </w:rPr>
+        <w:t xml:space="preserve">, עמ' 86-90; Herzl, "Zionism," pp. 1-8.</w:t>
+      </w:r>
+    </w:p>
+  </w:footnote>
+  <w:footnote w:id="84">
+    <w:p>
+      <w:pPr>
+        <w:bidi w:val="false"/>
+        <w:spacing w:after="40" w:line="240" w:lineRule="auto"/>
+        <w:jc w:val="left"/>
+      </w:pPr>
+      <w:r>
+        <w:rPr>
+          <w:rStyle w:val="FootnoteReference"/>
+        </w:rPr>
+        <w:footnoteRef/>
+      </w:r>
+      <w:r>
+        <w:rPr>
+          <w:rFonts w:ascii="David" w:cs="David" w:eastAsia="David" w:hAnsi="David"/>
+          <w:sz w:val="20"/>
+          <w:szCs w:val="20"/>
+        </w:rPr>
+        <w:t xml:space="preserve"> </w:t>
+      </w:r>
+      <w:r>
+        <w:rPr>
+          <w:rFonts w:ascii="David" w:cs="David" w:eastAsia="David" w:hAnsi="David"/>
+          <w:sz w:val="20"/>
+          <w:szCs w:val="20"/>
+          <w:rtl w:val="false"/>
+        </w:rPr>
+        <w:t xml:space="preserve">Bein, </w:t>
+      </w:r>
+      <w:r>
+        <w:rPr>
+          <w:rFonts w:ascii="David" w:cs="David" w:eastAsia="David" w:hAnsi="David"/>
+          <w:i/>
+          <w:iCs/>
+          <w:sz w:val="20"/>
+          <w:szCs w:val="20"/>
+          <w:rtl w:val="false"/>
+        </w:rPr>
+        <w:t xml:space="preserve">Theodore Herzl</w:t>
+      </w:r>
+      <w:r>
+        <w:rPr>
+          <w:rFonts w:ascii="David" w:cs="David" w:eastAsia="David" w:hAnsi="David"/>
+          <w:sz w:val="20"/>
+          <w:szCs w:val="20"/>
+          <w:rtl w:val="false"/>
+        </w:rPr>
+        <w:t xml:space="preserve">, pp. 95-124; Elon, </w:t>
+      </w:r>
+      <w:r>
+        <w:rPr>
+          <w:rFonts w:ascii="David" w:cs="David" w:eastAsia="David" w:hAnsi="David"/>
+          <w:i/>
+          <w:iCs/>
+          <w:sz w:val="20"/>
+          <w:szCs w:val="20"/>
+          <w:rtl w:val="false"/>
+        </w:rPr>
+        <w:t xml:space="preserve">Herzl</w:t>
+      </w:r>
+      <w:r>
+        <w:rPr>
+          <w:rFonts w:ascii="David" w:cs="David" w:eastAsia="David" w:hAnsi="David"/>
+          <w:sz w:val="20"/>
+          <w:szCs w:val="20"/>
+          <w:rtl w:val="false"/>
+        </w:rPr>
+        <w:t xml:space="preserve">, pp. 114-130; Desmond Stewart, </w:t>
+      </w:r>
+      <w:r>
+        <w:rPr>
+          <w:rFonts w:ascii="David" w:cs="David" w:eastAsia="David" w:hAnsi="David"/>
+          <w:i/>
+          <w:iCs/>
+          <w:sz w:val="20"/>
+          <w:szCs w:val="20"/>
+          <w:rtl w:val="false"/>
+        </w:rPr>
+        <w:t xml:space="preserve">Theodor Herzl: Artist and Politician</w:t>
+      </w:r>
+      <w:r>
+        <w:rPr>
+          <w:rFonts w:ascii="David" w:cs="David" w:eastAsia="David" w:hAnsi="David"/>
+          <w:sz w:val="20"/>
+          <w:szCs w:val="20"/>
+          <w:rtl w:val="false"/>
+        </w:rPr>
+        <w:t xml:space="preserve"> (London: Hamish Hamilton, 1974), pp. 155-182.</w:t>
+      </w:r>
+    </w:p>
+  </w:footnote>
+  <w:footnote w:id="85">
+    <w:p>
+      <w:pPr>
+        <w:bidi/>
+        <w:spacing w:after="40" w:line="240" w:lineRule="auto"/>
+        <w:jc w:val="both"/>
+      </w:pPr>
+      <w:r>
+        <w:rPr>
+          <w:rStyle w:val="FootnoteReference"/>
+        </w:rPr>
+        <w:footnoteRef/>
+      </w:r>
+      <w:r>
+        <w:rPr>
+          <w:rFonts w:ascii="David" w:cs="David" w:eastAsia="David" w:hAnsi="David"/>
+          <w:sz w:val="20"/>
+          <w:szCs w:val="20"/>
+        </w:rPr>
+        <w:t xml:space="preserve"> </w:t>
+      </w:r>
+      <w:r>
+        <w:rPr>
+          <w:rFonts w:ascii="David" w:cs="David" w:eastAsia="David" w:hAnsi="David"/>
+          <w:sz w:val="20"/>
+          <w:szCs w:val="20"/>
+          <w:rtl/>
+        </w:rPr>
+        <w:t xml:space="preserve">השל, "לקראת היסטוריוגרפיה ארוטית", עמ' 73-94; Penslar, </w:t>
+      </w:r>
+      <w:r>
+        <w:rPr>
+          <w:rFonts w:ascii="David" w:cs="David" w:eastAsia="David" w:hAnsi="David"/>
+          <w:i/>
+          <w:iCs/>
+          <w:sz w:val="20"/>
+          <w:szCs w:val="20"/>
+          <w:rtl/>
+        </w:rPr>
+        <w:t xml:space="preserve">Theodor Herzl</w:t>
+      </w:r>
+      <w:r>
+        <w:rPr>
+          <w:rFonts w:ascii="David" w:cs="David" w:eastAsia="David" w:hAnsi="David"/>
+          <w:sz w:val="20"/>
+          <w:szCs w:val="20"/>
+          <w:rtl/>
+        </w:rPr>
+        <w:t xml:space="preserve">, pp. 49-70.</w:t>
+      </w:r>
+    </w:p>
+  </w:footnote>
+  <w:footnote w:id="86">
+    <w:p>
+      <w:pPr>
+        <w:bidi w:val="false"/>
+        <w:spacing w:after="40" w:line="240" w:lineRule="auto"/>
+        <w:jc w:val="left"/>
+      </w:pPr>
+      <w:r>
+        <w:rPr>
+          <w:rStyle w:val="FootnoteReference"/>
+        </w:rPr>
+        <w:footnoteRef/>
+      </w:r>
+      <w:r>
+        <w:rPr>
+          <w:rFonts w:ascii="David" w:cs="David" w:eastAsia="David" w:hAnsi="David"/>
+          <w:sz w:val="20"/>
+          <w:szCs w:val="20"/>
+        </w:rPr>
+        <w:t xml:space="preserve"> </w:t>
+      </w:r>
+      <w:r>
+        <w:rPr>
+          <w:rFonts w:ascii="David" w:cs="David" w:eastAsia="David" w:hAnsi="David"/>
+          <w:sz w:val="20"/>
+          <w:szCs w:val="20"/>
+          <w:rtl w:val="false"/>
+        </w:rPr>
+        <w:t xml:space="preserve">Pawel, </w:t>
+      </w:r>
+      <w:r>
+        <w:rPr>
+          <w:rFonts w:ascii="David" w:cs="David" w:eastAsia="David" w:hAnsi="David"/>
+          <w:i/>
+          <w:iCs/>
+          <w:sz w:val="20"/>
+          <w:szCs w:val="20"/>
+          <w:rtl w:val="false"/>
+        </w:rPr>
+        <w:t xml:space="preserve">The Labyrinth of Exile</w:t>
+      </w:r>
+      <w:r>
+        <w:rPr>
+          <w:rFonts w:ascii="David" w:cs="David" w:eastAsia="David" w:hAnsi="David"/>
+          <w:sz w:val="20"/>
+          <w:szCs w:val="20"/>
+          <w:rtl w:val="false"/>
+        </w:rPr>
+        <w:t xml:space="preserve">, pp. 203-217; Wistrich, "Theodor Herzl: Zionist Icon," pp. 1-37.</w:t>
+      </w:r>
+    </w:p>
+  </w:footnote>
+  <w:footnote w:id="87">
+    <w:p>
+      <w:pPr>
+        <w:bidi/>
+        <w:spacing w:after="40" w:line="240" w:lineRule="auto"/>
+        <w:jc w:val="both"/>
+      </w:pPr>
+      <w:r>
+        <w:rPr>
+          <w:rStyle w:val="FootnoteReference"/>
+        </w:rPr>
+        <w:footnoteRef/>
+      </w:r>
+      <w:r>
+        <w:rPr>
+          <w:rFonts w:ascii="David" w:cs="David" w:eastAsia="David" w:hAnsi="David"/>
+          <w:sz w:val="20"/>
+          <w:szCs w:val="20"/>
+        </w:rPr>
+        <w:t xml:space="preserve"> </w:t>
+      </w:r>
+      <w:r>
+        <w:rPr>
+          <w:rFonts w:ascii="David" w:cs="David" w:eastAsia="David" w:hAnsi="David"/>
+          <w:sz w:val="20"/>
+          <w:szCs w:val="20"/>
+          <w:rtl/>
+        </w:rPr>
+        <w:t xml:space="preserve">אבינרי, </w:t>
+      </w:r>
+      <w:r>
+        <w:rPr>
+          <w:rFonts w:ascii="David" w:cs="David" w:eastAsia="David" w:hAnsi="David"/>
+          <w:b/>
+          <w:bCs/>
+          <w:i w:val="false"/>
+          <w:iCs w:val="false"/>
+          <w:sz w:val="20"/>
+          <w:szCs w:val="20"/>
+          <w:rtl/>
+        </w:rPr>
+        <w:t xml:space="preserve">הרצל</w:t>
+      </w:r>
+      <w:r>
+        <w:rPr>
+          <w:rFonts w:ascii="David" w:cs="David" w:eastAsia="David" w:hAnsi="David"/>
+          <w:sz w:val="20"/>
+          <w:szCs w:val="20"/>
+          <w:rtl/>
+        </w:rPr>
         <w:t xml:space="preserve">, עמ' 84-108; קוץ, "ראשיתה של פרשת דרייפוס", עמ' 8; Kornberg, </w:t>
       </w:r>
       <w:r>
@@ -9599,7 +10855,81 @@
       </w:r>
     </w:p>
   </w:footnote>
-  <w:footnote w:id="75">
+  <w:footnote w:id="88">
+    <w:p>
+      <w:pPr>
+        <w:bidi w:val="false"/>
+        <w:spacing w:after="40" w:line="240" w:lineRule="auto"/>
+        <w:jc w:val="left"/>
+      </w:pPr>
+      <w:r>
+        <w:rPr>
+          <w:rStyle w:val="FootnoteReference"/>
+        </w:rPr>
+        <w:footnoteRef/>
+      </w:r>
+      <w:r>
+        <w:rPr>
+          <w:rFonts w:ascii="David" w:cs="David" w:eastAsia="David" w:hAnsi="David"/>
+          <w:sz w:val="20"/>
+          <w:szCs w:val="20"/>
+        </w:rPr>
+        <w:t xml:space="preserve"> </w:t>
+      </w:r>
+      <w:r>
+        <w:rPr>
+          <w:rFonts w:ascii="David" w:cs="David" w:eastAsia="David" w:hAnsi="David"/>
+          <w:sz w:val="20"/>
+          <w:szCs w:val="20"/>
+          <w:rtl/>
+        </w:rPr>
+        <w:t xml:space="preserve">וולקוב, </w:t>
+      </w:r>
+      <w:r>
+        <w:rPr>
+          <w:rFonts w:ascii="David" w:cs="David" w:eastAsia="David" w:hAnsi="David"/>
+          <w:b/>
+          <w:bCs/>
+          <w:i w:val="false"/>
+          <w:iCs w:val="false"/>
+          <w:sz w:val="20"/>
+          <w:szCs w:val="20"/>
+          <w:rtl/>
+        </w:rPr>
+        <w:t xml:space="preserve">במעגל המכושף</w:t>
+      </w:r>
+      <w:r>
+        <w:rPr>
+          <w:rFonts w:ascii="David" w:cs="David" w:eastAsia="David" w:hAnsi="David"/>
+          <w:sz w:val="20"/>
+          <w:szCs w:val="20"/>
+          <w:rtl/>
+        </w:rPr>
+        <w:t xml:space="preserve">, עמ' 71-98; Cahm, </w:t>
+      </w:r>
+      <w:r>
+        <w:rPr>
+          <w:rFonts w:ascii="David" w:cs="David" w:eastAsia="David" w:hAnsi="David"/>
+          <w:i/>
+          <w:iCs/>
+          <w:sz w:val="20"/>
+          <w:szCs w:val="20"/>
+          <w:rtl w:val="false"/>
+        </w:rPr>
+        <w:t xml:space="preserve">The Dreyfus Affair</w:t>
+      </w:r>
+      <w:r>
+        <w:rPr>
+          <w:rFonts w:ascii="David" w:cs="David" w:eastAsia="David" w:hAnsi="David"/>
+          <w:sz w:val="20"/>
+          <w:szCs w:val="20"/>
+          <w:rtl w:val="false"/>
+        </w:rPr>
+        <w:t xml:space="preserve">, pp. 69-96.</w:t>
+      </w:r>
+    </w:p>
+  </w:footnote>
+  <w:footnote w:id="89">
     <w:p>
       <w:pPr>
         <w:bidi w:val="false"/>

</xml_diff>